<commit_message>
Actualizafción pruebas y documentación
</commit_message>
<xml_diff>
--- a/docs/Informe_de_pruebas.docx
+++ b/docs/Informe_de_pruebas.docx
@@ -9,7 +9,7 @@
       </w:pPr>
       <w:r>
         <w:rPr>
-          <w:color w:val="4B8A99"/>
+          <w:color w:val="000000"/>
           <w:sz w:val="24"/>
           <w:szCs w:val="24"/>
         </w:rPr>
@@ -23,7 +23,7 @@
       </w:pPr>
       <w:r>
         <w:rPr>
-          <w:color w:val="4B8A99"/>
+          <w:color w:val="000000"/>
           <w:sz w:val="22"/>
           <w:szCs w:val="22"/>
         </w:rPr>
@@ -39,7 +39,7 @@
         <w:rPr>
           <w:b/>
           <w:bCs/>
-          <w:color w:val="0E7490"/>
+          <w:color w:val="000000"/>
           <w:sz w:val="56"/>
           <w:szCs w:val="56"/>
         </w:rPr>
@@ -88,7 +88,7 @@
       </w:pPr>
       <w:r>
         <w:rPr>
-          <w:color w:val="4B8A99"/>
+          <w:color w:val="000000"/>
         </w:rPr>
         <w:t xml:space="preserve">Octubre 2026</w:t>
       </w:r>
@@ -183,7 +183,7 @@
         <w:spacing w:after="100"/>
       </w:pPr>
       <w:r>
-        <w:t xml:space="preserve">10. Archivos pesados (400–600 MB)</w:t>
+        <w:t xml:space="preserve">10. Prioridades</w:t>
       </w:r>
     </w:p>
     <w:p>
@@ -191,7 +191,7 @@
         <w:spacing w:after="100"/>
       </w:pPr>
       <w:r>
-        <w:t xml:space="preserve">11. Observación sobre la aceleración por caso</w:t>
+        <w:t xml:space="preserve">11. Archivos pesados (400–600 MB)</w:t>
       </w:r>
     </w:p>
     <w:p>
@@ -199,7 +199,7 @@
         <w:spacing w:after="100"/>
       </w:pPr>
       <w:r>
-        <w:t xml:space="preserve">12. Pruebas pendientes</w:t>
+        <w:t xml:space="preserve">12. Observación sobre la aceleración por caso</w:t>
       </w:r>
     </w:p>
     <w:p>
@@ -207,7 +207,15 @@
         <w:spacing w:after="100"/>
       </w:pPr>
       <w:r>
-        <w:t xml:space="preserve">13. Conclusiones</w:t>
+        <w:t xml:space="preserve">13. Pruebas pendientes</w:t>
+      </w:r>
+    </w:p>
+    <w:p>
+      <w:pPr>
+        <w:spacing w:after="100"/>
+      </w:pPr>
+      <w:r>
+        <w:t xml:space="preserve">14. Conclusiones</w:t>
       </w:r>
     </w:p>
     <w:p>
@@ -236,7 +244,7 @@
         <w:spacing w:after="120" w:line="300"/>
       </w:pPr>
       <w:r>
-        <w:t xml:space="preserve">Todas las cifras provienen de las métricas que registra el propio sistema: la base de datos del coordinador y los archivos de resultados que genera el cliente de carga (carpeta pruebas/). Las pruebas del plan que todavía no se ejecutaron en el despliegue distribuido se identifican en la sección 12.</w:t>
+        <w:t xml:space="preserve">Todas las cifras provienen de las métricas que registra el propio sistema: la base de datos del coordinador y los archivos de resultados que genera el cliente de carga (carpeta pruebas/). Las pruebas del plan que todavía no se ejecutaron en el despliegue distribuido se identifican en la sección 13.</w:t>
       </w:r>
     </w:p>
     <w:p>
@@ -281,12 +289,12 @@
           <w:tcPr>
             <w:tcW w:type="dxa" w:w="1300"/>
             <w:tcBorders>
-              <w:top w:val="single" w:color="B6DFE8" w:sz="4"/>
-              <w:left w:val="single" w:color="B6DFE8" w:sz="4"/>
-              <w:bottom w:val="single" w:color="B6DFE8" w:sz="4"/>
-              <w:right w:val="single" w:color="B6DFE8" w:sz="4"/>
-            </w:tcBorders>
-            <w:shd w:fill="CFFAFE" w:val="clear"/>
+              <w:top w:val="single" w:color="A6A6A6" w:sz="4"/>
+              <w:left w:val="single" w:color="A6A6A6" w:sz="4"/>
+              <w:bottom w:val="single" w:color="A6A6A6" w:sz="4"/>
+              <w:right w:val="single" w:color="A6A6A6" w:sz="4"/>
+            </w:tcBorders>
+            <w:shd w:fill="E7E6E6" w:val="clear"/>
             <w:tcMar>
               <w:top w:type="dxa" w:w="60"/>
               <w:left w:type="dxa" w:w="100"/>
@@ -299,7 +307,7 @@
               <w:rPr>
                 <w:b/>
                 <w:bCs/>
-                <w:color w:val="0E7490"/>
+                <w:color w:val="000000"/>
                 <w:sz w:val="19"/>
                 <w:szCs w:val="19"/>
               </w:rPr>
@@ -311,12 +319,12 @@
           <w:tcPr>
             <w:tcW w:type="dxa" w:w="2100"/>
             <w:tcBorders>
-              <w:top w:val="single" w:color="B6DFE8" w:sz="4"/>
-              <w:left w:val="single" w:color="B6DFE8" w:sz="4"/>
-              <w:bottom w:val="single" w:color="B6DFE8" w:sz="4"/>
-              <w:right w:val="single" w:color="B6DFE8" w:sz="4"/>
-            </w:tcBorders>
-            <w:shd w:fill="CFFAFE" w:val="clear"/>
+              <w:top w:val="single" w:color="A6A6A6" w:sz="4"/>
+              <w:left w:val="single" w:color="A6A6A6" w:sz="4"/>
+              <w:bottom w:val="single" w:color="A6A6A6" w:sz="4"/>
+              <w:right w:val="single" w:color="A6A6A6" w:sz="4"/>
+            </w:tcBorders>
+            <w:shd w:fill="E7E6E6" w:val="clear"/>
             <w:tcMar>
               <w:top w:type="dxa" w:w="60"/>
               <w:left w:type="dxa" w:w="100"/>
@@ -329,7 +337,7 @@
               <w:rPr>
                 <w:b/>
                 <w:bCs/>
-                <w:color w:val="0E7490"/>
+                <w:color w:val="000000"/>
                 <w:sz w:val="19"/>
                 <w:szCs w:val="19"/>
               </w:rPr>
@@ -341,12 +349,12 @@
           <w:tcPr>
             <w:tcW w:type="dxa" w:w="3260"/>
             <w:tcBorders>
-              <w:top w:val="single" w:color="B6DFE8" w:sz="4"/>
-              <w:left w:val="single" w:color="B6DFE8" w:sz="4"/>
-              <w:bottom w:val="single" w:color="B6DFE8" w:sz="4"/>
-              <w:right w:val="single" w:color="B6DFE8" w:sz="4"/>
-            </w:tcBorders>
-            <w:shd w:fill="CFFAFE" w:val="clear"/>
+              <w:top w:val="single" w:color="A6A6A6" w:sz="4"/>
+              <w:left w:val="single" w:color="A6A6A6" w:sz="4"/>
+              <w:bottom w:val="single" w:color="A6A6A6" w:sz="4"/>
+              <w:right w:val="single" w:color="A6A6A6" w:sz="4"/>
+            </w:tcBorders>
+            <w:shd w:fill="E7E6E6" w:val="clear"/>
             <w:tcMar>
               <w:top w:type="dxa" w:w="60"/>
               <w:left w:type="dxa" w:w="100"/>
@@ -359,7 +367,7 @@
               <w:rPr>
                 <w:b/>
                 <w:bCs/>
-                <w:color w:val="0E7490"/>
+                <w:color w:val="000000"/>
                 <w:sz w:val="19"/>
                 <w:szCs w:val="19"/>
               </w:rPr>
@@ -371,12 +379,12 @@
           <w:tcPr>
             <w:tcW w:type="dxa" w:w="2700"/>
             <w:tcBorders>
-              <w:top w:val="single" w:color="B6DFE8" w:sz="4"/>
-              <w:left w:val="single" w:color="B6DFE8" w:sz="4"/>
-              <w:bottom w:val="single" w:color="B6DFE8" w:sz="4"/>
-              <w:right w:val="single" w:color="B6DFE8" w:sz="4"/>
-            </w:tcBorders>
-            <w:shd w:fill="CFFAFE" w:val="clear"/>
+              <w:top w:val="single" w:color="A6A6A6" w:sz="4"/>
+              <w:left w:val="single" w:color="A6A6A6" w:sz="4"/>
+              <w:bottom w:val="single" w:color="A6A6A6" w:sz="4"/>
+              <w:right w:val="single" w:color="A6A6A6" w:sz="4"/>
+            </w:tcBorders>
+            <w:shd w:fill="E7E6E6" w:val="clear"/>
             <w:tcMar>
               <w:top w:type="dxa" w:w="60"/>
               <w:left w:type="dxa" w:w="100"/>
@@ -389,7 +397,7 @@
               <w:rPr>
                 <w:b/>
                 <w:bCs/>
-                <w:color w:val="0E7490"/>
+                <w:color w:val="000000"/>
                 <w:sz w:val="19"/>
                 <w:szCs w:val="19"/>
               </w:rPr>
@@ -403,10 +411,10 @@
           <w:tcPr>
             <w:tcW w:type="dxa" w:w="1300"/>
             <w:tcBorders>
-              <w:top w:val="single" w:color="B6DFE8" w:sz="4"/>
-              <w:left w:val="single" w:color="B6DFE8" w:sz="4"/>
-              <w:bottom w:val="single" w:color="B6DFE8" w:sz="4"/>
-              <w:right w:val="single" w:color="B6DFE8" w:sz="4"/>
+              <w:top w:val="single" w:color="A6A6A6" w:sz="4"/>
+              <w:left w:val="single" w:color="A6A6A6" w:sz="4"/>
+              <w:bottom w:val="single" w:color="A6A6A6" w:sz="4"/>
+              <w:right w:val="single" w:color="A6A6A6" w:sz="4"/>
             </w:tcBorders>
             <w:tcMar>
               <w:top w:type="dxa" w:w="60"/>
@@ -431,10 +439,10 @@
           <w:tcPr>
             <w:tcW w:type="dxa" w:w="2100"/>
             <w:tcBorders>
-              <w:top w:val="single" w:color="B6DFE8" w:sz="4"/>
-              <w:left w:val="single" w:color="B6DFE8" w:sz="4"/>
-              <w:bottom w:val="single" w:color="B6DFE8" w:sz="4"/>
-              <w:right w:val="single" w:color="B6DFE8" w:sz="4"/>
+              <w:top w:val="single" w:color="A6A6A6" w:sz="4"/>
+              <w:left w:val="single" w:color="A6A6A6" w:sz="4"/>
+              <w:bottom w:val="single" w:color="A6A6A6" w:sz="4"/>
+              <w:right w:val="single" w:color="A6A6A6" w:sz="4"/>
             </w:tcBorders>
             <w:tcMar>
               <w:top w:type="dxa" w:w="60"/>
@@ -459,10 +467,10 @@
           <w:tcPr>
             <w:tcW w:type="dxa" w:w="3260"/>
             <w:tcBorders>
-              <w:top w:val="single" w:color="B6DFE8" w:sz="4"/>
-              <w:left w:val="single" w:color="B6DFE8" w:sz="4"/>
-              <w:bottom w:val="single" w:color="B6DFE8" w:sz="4"/>
-              <w:right w:val="single" w:color="B6DFE8" w:sz="4"/>
+              <w:top w:val="single" w:color="A6A6A6" w:sz="4"/>
+              <w:left w:val="single" w:color="A6A6A6" w:sz="4"/>
+              <w:bottom w:val="single" w:color="A6A6A6" w:sz="4"/>
+              <w:right w:val="single" w:color="A6A6A6" w:sz="4"/>
             </w:tcBorders>
             <w:tcMar>
               <w:top w:type="dxa" w:w="60"/>
@@ -487,10 +495,10 @@
           <w:tcPr>
             <w:tcW w:type="dxa" w:w="2700"/>
             <w:tcBorders>
-              <w:top w:val="single" w:color="B6DFE8" w:sz="4"/>
-              <w:left w:val="single" w:color="B6DFE8" w:sz="4"/>
-              <w:bottom w:val="single" w:color="B6DFE8" w:sz="4"/>
-              <w:right w:val="single" w:color="B6DFE8" w:sz="4"/>
+              <w:top w:val="single" w:color="A6A6A6" w:sz="4"/>
+              <w:left w:val="single" w:color="A6A6A6" w:sz="4"/>
+              <w:bottom w:val="single" w:color="A6A6A6" w:sz="4"/>
+              <w:right w:val="single" w:color="A6A6A6" w:sz="4"/>
             </w:tcBorders>
             <w:tcMar>
               <w:top w:type="dxa" w:w="60"/>
@@ -517,10 +525,10 @@
           <w:tcPr>
             <w:tcW w:type="dxa" w:w="1300"/>
             <w:tcBorders>
-              <w:top w:val="single" w:color="B6DFE8" w:sz="4"/>
-              <w:left w:val="single" w:color="B6DFE8" w:sz="4"/>
-              <w:bottom w:val="single" w:color="B6DFE8" w:sz="4"/>
-              <w:right w:val="single" w:color="B6DFE8" w:sz="4"/>
+              <w:top w:val="single" w:color="A6A6A6" w:sz="4"/>
+              <w:left w:val="single" w:color="A6A6A6" w:sz="4"/>
+              <w:bottom w:val="single" w:color="A6A6A6" w:sz="4"/>
+              <w:right w:val="single" w:color="A6A6A6" w:sz="4"/>
             </w:tcBorders>
             <w:tcMar>
               <w:top w:type="dxa" w:w="60"/>
@@ -545,10 +553,10 @@
           <w:tcPr>
             <w:tcW w:type="dxa" w:w="2100"/>
             <w:tcBorders>
-              <w:top w:val="single" w:color="B6DFE8" w:sz="4"/>
-              <w:left w:val="single" w:color="B6DFE8" w:sz="4"/>
-              <w:bottom w:val="single" w:color="B6DFE8" w:sz="4"/>
-              <w:right w:val="single" w:color="B6DFE8" w:sz="4"/>
+              <w:top w:val="single" w:color="A6A6A6" w:sz="4"/>
+              <w:left w:val="single" w:color="A6A6A6" w:sz="4"/>
+              <w:bottom w:val="single" w:color="A6A6A6" w:sz="4"/>
+              <w:right w:val="single" w:color="A6A6A6" w:sz="4"/>
             </w:tcBorders>
             <w:tcMar>
               <w:top w:type="dxa" w:w="60"/>
@@ -573,10 +581,10 @@
           <w:tcPr>
             <w:tcW w:type="dxa" w:w="3260"/>
             <w:tcBorders>
-              <w:top w:val="single" w:color="B6DFE8" w:sz="4"/>
-              <w:left w:val="single" w:color="B6DFE8" w:sz="4"/>
-              <w:bottom w:val="single" w:color="B6DFE8" w:sz="4"/>
-              <w:right w:val="single" w:color="B6DFE8" w:sz="4"/>
+              <w:top w:val="single" w:color="A6A6A6" w:sz="4"/>
+              <w:left w:val="single" w:color="A6A6A6" w:sz="4"/>
+              <w:bottom w:val="single" w:color="A6A6A6" w:sz="4"/>
+              <w:right w:val="single" w:color="A6A6A6" w:sz="4"/>
             </w:tcBorders>
             <w:tcMar>
               <w:top w:type="dxa" w:w="60"/>
@@ -601,10 +609,10 @@
           <w:tcPr>
             <w:tcW w:type="dxa" w:w="2700"/>
             <w:tcBorders>
-              <w:top w:val="single" w:color="B6DFE8" w:sz="4"/>
-              <w:left w:val="single" w:color="B6DFE8" w:sz="4"/>
-              <w:bottom w:val="single" w:color="B6DFE8" w:sz="4"/>
-              <w:right w:val="single" w:color="B6DFE8" w:sz="4"/>
+              <w:top w:val="single" w:color="A6A6A6" w:sz="4"/>
+              <w:left w:val="single" w:color="A6A6A6" w:sz="4"/>
+              <w:bottom w:val="single" w:color="A6A6A6" w:sz="4"/>
+              <w:right w:val="single" w:color="A6A6A6" w:sz="4"/>
             </w:tcBorders>
             <w:tcMar>
               <w:top w:type="dxa" w:w="60"/>
@@ -631,10 +639,10 @@
           <w:tcPr>
             <w:tcW w:type="dxa" w:w="1300"/>
             <w:tcBorders>
-              <w:top w:val="single" w:color="B6DFE8" w:sz="4"/>
-              <w:left w:val="single" w:color="B6DFE8" w:sz="4"/>
-              <w:bottom w:val="single" w:color="B6DFE8" w:sz="4"/>
-              <w:right w:val="single" w:color="B6DFE8" w:sz="4"/>
+              <w:top w:val="single" w:color="A6A6A6" w:sz="4"/>
+              <w:left w:val="single" w:color="A6A6A6" w:sz="4"/>
+              <w:bottom w:val="single" w:color="A6A6A6" w:sz="4"/>
+              <w:right w:val="single" w:color="A6A6A6" w:sz="4"/>
             </w:tcBorders>
             <w:tcMar>
               <w:top w:type="dxa" w:w="60"/>
@@ -659,10 +667,10 @@
           <w:tcPr>
             <w:tcW w:type="dxa" w:w="2100"/>
             <w:tcBorders>
-              <w:top w:val="single" w:color="B6DFE8" w:sz="4"/>
-              <w:left w:val="single" w:color="B6DFE8" w:sz="4"/>
-              <w:bottom w:val="single" w:color="B6DFE8" w:sz="4"/>
-              <w:right w:val="single" w:color="B6DFE8" w:sz="4"/>
+              <w:top w:val="single" w:color="A6A6A6" w:sz="4"/>
+              <w:left w:val="single" w:color="A6A6A6" w:sz="4"/>
+              <w:bottom w:val="single" w:color="A6A6A6" w:sz="4"/>
+              <w:right w:val="single" w:color="A6A6A6" w:sz="4"/>
             </w:tcBorders>
             <w:tcMar>
               <w:top w:type="dxa" w:w="60"/>
@@ -687,10 +695,10 @@
           <w:tcPr>
             <w:tcW w:type="dxa" w:w="3260"/>
             <w:tcBorders>
-              <w:top w:val="single" w:color="B6DFE8" w:sz="4"/>
-              <w:left w:val="single" w:color="B6DFE8" w:sz="4"/>
-              <w:bottom w:val="single" w:color="B6DFE8" w:sz="4"/>
-              <w:right w:val="single" w:color="B6DFE8" w:sz="4"/>
+              <w:top w:val="single" w:color="A6A6A6" w:sz="4"/>
+              <w:left w:val="single" w:color="A6A6A6" w:sz="4"/>
+              <w:bottom w:val="single" w:color="A6A6A6" w:sz="4"/>
+              <w:right w:val="single" w:color="A6A6A6" w:sz="4"/>
             </w:tcBorders>
             <w:tcMar>
               <w:top w:type="dxa" w:w="60"/>
@@ -715,10 +723,10 @@
           <w:tcPr>
             <w:tcW w:type="dxa" w:w="2700"/>
             <w:tcBorders>
-              <w:top w:val="single" w:color="B6DFE8" w:sz="4"/>
-              <w:left w:val="single" w:color="B6DFE8" w:sz="4"/>
-              <w:bottom w:val="single" w:color="B6DFE8" w:sz="4"/>
-              <w:right w:val="single" w:color="B6DFE8" w:sz="4"/>
+              <w:top w:val="single" w:color="A6A6A6" w:sz="4"/>
+              <w:left w:val="single" w:color="A6A6A6" w:sz="4"/>
+              <w:bottom w:val="single" w:color="A6A6A6" w:sz="4"/>
+              <w:right w:val="single" w:color="A6A6A6" w:sz="4"/>
             </w:tcBorders>
             <w:tcMar>
               <w:top w:type="dxa" w:w="60"/>
@@ -745,10 +753,10 @@
           <w:tcPr>
             <w:tcW w:type="dxa" w:w="1300"/>
             <w:tcBorders>
-              <w:top w:val="single" w:color="B6DFE8" w:sz="4"/>
-              <w:left w:val="single" w:color="B6DFE8" w:sz="4"/>
-              <w:bottom w:val="single" w:color="B6DFE8" w:sz="4"/>
-              <w:right w:val="single" w:color="B6DFE8" w:sz="4"/>
+              <w:top w:val="single" w:color="A6A6A6" w:sz="4"/>
+              <w:left w:val="single" w:color="A6A6A6" w:sz="4"/>
+              <w:bottom w:val="single" w:color="A6A6A6" w:sz="4"/>
+              <w:right w:val="single" w:color="A6A6A6" w:sz="4"/>
             </w:tcBorders>
             <w:tcMar>
               <w:top w:type="dxa" w:w="60"/>
@@ -773,10 +781,10 @@
           <w:tcPr>
             <w:tcW w:type="dxa" w:w="2100"/>
             <w:tcBorders>
-              <w:top w:val="single" w:color="B6DFE8" w:sz="4"/>
-              <w:left w:val="single" w:color="B6DFE8" w:sz="4"/>
-              <w:bottom w:val="single" w:color="B6DFE8" w:sz="4"/>
-              <w:right w:val="single" w:color="B6DFE8" w:sz="4"/>
+              <w:top w:val="single" w:color="A6A6A6" w:sz="4"/>
+              <w:left w:val="single" w:color="A6A6A6" w:sz="4"/>
+              <w:bottom w:val="single" w:color="A6A6A6" w:sz="4"/>
+              <w:right w:val="single" w:color="A6A6A6" w:sz="4"/>
             </w:tcBorders>
             <w:tcMar>
               <w:top w:type="dxa" w:w="60"/>
@@ -801,10 +809,10 @@
           <w:tcPr>
             <w:tcW w:type="dxa" w:w="3260"/>
             <w:tcBorders>
-              <w:top w:val="single" w:color="B6DFE8" w:sz="4"/>
-              <w:left w:val="single" w:color="B6DFE8" w:sz="4"/>
-              <w:bottom w:val="single" w:color="B6DFE8" w:sz="4"/>
-              <w:right w:val="single" w:color="B6DFE8" w:sz="4"/>
+              <w:top w:val="single" w:color="A6A6A6" w:sz="4"/>
+              <w:left w:val="single" w:color="A6A6A6" w:sz="4"/>
+              <w:bottom w:val="single" w:color="A6A6A6" w:sz="4"/>
+              <w:right w:val="single" w:color="A6A6A6" w:sz="4"/>
             </w:tcBorders>
             <w:tcMar>
               <w:top w:type="dxa" w:w="60"/>
@@ -829,10 +837,10 @@
           <w:tcPr>
             <w:tcW w:type="dxa" w:w="2700"/>
             <w:tcBorders>
-              <w:top w:val="single" w:color="B6DFE8" w:sz="4"/>
-              <w:left w:val="single" w:color="B6DFE8" w:sz="4"/>
-              <w:bottom w:val="single" w:color="B6DFE8" w:sz="4"/>
-              <w:right w:val="single" w:color="B6DFE8" w:sz="4"/>
+              <w:top w:val="single" w:color="A6A6A6" w:sz="4"/>
+              <w:left w:val="single" w:color="A6A6A6" w:sz="4"/>
+              <w:bottom w:val="single" w:color="A6A6A6" w:sz="4"/>
+              <w:right w:val="single" w:color="A6A6A6" w:sz="4"/>
             </w:tcBorders>
             <w:tcMar>
               <w:top w:type="dxa" w:w="60"/>
@@ -915,7 +923,7 @@
         <w:rPr>
           <w:b/>
           <w:bCs/>
-          <w:color w:val="4B8A99"/>
+          <w:color w:val="000000"/>
           <w:sz w:val="18"/>
           <w:szCs w:val="18"/>
         </w:rPr>
@@ -925,7 +933,7 @@
         <w:rPr>
           <w:i/>
           <w:iCs/>
-          <w:color w:val="4B8A99"/>
+          <w:color w:val="000000"/>
           <w:sz w:val="18"/>
           <w:szCs w:val="18"/>
         </w:rPr>
@@ -1003,12 +1011,12 @@
           <w:tcPr>
             <w:tcW w:type="dxa" w:w="4680"/>
             <w:tcBorders>
-              <w:top w:val="single" w:color="B6DFE8" w:sz="4"/>
-              <w:left w:val="single" w:color="B6DFE8" w:sz="4"/>
-              <w:bottom w:val="single" w:color="B6DFE8" w:sz="4"/>
-              <w:right w:val="single" w:color="B6DFE8" w:sz="4"/>
-            </w:tcBorders>
-            <w:shd w:fill="CFFAFE" w:val="clear"/>
+              <w:top w:val="single" w:color="A6A6A6" w:sz="4"/>
+              <w:left w:val="single" w:color="A6A6A6" w:sz="4"/>
+              <w:bottom w:val="single" w:color="A6A6A6" w:sz="4"/>
+              <w:right w:val="single" w:color="A6A6A6" w:sz="4"/>
+            </w:tcBorders>
+            <w:shd w:fill="E7E6E6" w:val="clear"/>
             <w:tcMar>
               <w:top w:type="dxa" w:w="60"/>
               <w:left w:type="dxa" w:w="100"/>
@@ -1021,7 +1029,7 @@
               <w:rPr>
                 <w:b/>
                 <w:bCs/>
-                <w:color w:val="0E7490"/>
+                <w:color w:val="000000"/>
                 <w:sz w:val="19"/>
                 <w:szCs w:val="19"/>
               </w:rPr>
@@ -1033,12 +1041,12 @@
           <w:tcPr>
             <w:tcW w:type="dxa" w:w="4680"/>
             <w:tcBorders>
-              <w:top w:val="single" w:color="B6DFE8" w:sz="4"/>
-              <w:left w:val="single" w:color="B6DFE8" w:sz="4"/>
-              <w:bottom w:val="single" w:color="B6DFE8" w:sz="4"/>
-              <w:right w:val="single" w:color="B6DFE8" w:sz="4"/>
-            </w:tcBorders>
-            <w:shd w:fill="CFFAFE" w:val="clear"/>
+              <w:top w:val="single" w:color="A6A6A6" w:sz="4"/>
+              <w:left w:val="single" w:color="A6A6A6" w:sz="4"/>
+              <w:bottom w:val="single" w:color="A6A6A6" w:sz="4"/>
+              <w:right w:val="single" w:color="A6A6A6" w:sz="4"/>
+            </w:tcBorders>
+            <w:shd w:fill="E7E6E6" w:val="clear"/>
             <w:tcMar>
               <w:top w:type="dxa" w:w="60"/>
               <w:left w:type="dxa" w:w="100"/>
@@ -1051,7 +1059,7 @@
               <w:rPr>
                 <w:b/>
                 <w:bCs/>
-                <w:color w:val="0E7490"/>
+                <w:color w:val="000000"/>
                 <w:sz w:val="19"/>
                 <w:szCs w:val="19"/>
               </w:rPr>
@@ -1065,10 +1073,10 @@
           <w:tcPr>
             <w:tcW w:type="dxa" w:w="4680"/>
             <w:tcBorders>
-              <w:top w:val="single" w:color="B6DFE8" w:sz="4"/>
-              <w:left w:val="single" w:color="B6DFE8" w:sz="4"/>
-              <w:bottom w:val="single" w:color="B6DFE8" w:sz="4"/>
-              <w:right w:val="single" w:color="B6DFE8" w:sz="4"/>
+              <w:top w:val="single" w:color="A6A6A6" w:sz="4"/>
+              <w:left w:val="single" w:color="A6A6A6" w:sz="4"/>
+              <w:bottom w:val="single" w:color="A6A6A6" w:sz="4"/>
+              <w:right w:val="single" w:color="A6A6A6" w:sz="4"/>
             </w:tcBorders>
             <w:tcMar>
               <w:top w:type="dxa" w:w="60"/>
@@ -1093,10 +1101,10 @@
           <w:tcPr>
             <w:tcW w:type="dxa" w:w="4680"/>
             <w:tcBorders>
-              <w:top w:val="single" w:color="B6DFE8" w:sz="4"/>
-              <w:left w:val="single" w:color="B6DFE8" w:sz="4"/>
-              <w:bottom w:val="single" w:color="B6DFE8" w:sz="4"/>
-              <w:right w:val="single" w:color="B6DFE8" w:sz="4"/>
+              <w:top w:val="single" w:color="A6A6A6" w:sz="4"/>
+              <w:left w:val="single" w:color="A6A6A6" w:sz="4"/>
+              <w:bottom w:val="single" w:color="A6A6A6" w:sz="4"/>
+              <w:right w:val="single" w:color="A6A6A6" w:sz="4"/>
             </w:tcBorders>
             <w:tcMar>
               <w:top w:type="dxa" w:w="60"/>
@@ -1123,10 +1131,10 @@
           <w:tcPr>
             <w:tcW w:type="dxa" w:w="4680"/>
             <w:tcBorders>
-              <w:top w:val="single" w:color="B6DFE8" w:sz="4"/>
-              <w:left w:val="single" w:color="B6DFE8" w:sz="4"/>
-              <w:bottom w:val="single" w:color="B6DFE8" w:sz="4"/>
-              <w:right w:val="single" w:color="B6DFE8" w:sz="4"/>
+              <w:top w:val="single" w:color="A6A6A6" w:sz="4"/>
+              <w:left w:val="single" w:color="A6A6A6" w:sz="4"/>
+              <w:bottom w:val="single" w:color="A6A6A6" w:sz="4"/>
+              <w:right w:val="single" w:color="A6A6A6" w:sz="4"/>
             </w:tcBorders>
             <w:tcMar>
               <w:top w:type="dxa" w:w="60"/>
@@ -1151,10 +1159,10 @@
           <w:tcPr>
             <w:tcW w:type="dxa" w:w="4680"/>
             <w:tcBorders>
-              <w:top w:val="single" w:color="B6DFE8" w:sz="4"/>
-              <w:left w:val="single" w:color="B6DFE8" w:sz="4"/>
-              <w:bottom w:val="single" w:color="B6DFE8" w:sz="4"/>
-              <w:right w:val="single" w:color="B6DFE8" w:sz="4"/>
+              <w:top w:val="single" w:color="A6A6A6" w:sz="4"/>
+              <w:left w:val="single" w:color="A6A6A6" w:sz="4"/>
+              <w:bottom w:val="single" w:color="A6A6A6" w:sz="4"/>
+              <w:right w:val="single" w:color="A6A6A6" w:sz="4"/>
             </w:tcBorders>
             <w:tcMar>
               <w:top w:type="dxa" w:w="60"/>
@@ -1181,10 +1189,10 @@
           <w:tcPr>
             <w:tcW w:type="dxa" w:w="4680"/>
             <w:tcBorders>
-              <w:top w:val="single" w:color="B6DFE8" w:sz="4"/>
-              <w:left w:val="single" w:color="B6DFE8" w:sz="4"/>
-              <w:bottom w:val="single" w:color="B6DFE8" w:sz="4"/>
-              <w:right w:val="single" w:color="B6DFE8" w:sz="4"/>
+              <w:top w:val="single" w:color="A6A6A6" w:sz="4"/>
+              <w:left w:val="single" w:color="A6A6A6" w:sz="4"/>
+              <w:bottom w:val="single" w:color="A6A6A6" w:sz="4"/>
+              <w:right w:val="single" w:color="A6A6A6" w:sz="4"/>
             </w:tcBorders>
             <w:tcMar>
               <w:top w:type="dxa" w:w="60"/>
@@ -1209,10 +1217,10 @@
           <w:tcPr>
             <w:tcW w:type="dxa" w:w="4680"/>
             <w:tcBorders>
-              <w:top w:val="single" w:color="B6DFE8" w:sz="4"/>
-              <w:left w:val="single" w:color="B6DFE8" w:sz="4"/>
-              <w:bottom w:val="single" w:color="B6DFE8" w:sz="4"/>
-              <w:right w:val="single" w:color="B6DFE8" w:sz="4"/>
+              <w:top w:val="single" w:color="A6A6A6" w:sz="4"/>
+              <w:left w:val="single" w:color="A6A6A6" w:sz="4"/>
+              <w:bottom w:val="single" w:color="A6A6A6" w:sz="4"/>
+              <w:right w:val="single" w:color="A6A6A6" w:sz="4"/>
             </w:tcBorders>
             <w:tcMar>
               <w:top w:type="dxa" w:w="60"/>
@@ -1239,10 +1247,10 @@
           <w:tcPr>
             <w:tcW w:type="dxa" w:w="4680"/>
             <w:tcBorders>
-              <w:top w:val="single" w:color="B6DFE8" w:sz="4"/>
-              <w:left w:val="single" w:color="B6DFE8" w:sz="4"/>
-              <w:bottom w:val="single" w:color="B6DFE8" w:sz="4"/>
-              <w:right w:val="single" w:color="B6DFE8" w:sz="4"/>
+              <w:top w:val="single" w:color="A6A6A6" w:sz="4"/>
+              <w:left w:val="single" w:color="A6A6A6" w:sz="4"/>
+              <w:bottom w:val="single" w:color="A6A6A6" w:sz="4"/>
+              <w:right w:val="single" w:color="A6A6A6" w:sz="4"/>
             </w:tcBorders>
             <w:tcMar>
               <w:top w:type="dxa" w:w="60"/>
@@ -1267,10 +1275,10 @@
           <w:tcPr>
             <w:tcW w:type="dxa" w:w="4680"/>
             <w:tcBorders>
-              <w:top w:val="single" w:color="B6DFE8" w:sz="4"/>
-              <w:left w:val="single" w:color="B6DFE8" w:sz="4"/>
-              <w:bottom w:val="single" w:color="B6DFE8" w:sz="4"/>
-              <w:right w:val="single" w:color="B6DFE8" w:sz="4"/>
+              <w:top w:val="single" w:color="A6A6A6" w:sz="4"/>
+              <w:left w:val="single" w:color="A6A6A6" w:sz="4"/>
+              <w:bottom w:val="single" w:color="A6A6A6" w:sz="4"/>
+              <w:right w:val="single" w:color="A6A6A6" w:sz="4"/>
             </w:tcBorders>
             <w:tcMar>
               <w:top w:type="dxa" w:w="60"/>
@@ -1297,10 +1305,10 @@
           <w:tcPr>
             <w:tcW w:type="dxa" w:w="4680"/>
             <w:tcBorders>
-              <w:top w:val="single" w:color="B6DFE8" w:sz="4"/>
-              <w:left w:val="single" w:color="B6DFE8" w:sz="4"/>
-              <w:bottom w:val="single" w:color="B6DFE8" w:sz="4"/>
-              <w:right w:val="single" w:color="B6DFE8" w:sz="4"/>
+              <w:top w:val="single" w:color="A6A6A6" w:sz="4"/>
+              <w:left w:val="single" w:color="A6A6A6" w:sz="4"/>
+              <w:bottom w:val="single" w:color="A6A6A6" w:sz="4"/>
+              <w:right w:val="single" w:color="A6A6A6" w:sz="4"/>
             </w:tcBorders>
             <w:tcMar>
               <w:top w:type="dxa" w:w="60"/>
@@ -1325,10 +1333,10 @@
           <w:tcPr>
             <w:tcW w:type="dxa" w:w="4680"/>
             <w:tcBorders>
-              <w:top w:val="single" w:color="B6DFE8" w:sz="4"/>
-              <w:left w:val="single" w:color="B6DFE8" w:sz="4"/>
-              <w:bottom w:val="single" w:color="B6DFE8" w:sz="4"/>
-              <w:right w:val="single" w:color="B6DFE8" w:sz="4"/>
+              <w:top w:val="single" w:color="A6A6A6" w:sz="4"/>
+              <w:left w:val="single" w:color="A6A6A6" w:sz="4"/>
+              <w:bottom w:val="single" w:color="A6A6A6" w:sz="4"/>
+              <w:right w:val="single" w:color="A6A6A6" w:sz="4"/>
             </w:tcBorders>
             <w:tcMar>
               <w:top w:type="dxa" w:w="60"/>
@@ -1355,10 +1363,10 @@
           <w:tcPr>
             <w:tcW w:type="dxa" w:w="4680"/>
             <w:tcBorders>
-              <w:top w:val="single" w:color="B6DFE8" w:sz="4"/>
-              <w:left w:val="single" w:color="B6DFE8" w:sz="4"/>
-              <w:bottom w:val="single" w:color="B6DFE8" w:sz="4"/>
-              <w:right w:val="single" w:color="B6DFE8" w:sz="4"/>
+              <w:top w:val="single" w:color="A6A6A6" w:sz="4"/>
+              <w:left w:val="single" w:color="A6A6A6" w:sz="4"/>
+              <w:bottom w:val="single" w:color="A6A6A6" w:sz="4"/>
+              <w:right w:val="single" w:color="A6A6A6" w:sz="4"/>
             </w:tcBorders>
             <w:tcMar>
               <w:top w:type="dxa" w:w="60"/>
@@ -1383,10 +1391,10 @@
           <w:tcPr>
             <w:tcW w:type="dxa" w:w="4680"/>
             <w:tcBorders>
-              <w:top w:val="single" w:color="B6DFE8" w:sz="4"/>
-              <w:left w:val="single" w:color="B6DFE8" w:sz="4"/>
-              <w:bottom w:val="single" w:color="B6DFE8" w:sz="4"/>
-              <w:right w:val="single" w:color="B6DFE8" w:sz="4"/>
+              <w:top w:val="single" w:color="A6A6A6" w:sz="4"/>
+              <w:left w:val="single" w:color="A6A6A6" w:sz="4"/>
+              <w:bottom w:val="single" w:color="A6A6A6" w:sz="4"/>
+              <w:right w:val="single" w:color="A6A6A6" w:sz="4"/>
             </w:tcBorders>
             <w:tcMar>
               <w:top w:type="dxa" w:w="60"/>
@@ -1469,7 +1477,7 @@
         <w:rPr>
           <w:b/>
           <w:bCs/>
-          <w:color w:val="4B8A99"/>
+          <w:color w:val="000000"/>
           <w:sz w:val="18"/>
           <w:szCs w:val="18"/>
         </w:rPr>
@@ -1479,7 +1487,7 @@
         <w:rPr>
           <w:i/>
           <w:iCs/>
-          <w:color w:val="4B8A99"/>
+          <w:color w:val="000000"/>
           <w:sz w:val="18"/>
           <w:szCs w:val="18"/>
         </w:rPr>
@@ -1528,12 +1536,12 @@
           <w:tcPr>
             <w:tcW w:type="dxa" w:w="2140"/>
             <w:tcBorders>
-              <w:top w:val="single" w:color="B6DFE8" w:sz="4"/>
-              <w:left w:val="single" w:color="B6DFE8" w:sz="4"/>
-              <w:bottom w:val="single" w:color="B6DFE8" w:sz="4"/>
-              <w:right w:val="single" w:color="B6DFE8" w:sz="4"/>
-            </w:tcBorders>
-            <w:shd w:fill="CFFAFE" w:val="clear"/>
+              <w:top w:val="single" w:color="A6A6A6" w:sz="4"/>
+              <w:left w:val="single" w:color="A6A6A6" w:sz="4"/>
+              <w:bottom w:val="single" w:color="A6A6A6" w:sz="4"/>
+              <w:right w:val="single" w:color="A6A6A6" w:sz="4"/>
+            </w:tcBorders>
+            <w:shd w:fill="E7E6E6" w:val="clear"/>
             <w:tcMar>
               <w:top w:type="dxa" w:w="60"/>
               <w:left w:type="dxa" w:w="100"/>
@@ -1546,7 +1554,7 @@
               <w:rPr>
                 <w:b/>
                 <w:bCs/>
-                <w:color w:val="0E7490"/>
+                <w:color w:val="000000"/>
                 <w:sz w:val="19"/>
                 <w:szCs w:val="19"/>
               </w:rPr>
@@ -1558,12 +1566,12 @@
           <w:tcPr>
             <w:tcW w:type="dxa" w:w="2400"/>
             <w:tcBorders>
-              <w:top w:val="single" w:color="B6DFE8" w:sz="4"/>
-              <w:left w:val="single" w:color="B6DFE8" w:sz="4"/>
-              <w:bottom w:val="single" w:color="B6DFE8" w:sz="4"/>
-              <w:right w:val="single" w:color="B6DFE8" w:sz="4"/>
-            </w:tcBorders>
-            <w:shd w:fill="CFFAFE" w:val="clear"/>
+              <w:top w:val="single" w:color="A6A6A6" w:sz="4"/>
+              <w:left w:val="single" w:color="A6A6A6" w:sz="4"/>
+              <w:bottom w:val="single" w:color="A6A6A6" w:sz="4"/>
+              <w:right w:val="single" w:color="A6A6A6" w:sz="4"/>
+            </w:tcBorders>
+            <w:shd w:fill="E7E6E6" w:val="clear"/>
             <w:tcMar>
               <w:top w:type="dxa" w:w="60"/>
               <w:left w:type="dxa" w:w="100"/>
@@ -1576,7 +1584,7 @@
               <w:rPr>
                 <w:b/>
                 <w:bCs/>
-                <w:color w:val="0E7490"/>
+                <w:color w:val="000000"/>
                 <w:sz w:val="19"/>
                 <w:szCs w:val="19"/>
               </w:rPr>
@@ -1588,12 +1596,12 @@
           <w:tcPr>
             <w:tcW w:type="dxa" w:w="2420"/>
             <w:tcBorders>
-              <w:top w:val="single" w:color="B6DFE8" w:sz="4"/>
-              <w:left w:val="single" w:color="B6DFE8" w:sz="4"/>
-              <w:bottom w:val="single" w:color="B6DFE8" w:sz="4"/>
-              <w:right w:val="single" w:color="B6DFE8" w:sz="4"/>
-            </w:tcBorders>
-            <w:shd w:fill="CFFAFE" w:val="clear"/>
+              <w:top w:val="single" w:color="A6A6A6" w:sz="4"/>
+              <w:left w:val="single" w:color="A6A6A6" w:sz="4"/>
+              <w:bottom w:val="single" w:color="A6A6A6" w:sz="4"/>
+              <w:right w:val="single" w:color="A6A6A6" w:sz="4"/>
+            </w:tcBorders>
+            <w:shd w:fill="E7E6E6" w:val="clear"/>
             <w:tcMar>
               <w:top w:type="dxa" w:w="60"/>
               <w:left w:type="dxa" w:w="100"/>
@@ -1606,7 +1614,7 @@
               <w:rPr>
                 <w:b/>
                 <w:bCs/>
-                <w:color w:val="0E7490"/>
+                <w:color w:val="000000"/>
                 <w:sz w:val="19"/>
                 <w:szCs w:val="19"/>
               </w:rPr>
@@ -1618,12 +1626,12 @@
           <w:tcPr>
             <w:tcW w:type="dxa" w:w="2400"/>
             <w:tcBorders>
-              <w:top w:val="single" w:color="B6DFE8" w:sz="4"/>
-              <w:left w:val="single" w:color="B6DFE8" w:sz="4"/>
-              <w:bottom w:val="single" w:color="B6DFE8" w:sz="4"/>
-              <w:right w:val="single" w:color="B6DFE8" w:sz="4"/>
-            </w:tcBorders>
-            <w:shd w:fill="CFFAFE" w:val="clear"/>
+              <w:top w:val="single" w:color="A6A6A6" w:sz="4"/>
+              <w:left w:val="single" w:color="A6A6A6" w:sz="4"/>
+              <w:bottom w:val="single" w:color="A6A6A6" w:sz="4"/>
+              <w:right w:val="single" w:color="A6A6A6" w:sz="4"/>
+            </w:tcBorders>
+            <w:shd w:fill="E7E6E6" w:val="clear"/>
             <w:tcMar>
               <w:top w:type="dxa" w:w="60"/>
               <w:left w:type="dxa" w:w="100"/>
@@ -1636,7 +1644,7 @@
               <w:rPr>
                 <w:b/>
                 <w:bCs/>
-                <w:color w:val="0E7490"/>
+                <w:color w:val="000000"/>
                 <w:sz w:val="19"/>
                 <w:szCs w:val="19"/>
               </w:rPr>
@@ -1650,10 +1658,10 @@
           <w:tcPr>
             <w:tcW w:type="dxa" w:w="2140"/>
             <w:tcBorders>
-              <w:top w:val="single" w:color="B6DFE8" w:sz="4"/>
-              <w:left w:val="single" w:color="B6DFE8" w:sz="4"/>
-              <w:bottom w:val="single" w:color="B6DFE8" w:sz="4"/>
-              <w:right w:val="single" w:color="B6DFE8" w:sz="4"/>
+              <w:top w:val="single" w:color="A6A6A6" w:sz="4"/>
+              <w:left w:val="single" w:color="A6A6A6" w:sz="4"/>
+              <w:bottom w:val="single" w:color="A6A6A6" w:sz="4"/>
+              <w:right w:val="single" w:color="A6A6A6" w:sz="4"/>
             </w:tcBorders>
             <w:tcMar>
               <w:top w:type="dxa" w:w="60"/>
@@ -1678,10 +1686,10 @@
           <w:tcPr>
             <w:tcW w:type="dxa" w:w="2400"/>
             <w:tcBorders>
-              <w:top w:val="single" w:color="B6DFE8" w:sz="4"/>
-              <w:left w:val="single" w:color="B6DFE8" w:sz="4"/>
-              <w:bottom w:val="single" w:color="B6DFE8" w:sz="4"/>
-              <w:right w:val="single" w:color="B6DFE8" w:sz="4"/>
+              <w:top w:val="single" w:color="A6A6A6" w:sz="4"/>
+              <w:left w:val="single" w:color="A6A6A6" w:sz="4"/>
+              <w:bottom w:val="single" w:color="A6A6A6" w:sz="4"/>
+              <w:right w:val="single" w:color="A6A6A6" w:sz="4"/>
             </w:tcBorders>
             <w:tcMar>
               <w:top w:type="dxa" w:w="60"/>
@@ -1706,10 +1714,10 @@
           <w:tcPr>
             <w:tcW w:type="dxa" w:w="2420"/>
             <w:tcBorders>
-              <w:top w:val="single" w:color="B6DFE8" w:sz="4"/>
-              <w:left w:val="single" w:color="B6DFE8" w:sz="4"/>
-              <w:bottom w:val="single" w:color="B6DFE8" w:sz="4"/>
-              <w:right w:val="single" w:color="B6DFE8" w:sz="4"/>
+              <w:top w:val="single" w:color="A6A6A6" w:sz="4"/>
+              <w:left w:val="single" w:color="A6A6A6" w:sz="4"/>
+              <w:bottom w:val="single" w:color="A6A6A6" w:sz="4"/>
+              <w:right w:val="single" w:color="A6A6A6" w:sz="4"/>
             </w:tcBorders>
             <w:tcMar>
               <w:top w:type="dxa" w:w="60"/>
@@ -1734,10 +1742,10 @@
           <w:tcPr>
             <w:tcW w:type="dxa" w:w="2400"/>
             <w:tcBorders>
-              <w:top w:val="single" w:color="B6DFE8" w:sz="4"/>
-              <w:left w:val="single" w:color="B6DFE8" w:sz="4"/>
-              <w:bottom w:val="single" w:color="B6DFE8" w:sz="4"/>
-              <w:right w:val="single" w:color="B6DFE8" w:sz="4"/>
+              <w:top w:val="single" w:color="A6A6A6" w:sz="4"/>
+              <w:left w:val="single" w:color="A6A6A6" w:sz="4"/>
+              <w:bottom w:val="single" w:color="A6A6A6" w:sz="4"/>
+              <w:right w:val="single" w:color="A6A6A6" w:sz="4"/>
             </w:tcBorders>
             <w:tcMar>
               <w:top w:type="dxa" w:w="60"/>
@@ -1764,10 +1772,10 @@
           <w:tcPr>
             <w:tcW w:type="dxa" w:w="2140"/>
             <w:tcBorders>
-              <w:top w:val="single" w:color="B6DFE8" w:sz="4"/>
-              <w:left w:val="single" w:color="B6DFE8" w:sz="4"/>
-              <w:bottom w:val="single" w:color="B6DFE8" w:sz="4"/>
-              <w:right w:val="single" w:color="B6DFE8" w:sz="4"/>
+              <w:top w:val="single" w:color="A6A6A6" w:sz="4"/>
+              <w:left w:val="single" w:color="A6A6A6" w:sz="4"/>
+              <w:bottom w:val="single" w:color="A6A6A6" w:sz="4"/>
+              <w:right w:val="single" w:color="A6A6A6" w:sz="4"/>
             </w:tcBorders>
             <w:tcMar>
               <w:top w:type="dxa" w:w="60"/>
@@ -1792,10 +1800,10 @@
           <w:tcPr>
             <w:tcW w:type="dxa" w:w="2400"/>
             <w:tcBorders>
-              <w:top w:val="single" w:color="B6DFE8" w:sz="4"/>
-              <w:left w:val="single" w:color="B6DFE8" w:sz="4"/>
-              <w:bottom w:val="single" w:color="B6DFE8" w:sz="4"/>
-              <w:right w:val="single" w:color="B6DFE8" w:sz="4"/>
+              <w:top w:val="single" w:color="A6A6A6" w:sz="4"/>
+              <w:left w:val="single" w:color="A6A6A6" w:sz="4"/>
+              <w:bottom w:val="single" w:color="A6A6A6" w:sz="4"/>
+              <w:right w:val="single" w:color="A6A6A6" w:sz="4"/>
             </w:tcBorders>
             <w:tcMar>
               <w:top w:type="dxa" w:w="60"/>
@@ -1820,10 +1828,10 @@
           <w:tcPr>
             <w:tcW w:type="dxa" w:w="2420"/>
             <w:tcBorders>
-              <w:top w:val="single" w:color="B6DFE8" w:sz="4"/>
-              <w:left w:val="single" w:color="B6DFE8" w:sz="4"/>
-              <w:bottom w:val="single" w:color="B6DFE8" w:sz="4"/>
-              <w:right w:val="single" w:color="B6DFE8" w:sz="4"/>
+              <w:top w:val="single" w:color="A6A6A6" w:sz="4"/>
+              <w:left w:val="single" w:color="A6A6A6" w:sz="4"/>
+              <w:bottom w:val="single" w:color="A6A6A6" w:sz="4"/>
+              <w:right w:val="single" w:color="A6A6A6" w:sz="4"/>
             </w:tcBorders>
             <w:tcMar>
               <w:top w:type="dxa" w:w="60"/>
@@ -1848,10 +1856,10 @@
           <w:tcPr>
             <w:tcW w:type="dxa" w:w="2400"/>
             <w:tcBorders>
-              <w:top w:val="single" w:color="B6DFE8" w:sz="4"/>
-              <w:left w:val="single" w:color="B6DFE8" w:sz="4"/>
-              <w:bottom w:val="single" w:color="B6DFE8" w:sz="4"/>
-              <w:right w:val="single" w:color="B6DFE8" w:sz="4"/>
+              <w:top w:val="single" w:color="A6A6A6" w:sz="4"/>
+              <w:left w:val="single" w:color="A6A6A6" w:sz="4"/>
+              <w:bottom w:val="single" w:color="A6A6A6" w:sz="4"/>
+              <w:right w:val="single" w:color="A6A6A6" w:sz="4"/>
             </w:tcBorders>
             <w:tcMar>
               <w:top w:type="dxa" w:w="60"/>
@@ -1878,10 +1886,10 @@
           <w:tcPr>
             <w:tcW w:type="dxa" w:w="2140"/>
             <w:tcBorders>
-              <w:top w:val="single" w:color="B6DFE8" w:sz="4"/>
-              <w:left w:val="single" w:color="B6DFE8" w:sz="4"/>
-              <w:bottom w:val="single" w:color="B6DFE8" w:sz="4"/>
-              <w:right w:val="single" w:color="B6DFE8" w:sz="4"/>
+              <w:top w:val="single" w:color="A6A6A6" w:sz="4"/>
+              <w:left w:val="single" w:color="A6A6A6" w:sz="4"/>
+              <w:bottom w:val="single" w:color="A6A6A6" w:sz="4"/>
+              <w:right w:val="single" w:color="A6A6A6" w:sz="4"/>
             </w:tcBorders>
             <w:tcMar>
               <w:top w:type="dxa" w:w="60"/>
@@ -1906,10 +1914,10 @@
           <w:tcPr>
             <w:tcW w:type="dxa" w:w="2400"/>
             <w:tcBorders>
-              <w:top w:val="single" w:color="B6DFE8" w:sz="4"/>
-              <w:left w:val="single" w:color="B6DFE8" w:sz="4"/>
-              <w:bottom w:val="single" w:color="B6DFE8" w:sz="4"/>
-              <w:right w:val="single" w:color="B6DFE8" w:sz="4"/>
+              <w:top w:val="single" w:color="A6A6A6" w:sz="4"/>
+              <w:left w:val="single" w:color="A6A6A6" w:sz="4"/>
+              <w:bottom w:val="single" w:color="A6A6A6" w:sz="4"/>
+              <w:right w:val="single" w:color="A6A6A6" w:sz="4"/>
             </w:tcBorders>
             <w:tcMar>
               <w:top w:type="dxa" w:w="60"/>
@@ -1934,10 +1942,10 @@
           <w:tcPr>
             <w:tcW w:type="dxa" w:w="2420"/>
             <w:tcBorders>
-              <w:top w:val="single" w:color="B6DFE8" w:sz="4"/>
-              <w:left w:val="single" w:color="B6DFE8" w:sz="4"/>
-              <w:bottom w:val="single" w:color="B6DFE8" w:sz="4"/>
-              <w:right w:val="single" w:color="B6DFE8" w:sz="4"/>
+              <w:top w:val="single" w:color="A6A6A6" w:sz="4"/>
+              <w:left w:val="single" w:color="A6A6A6" w:sz="4"/>
+              <w:bottom w:val="single" w:color="A6A6A6" w:sz="4"/>
+              <w:right w:val="single" w:color="A6A6A6" w:sz="4"/>
             </w:tcBorders>
             <w:tcMar>
               <w:top w:type="dxa" w:w="60"/>
@@ -1962,10 +1970,10 @@
           <w:tcPr>
             <w:tcW w:type="dxa" w:w="2400"/>
             <w:tcBorders>
-              <w:top w:val="single" w:color="B6DFE8" w:sz="4"/>
-              <w:left w:val="single" w:color="B6DFE8" w:sz="4"/>
-              <w:bottom w:val="single" w:color="B6DFE8" w:sz="4"/>
-              <w:right w:val="single" w:color="B6DFE8" w:sz="4"/>
+              <w:top w:val="single" w:color="A6A6A6" w:sz="4"/>
+              <w:left w:val="single" w:color="A6A6A6" w:sz="4"/>
+              <w:bottom w:val="single" w:color="A6A6A6" w:sz="4"/>
+              <w:right w:val="single" w:color="A6A6A6" w:sz="4"/>
             </w:tcBorders>
             <w:tcMar>
               <w:top w:type="dxa" w:w="60"/>
@@ -1992,10 +2000,10 @@
           <w:tcPr>
             <w:tcW w:type="dxa" w:w="2140"/>
             <w:tcBorders>
-              <w:top w:val="single" w:color="B6DFE8" w:sz="4"/>
-              <w:left w:val="single" w:color="B6DFE8" w:sz="4"/>
-              <w:bottom w:val="single" w:color="B6DFE8" w:sz="4"/>
-              <w:right w:val="single" w:color="B6DFE8" w:sz="4"/>
+              <w:top w:val="single" w:color="A6A6A6" w:sz="4"/>
+              <w:left w:val="single" w:color="A6A6A6" w:sz="4"/>
+              <w:bottom w:val="single" w:color="A6A6A6" w:sz="4"/>
+              <w:right w:val="single" w:color="A6A6A6" w:sz="4"/>
             </w:tcBorders>
             <w:tcMar>
               <w:top w:type="dxa" w:w="60"/>
@@ -2020,10 +2028,10 @@
           <w:tcPr>
             <w:tcW w:type="dxa" w:w="2400"/>
             <w:tcBorders>
-              <w:top w:val="single" w:color="B6DFE8" w:sz="4"/>
-              <w:left w:val="single" w:color="B6DFE8" w:sz="4"/>
-              <w:bottom w:val="single" w:color="B6DFE8" w:sz="4"/>
-              <w:right w:val="single" w:color="B6DFE8" w:sz="4"/>
+              <w:top w:val="single" w:color="A6A6A6" w:sz="4"/>
+              <w:left w:val="single" w:color="A6A6A6" w:sz="4"/>
+              <w:bottom w:val="single" w:color="A6A6A6" w:sz="4"/>
+              <w:right w:val="single" w:color="A6A6A6" w:sz="4"/>
             </w:tcBorders>
             <w:tcMar>
               <w:top w:type="dxa" w:w="60"/>
@@ -2048,10 +2056,10 @@
           <w:tcPr>
             <w:tcW w:type="dxa" w:w="2420"/>
             <w:tcBorders>
-              <w:top w:val="single" w:color="B6DFE8" w:sz="4"/>
-              <w:left w:val="single" w:color="B6DFE8" w:sz="4"/>
-              <w:bottom w:val="single" w:color="B6DFE8" w:sz="4"/>
-              <w:right w:val="single" w:color="B6DFE8" w:sz="4"/>
+              <w:top w:val="single" w:color="A6A6A6" w:sz="4"/>
+              <w:left w:val="single" w:color="A6A6A6" w:sz="4"/>
+              <w:bottom w:val="single" w:color="A6A6A6" w:sz="4"/>
+              <w:right w:val="single" w:color="A6A6A6" w:sz="4"/>
             </w:tcBorders>
             <w:tcMar>
               <w:top w:type="dxa" w:w="60"/>
@@ -2076,10 +2084,10 @@
           <w:tcPr>
             <w:tcW w:type="dxa" w:w="2400"/>
             <w:tcBorders>
-              <w:top w:val="single" w:color="B6DFE8" w:sz="4"/>
-              <w:left w:val="single" w:color="B6DFE8" w:sz="4"/>
-              <w:bottom w:val="single" w:color="B6DFE8" w:sz="4"/>
-              <w:right w:val="single" w:color="B6DFE8" w:sz="4"/>
+              <w:top w:val="single" w:color="A6A6A6" w:sz="4"/>
+              <w:left w:val="single" w:color="A6A6A6" w:sz="4"/>
+              <w:bottom w:val="single" w:color="A6A6A6" w:sz="4"/>
+              <w:right w:val="single" w:color="A6A6A6" w:sz="4"/>
             </w:tcBorders>
             <w:tcMar>
               <w:top w:type="dxa" w:w="60"/>
@@ -2106,10 +2114,10 @@
           <w:tcPr>
             <w:tcW w:type="dxa" w:w="2140"/>
             <w:tcBorders>
-              <w:top w:val="single" w:color="B6DFE8" w:sz="4"/>
-              <w:left w:val="single" w:color="B6DFE8" w:sz="4"/>
-              <w:bottom w:val="single" w:color="B6DFE8" w:sz="4"/>
-              <w:right w:val="single" w:color="B6DFE8" w:sz="4"/>
+              <w:top w:val="single" w:color="A6A6A6" w:sz="4"/>
+              <w:left w:val="single" w:color="A6A6A6" w:sz="4"/>
+              <w:bottom w:val="single" w:color="A6A6A6" w:sz="4"/>
+              <w:right w:val="single" w:color="A6A6A6" w:sz="4"/>
             </w:tcBorders>
             <w:tcMar>
               <w:top w:type="dxa" w:w="60"/>
@@ -2134,10 +2142,10 @@
           <w:tcPr>
             <w:tcW w:type="dxa" w:w="2400"/>
             <w:tcBorders>
-              <w:top w:val="single" w:color="B6DFE8" w:sz="4"/>
-              <w:left w:val="single" w:color="B6DFE8" w:sz="4"/>
-              <w:bottom w:val="single" w:color="B6DFE8" w:sz="4"/>
-              <w:right w:val="single" w:color="B6DFE8" w:sz="4"/>
+              <w:top w:val="single" w:color="A6A6A6" w:sz="4"/>
+              <w:left w:val="single" w:color="A6A6A6" w:sz="4"/>
+              <w:bottom w:val="single" w:color="A6A6A6" w:sz="4"/>
+              <w:right w:val="single" w:color="A6A6A6" w:sz="4"/>
             </w:tcBorders>
             <w:tcMar>
               <w:top w:type="dxa" w:w="60"/>
@@ -2162,10 +2170,10 @@
           <w:tcPr>
             <w:tcW w:type="dxa" w:w="2420"/>
             <w:tcBorders>
-              <w:top w:val="single" w:color="B6DFE8" w:sz="4"/>
-              <w:left w:val="single" w:color="B6DFE8" w:sz="4"/>
-              <w:bottom w:val="single" w:color="B6DFE8" w:sz="4"/>
-              <w:right w:val="single" w:color="B6DFE8" w:sz="4"/>
+              <w:top w:val="single" w:color="A6A6A6" w:sz="4"/>
+              <w:left w:val="single" w:color="A6A6A6" w:sz="4"/>
+              <w:bottom w:val="single" w:color="A6A6A6" w:sz="4"/>
+              <w:right w:val="single" w:color="A6A6A6" w:sz="4"/>
             </w:tcBorders>
             <w:tcMar>
               <w:top w:type="dxa" w:w="60"/>
@@ -2190,10 +2198,10 @@
           <w:tcPr>
             <w:tcW w:type="dxa" w:w="2400"/>
             <w:tcBorders>
-              <w:top w:val="single" w:color="B6DFE8" w:sz="4"/>
-              <w:left w:val="single" w:color="B6DFE8" w:sz="4"/>
-              <w:bottom w:val="single" w:color="B6DFE8" w:sz="4"/>
-              <w:right w:val="single" w:color="B6DFE8" w:sz="4"/>
+              <w:top w:val="single" w:color="A6A6A6" w:sz="4"/>
+              <w:left w:val="single" w:color="A6A6A6" w:sz="4"/>
+              <w:bottom w:val="single" w:color="A6A6A6" w:sz="4"/>
+              <w:right w:val="single" w:color="A6A6A6" w:sz="4"/>
             </w:tcBorders>
             <w:tcMar>
               <w:top w:type="dxa" w:w="60"/>
@@ -2220,10 +2228,10 @@
           <w:tcPr>
             <w:tcW w:type="dxa" w:w="2140"/>
             <w:tcBorders>
-              <w:top w:val="single" w:color="B6DFE8" w:sz="4"/>
-              <w:left w:val="single" w:color="B6DFE8" w:sz="4"/>
-              <w:bottom w:val="single" w:color="B6DFE8" w:sz="4"/>
-              <w:right w:val="single" w:color="B6DFE8" w:sz="4"/>
+              <w:top w:val="single" w:color="A6A6A6" w:sz="4"/>
+              <w:left w:val="single" w:color="A6A6A6" w:sz="4"/>
+              <w:bottom w:val="single" w:color="A6A6A6" w:sz="4"/>
+              <w:right w:val="single" w:color="A6A6A6" w:sz="4"/>
             </w:tcBorders>
             <w:tcMar>
               <w:top w:type="dxa" w:w="60"/>
@@ -2248,10 +2256,10 @@
           <w:tcPr>
             <w:tcW w:type="dxa" w:w="2400"/>
             <w:tcBorders>
-              <w:top w:val="single" w:color="B6DFE8" w:sz="4"/>
-              <w:left w:val="single" w:color="B6DFE8" w:sz="4"/>
-              <w:bottom w:val="single" w:color="B6DFE8" w:sz="4"/>
-              <w:right w:val="single" w:color="B6DFE8" w:sz="4"/>
+              <w:top w:val="single" w:color="A6A6A6" w:sz="4"/>
+              <w:left w:val="single" w:color="A6A6A6" w:sz="4"/>
+              <w:bottom w:val="single" w:color="A6A6A6" w:sz="4"/>
+              <w:right w:val="single" w:color="A6A6A6" w:sz="4"/>
             </w:tcBorders>
             <w:tcMar>
               <w:top w:type="dxa" w:w="60"/>
@@ -2276,10 +2284,10 @@
           <w:tcPr>
             <w:tcW w:type="dxa" w:w="2420"/>
             <w:tcBorders>
-              <w:top w:val="single" w:color="B6DFE8" w:sz="4"/>
-              <w:left w:val="single" w:color="B6DFE8" w:sz="4"/>
-              <w:bottom w:val="single" w:color="B6DFE8" w:sz="4"/>
-              <w:right w:val="single" w:color="B6DFE8" w:sz="4"/>
+              <w:top w:val="single" w:color="A6A6A6" w:sz="4"/>
+              <w:left w:val="single" w:color="A6A6A6" w:sz="4"/>
+              <w:bottom w:val="single" w:color="A6A6A6" w:sz="4"/>
+              <w:right w:val="single" w:color="A6A6A6" w:sz="4"/>
             </w:tcBorders>
             <w:tcMar>
               <w:top w:type="dxa" w:w="60"/>
@@ -2304,10 +2312,10 @@
           <w:tcPr>
             <w:tcW w:type="dxa" w:w="2400"/>
             <w:tcBorders>
-              <w:top w:val="single" w:color="B6DFE8" w:sz="4"/>
-              <w:left w:val="single" w:color="B6DFE8" w:sz="4"/>
-              <w:bottom w:val="single" w:color="B6DFE8" w:sz="4"/>
-              <w:right w:val="single" w:color="B6DFE8" w:sz="4"/>
+              <w:top w:val="single" w:color="A6A6A6" w:sz="4"/>
+              <w:left w:val="single" w:color="A6A6A6" w:sz="4"/>
+              <w:bottom w:val="single" w:color="A6A6A6" w:sz="4"/>
+              <w:right w:val="single" w:color="A6A6A6" w:sz="4"/>
             </w:tcBorders>
             <w:tcMar>
               <w:top w:type="dxa" w:w="60"/>
@@ -2334,10 +2342,10 @@
           <w:tcPr>
             <w:tcW w:type="dxa" w:w="2140"/>
             <w:tcBorders>
-              <w:top w:val="single" w:color="B6DFE8" w:sz="4"/>
-              <w:left w:val="single" w:color="B6DFE8" w:sz="4"/>
-              <w:bottom w:val="single" w:color="B6DFE8" w:sz="4"/>
-              <w:right w:val="single" w:color="B6DFE8" w:sz="4"/>
+              <w:top w:val="single" w:color="A6A6A6" w:sz="4"/>
+              <w:left w:val="single" w:color="A6A6A6" w:sz="4"/>
+              <w:bottom w:val="single" w:color="A6A6A6" w:sz="4"/>
+              <w:right w:val="single" w:color="A6A6A6" w:sz="4"/>
             </w:tcBorders>
             <w:tcMar>
               <w:top w:type="dxa" w:w="60"/>
@@ -2362,10 +2370,10 @@
           <w:tcPr>
             <w:tcW w:type="dxa" w:w="2400"/>
             <w:tcBorders>
-              <w:top w:val="single" w:color="B6DFE8" w:sz="4"/>
-              <w:left w:val="single" w:color="B6DFE8" w:sz="4"/>
-              <w:bottom w:val="single" w:color="B6DFE8" w:sz="4"/>
-              <w:right w:val="single" w:color="B6DFE8" w:sz="4"/>
+              <w:top w:val="single" w:color="A6A6A6" w:sz="4"/>
+              <w:left w:val="single" w:color="A6A6A6" w:sz="4"/>
+              <w:bottom w:val="single" w:color="A6A6A6" w:sz="4"/>
+              <w:right w:val="single" w:color="A6A6A6" w:sz="4"/>
             </w:tcBorders>
             <w:tcMar>
               <w:top w:type="dxa" w:w="60"/>
@@ -2390,10 +2398,10 @@
           <w:tcPr>
             <w:tcW w:type="dxa" w:w="2420"/>
             <w:tcBorders>
-              <w:top w:val="single" w:color="B6DFE8" w:sz="4"/>
-              <w:left w:val="single" w:color="B6DFE8" w:sz="4"/>
-              <w:bottom w:val="single" w:color="B6DFE8" w:sz="4"/>
-              <w:right w:val="single" w:color="B6DFE8" w:sz="4"/>
+              <w:top w:val="single" w:color="A6A6A6" w:sz="4"/>
+              <w:left w:val="single" w:color="A6A6A6" w:sz="4"/>
+              <w:bottom w:val="single" w:color="A6A6A6" w:sz="4"/>
+              <w:right w:val="single" w:color="A6A6A6" w:sz="4"/>
             </w:tcBorders>
             <w:tcMar>
               <w:top w:type="dxa" w:w="60"/>
@@ -2418,10 +2426,10 @@
           <w:tcPr>
             <w:tcW w:type="dxa" w:w="2400"/>
             <w:tcBorders>
-              <w:top w:val="single" w:color="B6DFE8" w:sz="4"/>
-              <w:left w:val="single" w:color="B6DFE8" w:sz="4"/>
-              <w:bottom w:val="single" w:color="B6DFE8" w:sz="4"/>
-              <w:right w:val="single" w:color="B6DFE8" w:sz="4"/>
+              <w:top w:val="single" w:color="A6A6A6" w:sz="4"/>
+              <w:left w:val="single" w:color="A6A6A6" w:sz="4"/>
+              <w:bottom w:val="single" w:color="A6A6A6" w:sz="4"/>
+              <w:right w:val="single" w:color="A6A6A6" w:sz="4"/>
             </w:tcBorders>
             <w:tcMar>
               <w:top w:type="dxa" w:w="60"/>
@@ -2448,10 +2456,10 @@
           <w:tcPr>
             <w:tcW w:type="dxa" w:w="2140"/>
             <w:tcBorders>
-              <w:top w:val="single" w:color="B6DFE8" w:sz="4"/>
-              <w:left w:val="single" w:color="B6DFE8" w:sz="4"/>
-              <w:bottom w:val="single" w:color="B6DFE8" w:sz="4"/>
-              <w:right w:val="single" w:color="B6DFE8" w:sz="4"/>
+              <w:top w:val="single" w:color="A6A6A6" w:sz="4"/>
+              <w:left w:val="single" w:color="A6A6A6" w:sz="4"/>
+              <w:bottom w:val="single" w:color="A6A6A6" w:sz="4"/>
+              <w:right w:val="single" w:color="A6A6A6" w:sz="4"/>
             </w:tcBorders>
             <w:tcMar>
               <w:top w:type="dxa" w:w="60"/>
@@ -2476,10 +2484,10 @@
           <w:tcPr>
             <w:tcW w:type="dxa" w:w="2400"/>
             <w:tcBorders>
-              <w:top w:val="single" w:color="B6DFE8" w:sz="4"/>
-              <w:left w:val="single" w:color="B6DFE8" w:sz="4"/>
-              <w:bottom w:val="single" w:color="B6DFE8" w:sz="4"/>
-              <w:right w:val="single" w:color="B6DFE8" w:sz="4"/>
+              <w:top w:val="single" w:color="A6A6A6" w:sz="4"/>
+              <w:left w:val="single" w:color="A6A6A6" w:sz="4"/>
+              <w:bottom w:val="single" w:color="A6A6A6" w:sz="4"/>
+              <w:right w:val="single" w:color="A6A6A6" w:sz="4"/>
             </w:tcBorders>
             <w:tcMar>
               <w:top w:type="dxa" w:w="60"/>
@@ -2504,10 +2512,10 @@
           <w:tcPr>
             <w:tcW w:type="dxa" w:w="2420"/>
             <w:tcBorders>
-              <w:top w:val="single" w:color="B6DFE8" w:sz="4"/>
-              <w:left w:val="single" w:color="B6DFE8" w:sz="4"/>
-              <w:bottom w:val="single" w:color="B6DFE8" w:sz="4"/>
-              <w:right w:val="single" w:color="B6DFE8" w:sz="4"/>
+              <w:top w:val="single" w:color="A6A6A6" w:sz="4"/>
+              <w:left w:val="single" w:color="A6A6A6" w:sz="4"/>
+              <w:bottom w:val="single" w:color="A6A6A6" w:sz="4"/>
+              <w:right w:val="single" w:color="A6A6A6" w:sz="4"/>
             </w:tcBorders>
             <w:tcMar>
               <w:top w:type="dxa" w:w="60"/>
@@ -2532,10 +2540,10 @@
           <w:tcPr>
             <w:tcW w:type="dxa" w:w="2400"/>
             <w:tcBorders>
-              <w:top w:val="single" w:color="B6DFE8" w:sz="4"/>
-              <w:left w:val="single" w:color="B6DFE8" w:sz="4"/>
-              <w:bottom w:val="single" w:color="B6DFE8" w:sz="4"/>
-              <w:right w:val="single" w:color="B6DFE8" w:sz="4"/>
+              <w:top w:val="single" w:color="A6A6A6" w:sz="4"/>
+              <w:left w:val="single" w:color="A6A6A6" w:sz="4"/>
+              <w:bottom w:val="single" w:color="A6A6A6" w:sz="4"/>
+              <w:right w:val="single" w:color="A6A6A6" w:sz="4"/>
             </w:tcBorders>
             <w:tcMar>
               <w:top w:type="dxa" w:w="60"/>
@@ -2562,10 +2570,10 @@
           <w:tcPr>
             <w:tcW w:type="dxa" w:w="2140"/>
             <w:tcBorders>
-              <w:top w:val="single" w:color="B6DFE8" w:sz="4"/>
-              <w:left w:val="single" w:color="B6DFE8" w:sz="4"/>
-              <w:bottom w:val="single" w:color="B6DFE8" w:sz="4"/>
-              <w:right w:val="single" w:color="B6DFE8" w:sz="4"/>
+              <w:top w:val="single" w:color="A6A6A6" w:sz="4"/>
+              <w:left w:val="single" w:color="A6A6A6" w:sz="4"/>
+              <w:bottom w:val="single" w:color="A6A6A6" w:sz="4"/>
+              <w:right w:val="single" w:color="A6A6A6" w:sz="4"/>
             </w:tcBorders>
             <w:tcMar>
               <w:top w:type="dxa" w:w="60"/>
@@ -2590,10 +2598,10 @@
           <w:tcPr>
             <w:tcW w:type="dxa" w:w="2400"/>
             <w:tcBorders>
-              <w:top w:val="single" w:color="B6DFE8" w:sz="4"/>
-              <w:left w:val="single" w:color="B6DFE8" w:sz="4"/>
-              <w:bottom w:val="single" w:color="B6DFE8" w:sz="4"/>
-              <w:right w:val="single" w:color="B6DFE8" w:sz="4"/>
+              <w:top w:val="single" w:color="A6A6A6" w:sz="4"/>
+              <w:left w:val="single" w:color="A6A6A6" w:sz="4"/>
+              <w:bottom w:val="single" w:color="A6A6A6" w:sz="4"/>
+              <w:right w:val="single" w:color="A6A6A6" w:sz="4"/>
             </w:tcBorders>
             <w:tcMar>
               <w:top w:type="dxa" w:w="60"/>
@@ -2618,10 +2626,10 @@
           <w:tcPr>
             <w:tcW w:type="dxa" w:w="2420"/>
             <w:tcBorders>
-              <w:top w:val="single" w:color="B6DFE8" w:sz="4"/>
-              <w:left w:val="single" w:color="B6DFE8" w:sz="4"/>
-              <w:bottom w:val="single" w:color="B6DFE8" w:sz="4"/>
-              <w:right w:val="single" w:color="B6DFE8" w:sz="4"/>
+              <w:top w:val="single" w:color="A6A6A6" w:sz="4"/>
+              <w:left w:val="single" w:color="A6A6A6" w:sz="4"/>
+              <w:bottom w:val="single" w:color="A6A6A6" w:sz="4"/>
+              <w:right w:val="single" w:color="A6A6A6" w:sz="4"/>
             </w:tcBorders>
             <w:tcMar>
               <w:top w:type="dxa" w:w="60"/>
@@ -2646,10 +2654,10 @@
           <w:tcPr>
             <w:tcW w:type="dxa" w:w="2400"/>
             <w:tcBorders>
-              <w:top w:val="single" w:color="B6DFE8" w:sz="4"/>
-              <w:left w:val="single" w:color="B6DFE8" w:sz="4"/>
-              <w:bottom w:val="single" w:color="B6DFE8" w:sz="4"/>
-              <w:right w:val="single" w:color="B6DFE8" w:sz="4"/>
+              <w:top w:val="single" w:color="A6A6A6" w:sz="4"/>
+              <w:left w:val="single" w:color="A6A6A6" w:sz="4"/>
+              <w:bottom w:val="single" w:color="A6A6A6" w:sz="4"/>
+              <w:right w:val="single" w:color="A6A6A6" w:sz="4"/>
             </w:tcBorders>
             <w:tcMar>
               <w:top w:type="dxa" w:w="60"/>
@@ -2676,10 +2684,10 @@
           <w:tcPr>
             <w:tcW w:type="dxa" w:w="2140"/>
             <w:tcBorders>
-              <w:top w:val="single" w:color="B6DFE8" w:sz="4"/>
-              <w:left w:val="single" w:color="B6DFE8" w:sz="4"/>
-              <w:bottom w:val="single" w:color="B6DFE8" w:sz="4"/>
-              <w:right w:val="single" w:color="B6DFE8" w:sz="4"/>
+              <w:top w:val="single" w:color="A6A6A6" w:sz="4"/>
+              <w:left w:val="single" w:color="A6A6A6" w:sz="4"/>
+              <w:bottom w:val="single" w:color="A6A6A6" w:sz="4"/>
+              <w:right w:val="single" w:color="A6A6A6" w:sz="4"/>
             </w:tcBorders>
             <w:tcMar>
               <w:top w:type="dxa" w:w="60"/>
@@ -2704,10 +2712,10 @@
           <w:tcPr>
             <w:tcW w:type="dxa" w:w="2400"/>
             <w:tcBorders>
-              <w:top w:val="single" w:color="B6DFE8" w:sz="4"/>
-              <w:left w:val="single" w:color="B6DFE8" w:sz="4"/>
-              <w:bottom w:val="single" w:color="B6DFE8" w:sz="4"/>
-              <w:right w:val="single" w:color="B6DFE8" w:sz="4"/>
+              <w:top w:val="single" w:color="A6A6A6" w:sz="4"/>
+              <w:left w:val="single" w:color="A6A6A6" w:sz="4"/>
+              <w:bottom w:val="single" w:color="A6A6A6" w:sz="4"/>
+              <w:right w:val="single" w:color="A6A6A6" w:sz="4"/>
             </w:tcBorders>
             <w:tcMar>
               <w:top w:type="dxa" w:w="60"/>
@@ -2732,10 +2740,10 @@
           <w:tcPr>
             <w:tcW w:type="dxa" w:w="2420"/>
             <w:tcBorders>
-              <w:top w:val="single" w:color="B6DFE8" w:sz="4"/>
-              <w:left w:val="single" w:color="B6DFE8" w:sz="4"/>
-              <w:bottom w:val="single" w:color="B6DFE8" w:sz="4"/>
-              <w:right w:val="single" w:color="B6DFE8" w:sz="4"/>
+              <w:top w:val="single" w:color="A6A6A6" w:sz="4"/>
+              <w:left w:val="single" w:color="A6A6A6" w:sz="4"/>
+              <w:bottom w:val="single" w:color="A6A6A6" w:sz="4"/>
+              <w:right w:val="single" w:color="A6A6A6" w:sz="4"/>
             </w:tcBorders>
             <w:tcMar>
               <w:top w:type="dxa" w:w="60"/>
@@ -2760,10 +2768,10 @@
           <w:tcPr>
             <w:tcW w:type="dxa" w:w="2400"/>
             <w:tcBorders>
-              <w:top w:val="single" w:color="B6DFE8" w:sz="4"/>
-              <w:left w:val="single" w:color="B6DFE8" w:sz="4"/>
-              <w:bottom w:val="single" w:color="B6DFE8" w:sz="4"/>
-              <w:right w:val="single" w:color="B6DFE8" w:sz="4"/>
+              <w:top w:val="single" w:color="A6A6A6" w:sz="4"/>
+              <w:left w:val="single" w:color="A6A6A6" w:sz="4"/>
+              <w:bottom w:val="single" w:color="A6A6A6" w:sz="4"/>
+              <w:right w:val="single" w:color="A6A6A6" w:sz="4"/>
             </w:tcBorders>
             <w:tcMar>
               <w:top w:type="dxa" w:w="60"/>
@@ -2790,10 +2798,10 @@
           <w:tcPr>
             <w:tcW w:type="dxa" w:w="2140"/>
             <w:tcBorders>
-              <w:top w:val="single" w:color="B6DFE8" w:sz="4"/>
-              <w:left w:val="single" w:color="B6DFE8" w:sz="4"/>
-              <w:bottom w:val="single" w:color="B6DFE8" w:sz="4"/>
-              <w:right w:val="single" w:color="B6DFE8" w:sz="4"/>
+              <w:top w:val="single" w:color="A6A6A6" w:sz="4"/>
+              <w:left w:val="single" w:color="A6A6A6" w:sz="4"/>
+              <w:bottom w:val="single" w:color="A6A6A6" w:sz="4"/>
+              <w:right w:val="single" w:color="A6A6A6" w:sz="4"/>
             </w:tcBorders>
             <w:tcMar>
               <w:top w:type="dxa" w:w="60"/>
@@ -2818,10 +2826,10 @@
           <w:tcPr>
             <w:tcW w:type="dxa" w:w="2400"/>
             <w:tcBorders>
-              <w:top w:val="single" w:color="B6DFE8" w:sz="4"/>
-              <w:left w:val="single" w:color="B6DFE8" w:sz="4"/>
-              <w:bottom w:val="single" w:color="B6DFE8" w:sz="4"/>
-              <w:right w:val="single" w:color="B6DFE8" w:sz="4"/>
+              <w:top w:val="single" w:color="A6A6A6" w:sz="4"/>
+              <w:left w:val="single" w:color="A6A6A6" w:sz="4"/>
+              <w:bottom w:val="single" w:color="A6A6A6" w:sz="4"/>
+              <w:right w:val="single" w:color="A6A6A6" w:sz="4"/>
             </w:tcBorders>
             <w:tcMar>
               <w:top w:type="dxa" w:w="60"/>
@@ -2846,10 +2854,10 @@
           <w:tcPr>
             <w:tcW w:type="dxa" w:w="2420"/>
             <w:tcBorders>
-              <w:top w:val="single" w:color="B6DFE8" w:sz="4"/>
-              <w:left w:val="single" w:color="B6DFE8" w:sz="4"/>
-              <w:bottom w:val="single" w:color="B6DFE8" w:sz="4"/>
-              <w:right w:val="single" w:color="B6DFE8" w:sz="4"/>
+              <w:top w:val="single" w:color="A6A6A6" w:sz="4"/>
+              <w:left w:val="single" w:color="A6A6A6" w:sz="4"/>
+              <w:bottom w:val="single" w:color="A6A6A6" w:sz="4"/>
+              <w:right w:val="single" w:color="A6A6A6" w:sz="4"/>
             </w:tcBorders>
             <w:tcMar>
               <w:top w:type="dxa" w:w="60"/>
@@ -2874,10 +2882,10 @@
           <w:tcPr>
             <w:tcW w:type="dxa" w:w="2400"/>
             <w:tcBorders>
-              <w:top w:val="single" w:color="B6DFE8" w:sz="4"/>
-              <w:left w:val="single" w:color="B6DFE8" w:sz="4"/>
-              <w:bottom w:val="single" w:color="B6DFE8" w:sz="4"/>
-              <w:right w:val="single" w:color="B6DFE8" w:sz="4"/>
+              <w:top w:val="single" w:color="A6A6A6" w:sz="4"/>
+              <w:left w:val="single" w:color="A6A6A6" w:sz="4"/>
+              <w:bottom w:val="single" w:color="A6A6A6" w:sz="4"/>
+              <w:right w:val="single" w:color="A6A6A6" w:sz="4"/>
             </w:tcBorders>
             <w:tcMar>
               <w:top w:type="dxa" w:w="60"/>
@@ -2904,10 +2912,10 @@
           <w:tcPr>
             <w:tcW w:type="dxa" w:w="2140"/>
             <w:tcBorders>
-              <w:top w:val="single" w:color="B6DFE8" w:sz="4"/>
-              <w:left w:val="single" w:color="B6DFE8" w:sz="4"/>
-              <w:bottom w:val="single" w:color="B6DFE8" w:sz="4"/>
-              <w:right w:val="single" w:color="B6DFE8" w:sz="4"/>
+              <w:top w:val="single" w:color="A6A6A6" w:sz="4"/>
+              <w:left w:val="single" w:color="A6A6A6" w:sz="4"/>
+              <w:bottom w:val="single" w:color="A6A6A6" w:sz="4"/>
+              <w:right w:val="single" w:color="A6A6A6" w:sz="4"/>
             </w:tcBorders>
             <w:tcMar>
               <w:top w:type="dxa" w:w="60"/>
@@ -2932,10 +2940,10 @@
           <w:tcPr>
             <w:tcW w:type="dxa" w:w="2400"/>
             <w:tcBorders>
-              <w:top w:val="single" w:color="B6DFE8" w:sz="4"/>
-              <w:left w:val="single" w:color="B6DFE8" w:sz="4"/>
-              <w:bottom w:val="single" w:color="B6DFE8" w:sz="4"/>
-              <w:right w:val="single" w:color="B6DFE8" w:sz="4"/>
+              <w:top w:val="single" w:color="A6A6A6" w:sz="4"/>
+              <w:left w:val="single" w:color="A6A6A6" w:sz="4"/>
+              <w:bottom w:val="single" w:color="A6A6A6" w:sz="4"/>
+              <w:right w:val="single" w:color="A6A6A6" w:sz="4"/>
             </w:tcBorders>
             <w:tcMar>
               <w:top w:type="dxa" w:w="60"/>
@@ -2960,10 +2968,10 @@
           <w:tcPr>
             <w:tcW w:type="dxa" w:w="2420"/>
             <w:tcBorders>
-              <w:top w:val="single" w:color="B6DFE8" w:sz="4"/>
-              <w:left w:val="single" w:color="B6DFE8" w:sz="4"/>
-              <w:bottom w:val="single" w:color="B6DFE8" w:sz="4"/>
-              <w:right w:val="single" w:color="B6DFE8" w:sz="4"/>
+              <w:top w:val="single" w:color="A6A6A6" w:sz="4"/>
+              <w:left w:val="single" w:color="A6A6A6" w:sz="4"/>
+              <w:bottom w:val="single" w:color="A6A6A6" w:sz="4"/>
+              <w:right w:val="single" w:color="A6A6A6" w:sz="4"/>
             </w:tcBorders>
             <w:tcMar>
               <w:top w:type="dxa" w:w="60"/>
@@ -2988,10 +2996,10 @@
           <w:tcPr>
             <w:tcW w:type="dxa" w:w="2400"/>
             <w:tcBorders>
-              <w:top w:val="single" w:color="B6DFE8" w:sz="4"/>
-              <w:left w:val="single" w:color="B6DFE8" w:sz="4"/>
-              <w:bottom w:val="single" w:color="B6DFE8" w:sz="4"/>
-              <w:right w:val="single" w:color="B6DFE8" w:sz="4"/>
+              <w:top w:val="single" w:color="A6A6A6" w:sz="4"/>
+              <w:left w:val="single" w:color="A6A6A6" w:sz="4"/>
+              <w:bottom w:val="single" w:color="A6A6A6" w:sz="4"/>
+              <w:right w:val="single" w:color="A6A6A6" w:sz="4"/>
             </w:tcBorders>
             <w:tcMar>
               <w:top w:type="dxa" w:w="60"/>
@@ -3149,12 +3157,12 @@
           <w:tcPr>
             <w:tcW w:type="dxa" w:w="1600"/>
             <w:tcBorders>
-              <w:top w:val="single" w:color="B6DFE8" w:sz="4"/>
-              <w:left w:val="single" w:color="B6DFE8" w:sz="4"/>
-              <w:bottom w:val="single" w:color="B6DFE8" w:sz="4"/>
-              <w:right w:val="single" w:color="B6DFE8" w:sz="4"/>
-            </w:tcBorders>
-            <w:shd w:fill="CFFAFE" w:val="clear"/>
+              <w:top w:val="single" w:color="A6A6A6" w:sz="4"/>
+              <w:left w:val="single" w:color="A6A6A6" w:sz="4"/>
+              <w:bottom w:val="single" w:color="A6A6A6" w:sz="4"/>
+              <w:right w:val="single" w:color="A6A6A6" w:sz="4"/>
+            </w:tcBorders>
+            <w:shd w:fill="E7E6E6" w:val="clear"/>
             <w:tcMar>
               <w:top w:type="dxa" w:w="60"/>
               <w:left w:type="dxa" w:w="100"/>
@@ -3167,7 +3175,7 @@
               <w:rPr>
                 <w:b/>
                 <w:bCs/>
-                <w:color w:val="0E7490"/>
+                <w:color w:val="000000"/>
                 <w:sz w:val="19"/>
                 <w:szCs w:val="19"/>
               </w:rPr>
@@ -3179,12 +3187,12 @@
           <w:tcPr>
             <w:tcW w:type="dxa" w:w="2300"/>
             <w:tcBorders>
-              <w:top w:val="single" w:color="B6DFE8" w:sz="4"/>
-              <w:left w:val="single" w:color="B6DFE8" w:sz="4"/>
-              <w:bottom w:val="single" w:color="B6DFE8" w:sz="4"/>
-              <w:right w:val="single" w:color="B6DFE8" w:sz="4"/>
-            </w:tcBorders>
-            <w:shd w:fill="CFFAFE" w:val="clear"/>
+              <w:top w:val="single" w:color="A6A6A6" w:sz="4"/>
+              <w:left w:val="single" w:color="A6A6A6" w:sz="4"/>
+              <w:bottom w:val="single" w:color="A6A6A6" w:sz="4"/>
+              <w:right w:val="single" w:color="A6A6A6" w:sz="4"/>
+            </w:tcBorders>
+            <w:shd w:fill="E7E6E6" w:val="clear"/>
             <w:tcMar>
               <w:top w:type="dxa" w:w="60"/>
               <w:left w:type="dxa" w:w="100"/>
@@ -3197,7 +3205,7 @@
               <w:rPr>
                 <w:b/>
                 <w:bCs/>
-                <w:color w:val="0E7490"/>
+                <w:color w:val="000000"/>
                 <w:sz w:val="19"/>
                 <w:szCs w:val="19"/>
               </w:rPr>
@@ -3209,12 +3217,12 @@
           <w:tcPr>
             <w:tcW w:type="dxa" w:w="2400"/>
             <w:tcBorders>
-              <w:top w:val="single" w:color="B6DFE8" w:sz="4"/>
-              <w:left w:val="single" w:color="B6DFE8" w:sz="4"/>
-              <w:bottom w:val="single" w:color="B6DFE8" w:sz="4"/>
-              <w:right w:val="single" w:color="B6DFE8" w:sz="4"/>
-            </w:tcBorders>
-            <w:shd w:fill="CFFAFE" w:val="clear"/>
+              <w:top w:val="single" w:color="A6A6A6" w:sz="4"/>
+              <w:left w:val="single" w:color="A6A6A6" w:sz="4"/>
+              <w:bottom w:val="single" w:color="A6A6A6" w:sz="4"/>
+              <w:right w:val="single" w:color="A6A6A6" w:sz="4"/>
+            </w:tcBorders>
+            <w:shd w:fill="E7E6E6" w:val="clear"/>
             <w:tcMar>
               <w:top w:type="dxa" w:w="60"/>
               <w:left w:type="dxa" w:w="100"/>
@@ -3227,7 +3235,7 @@
               <w:rPr>
                 <w:b/>
                 <w:bCs/>
-                <w:color w:val="0E7490"/>
+                <w:color w:val="000000"/>
                 <w:sz w:val="19"/>
                 <w:szCs w:val="19"/>
               </w:rPr>
@@ -3239,12 +3247,12 @@
           <w:tcPr>
             <w:tcW w:type="dxa" w:w="3060"/>
             <w:tcBorders>
-              <w:top w:val="single" w:color="B6DFE8" w:sz="4"/>
-              <w:left w:val="single" w:color="B6DFE8" w:sz="4"/>
-              <w:bottom w:val="single" w:color="B6DFE8" w:sz="4"/>
-              <w:right w:val="single" w:color="B6DFE8" w:sz="4"/>
-            </w:tcBorders>
-            <w:shd w:fill="CFFAFE" w:val="clear"/>
+              <w:top w:val="single" w:color="A6A6A6" w:sz="4"/>
+              <w:left w:val="single" w:color="A6A6A6" w:sz="4"/>
+              <w:bottom w:val="single" w:color="A6A6A6" w:sz="4"/>
+              <w:right w:val="single" w:color="A6A6A6" w:sz="4"/>
+            </w:tcBorders>
+            <w:shd w:fill="E7E6E6" w:val="clear"/>
             <w:tcMar>
               <w:top w:type="dxa" w:w="60"/>
               <w:left w:type="dxa" w:w="100"/>
@@ -3257,7 +3265,7 @@
               <w:rPr>
                 <w:b/>
                 <w:bCs/>
-                <w:color w:val="0E7490"/>
+                <w:color w:val="000000"/>
                 <w:sz w:val="19"/>
                 <w:szCs w:val="19"/>
               </w:rPr>
@@ -3271,10 +3279,10 @@
           <w:tcPr>
             <w:tcW w:type="dxa" w:w="1600"/>
             <w:tcBorders>
-              <w:top w:val="single" w:color="B6DFE8" w:sz="4"/>
-              <w:left w:val="single" w:color="B6DFE8" w:sz="4"/>
-              <w:bottom w:val="single" w:color="B6DFE8" w:sz="4"/>
-              <w:right w:val="single" w:color="B6DFE8" w:sz="4"/>
+              <w:top w:val="single" w:color="A6A6A6" w:sz="4"/>
+              <w:left w:val="single" w:color="A6A6A6" w:sz="4"/>
+              <w:bottom w:val="single" w:color="A6A6A6" w:sz="4"/>
+              <w:right w:val="single" w:color="A6A6A6" w:sz="4"/>
             </w:tcBorders>
             <w:tcMar>
               <w:top w:type="dxa" w:w="60"/>
@@ -3299,10 +3307,10 @@
           <w:tcPr>
             <w:tcW w:type="dxa" w:w="2300"/>
             <w:tcBorders>
-              <w:top w:val="single" w:color="B6DFE8" w:sz="4"/>
-              <w:left w:val="single" w:color="B6DFE8" w:sz="4"/>
-              <w:bottom w:val="single" w:color="B6DFE8" w:sz="4"/>
-              <w:right w:val="single" w:color="B6DFE8" w:sz="4"/>
+              <w:top w:val="single" w:color="A6A6A6" w:sz="4"/>
+              <w:left w:val="single" w:color="A6A6A6" w:sz="4"/>
+              <w:bottom w:val="single" w:color="A6A6A6" w:sz="4"/>
+              <w:right w:val="single" w:color="A6A6A6" w:sz="4"/>
             </w:tcBorders>
             <w:tcMar>
               <w:top w:type="dxa" w:w="60"/>
@@ -3327,10 +3335,10 @@
           <w:tcPr>
             <w:tcW w:type="dxa" w:w="2400"/>
             <w:tcBorders>
-              <w:top w:val="single" w:color="B6DFE8" w:sz="4"/>
-              <w:left w:val="single" w:color="B6DFE8" w:sz="4"/>
-              <w:bottom w:val="single" w:color="B6DFE8" w:sz="4"/>
-              <w:right w:val="single" w:color="B6DFE8" w:sz="4"/>
+              <w:top w:val="single" w:color="A6A6A6" w:sz="4"/>
+              <w:left w:val="single" w:color="A6A6A6" w:sz="4"/>
+              <w:bottom w:val="single" w:color="A6A6A6" w:sz="4"/>
+              <w:right w:val="single" w:color="A6A6A6" w:sz="4"/>
             </w:tcBorders>
             <w:tcMar>
               <w:top w:type="dxa" w:w="60"/>
@@ -3355,10 +3363,10 @@
           <w:tcPr>
             <w:tcW w:type="dxa" w:w="3060"/>
             <w:tcBorders>
-              <w:top w:val="single" w:color="B6DFE8" w:sz="4"/>
-              <w:left w:val="single" w:color="B6DFE8" w:sz="4"/>
-              <w:bottom w:val="single" w:color="B6DFE8" w:sz="4"/>
-              <w:right w:val="single" w:color="B6DFE8" w:sz="4"/>
+              <w:top w:val="single" w:color="A6A6A6" w:sz="4"/>
+              <w:left w:val="single" w:color="A6A6A6" w:sz="4"/>
+              <w:bottom w:val="single" w:color="A6A6A6" w:sz="4"/>
+              <w:right w:val="single" w:color="A6A6A6" w:sz="4"/>
             </w:tcBorders>
             <w:tcMar>
               <w:top w:type="dxa" w:w="60"/>
@@ -3385,10 +3393,10 @@
           <w:tcPr>
             <w:tcW w:type="dxa" w:w="1600"/>
             <w:tcBorders>
-              <w:top w:val="single" w:color="B6DFE8" w:sz="4"/>
-              <w:left w:val="single" w:color="B6DFE8" w:sz="4"/>
-              <w:bottom w:val="single" w:color="B6DFE8" w:sz="4"/>
-              <w:right w:val="single" w:color="B6DFE8" w:sz="4"/>
+              <w:top w:val="single" w:color="A6A6A6" w:sz="4"/>
+              <w:left w:val="single" w:color="A6A6A6" w:sz="4"/>
+              <w:bottom w:val="single" w:color="A6A6A6" w:sz="4"/>
+              <w:right w:val="single" w:color="A6A6A6" w:sz="4"/>
             </w:tcBorders>
             <w:tcMar>
               <w:top w:type="dxa" w:w="60"/>
@@ -3413,10 +3421,10 @@
           <w:tcPr>
             <w:tcW w:type="dxa" w:w="2300"/>
             <w:tcBorders>
-              <w:top w:val="single" w:color="B6DFE8" w:sz="4"/>
-              <w:left w:val="single" w:color="B6DFE8" w:sz="4"/>
-              <w:bottom w:val="single" w:color="B6DFE8" w:sz="4"/>
-              <w:right w:val="single" w:color="B6DFE8" w:sz="4"/>
+              <w:top w:val="single" w:color="A6A6A6" w:sz="4"/>
+              <w:left w:val="single" w:color="A6A6A6" w:sz="4"/>
+              <w:bottom w:val="single" w:color="A6A6A6" w:sz="4"/>
+              <w:right w:val="single" w:color="A6A6A6" w:sz="4"/>
             </w:tcBorders>
             <w:tcMar>
               <w:top w:type="dxa" w:w="60"/>
@@ -3441,10 +3449,10 @@
           <w:tcPr>
             <w:tcW w:type="dxa" w:w="2400"/>
             <w:tcBorders>
-              <w:top w:val="single" w:color="B6DFE8" w:sz="4"/>
-              <w:left w:val="single" w:color="B6DFE8" w:sz="4"/>
-              <w:bottom w:val="single" w:color="B6DFE8" w:sz="4"/>
-              <w:right w:val="single" w:color="B6DFE8" w:sz="4"/>
+              <w:top w:val="single" w:color="A6A6A6" w:sz="4"/>
+              <w:left w:val="single" w:color="A6A6A6" w:sz="4"/>
+              <w:bottom w:val="single" w:color="A6A6A6" w:sz="4"/>
+              <w:right w:val="single" w:color="A6A6A6" w:sz="4"/>
             </w:tcBorders>
             <w:tcMar>
               <w:top w:type="dxa" w:w="60"/>
@@ -3469,10 +3477,10 @@
           <w:tcPr>
             <w:tcW w:type="dxa" w:w="3060"/>
             <w:tcBorders>
-              <w:top w:val="single" w:color="B6DFE8" w:sz="4"/>
-              <w:left w:val="single" w:color="B6DFE8" w:sz="4"/>
-              <w:bottom w:val="single" w:color="B6DFE8" w:sz="4"/>
-              <w:right w:val="single" w:color="B6DFE8" w:sz="4"/>
+              <w:top w:val="single" w:color="A6A6A6" w:sz="4"/>
+              <w:left w:val="single" w:color="A6A6A6" w:sz="4"/>
+              <w:bottom w:val="single" w:color="A6A6A6" w:sz="4"/>
+              <w:right w:val="single" w:color="A6A6A6" w:sz="4"/>
             </w:tcBorders>
             <w:tcMar>
               <w:top w:type="dxa" w:w="60"/>
@@ -3499,10 +3507,10 @@
           <w:tcPr>
             <w:tcW w:type="dxa" w:w="1600"/>
             <w:tcBorders>
-              <w:top w:val="single" w:color="B6DFE8" w:sz="4"/>
-              <w:left w:val="single" w:color="B6DFE8" w:sz="4"/>
-              <w:bottom w:val="single" w:color="B6DFE8" w:sz="4"/>
-              <w:right w:val="single" w:color="B6DFE8" w:sz="4"/>
+              <w:top w:val="single" w:color="A6A6A6" w:sz="4"/>
+              <w:left w:val="single" w:color="A6A6A6" w:sz="4"/>
+              <w:bottom w:val="single" w:color="A6A6A6" w:sz="4"/>
+              <w:right w:val="single" w:color="A6A6A6" w:sz="4"/>
             </w:tcBorders>
             <w:tcMar>
               <w:top w:type="dxa" w:w="60"/>
@@ -3527,10 +3535,10 @@
           <w:tcPr>
             <w:tcW w:type="dxa" w:w="2300"/>
             <w:tcBorders>
-              <w:top w:val="single" w:color="B6DFE8" w:sz="4"/>
-              <w:left w:val="single" w:color="B6DFE8" w:sz="4"/>
-              <w:bottom w:val="single" w:color="B6DFE8" w:sz="4"/>
-              <w:right w:val="single" w:color="B6DFE8" w:sz="4"/>
+              <w:top w:val="single" w:color="A6A6A6" w:sz="4"/>
+              <w:left w:val="single" w:color="A6A6A6" w:sz="4"/>
+              <w:bottom w:val="single" w:color="A6A6A6" w:sz="4"/>
+              <w:right w:val="single" w:color="A6A6A6" w:sz="4"/>
             </w:tcBorders>
             <w:tcMar>
               <w:top w:type="dxa" w:w="60"/>
@@ -3555,10 +3563,10 @@
           <w:tcPr>
             <w:tcW w:type="dxa" w:w="2400"/>
             <w:tcBorders>
-              <w:top w:val="single" w:color="B6DFE8" w:sz="4"/>
-              <w:left w:val="single" w:color="B6DFE8" w:sz="4"/>
-              <w:bottom w:val="single" w:color="B6DFE8" w:sz="4"/>
-              <w:right w:val="single" w:color="B6DFE8" w:sz="4"/>
+              <w:top w:val="single" w:color="A6A6A6" w:sz="4"/>
+              <w:left w:val="single" w:color="A6A6A6" w:sz="4"/>
+              <w:bottom w:val="single" w:color="A6A6A6" w:sz="4"/>
+              <w:right w:val="single" w:color="A6A6A6" w:sz="4"/>
             </w:tcBorders>
             <w:tcMar>
               <w:top w:type="dxa" w:w="60"/>
@@ -3583,10 +3591,10 @@
           <w:tcPr>
             <w:tcW w:type="dxa" w:w="3060"/>
             <w:tcBorders>
-              <w:top w:val="single" w:color="B6DFE8" w:sz="4"/>
-              <w:left w:val="single" w:color="B6DFE8" w:sz="4"/>
-              <w:bottom w:val="single" w:color="B6DFE8" w:sz="4"/>
-              <w:right w:val="single" w:color="B6DFE8" w:sz="4"/>
+              <w:top w:val="single" w:color="A6A6A6" w:sz="4"/>
+              <w:left w:val="single" w:color="A6A6A6" w:sz="4"/>
+              <w:bottom w:val="single" w:color="A6A6A6" w:sz="4"/>
+              <w:right w:val="single" w:color="A6A6A6" w:sz="4"/>
             </w:tcBorders>
             <w:tcMar>
               <w:top w:type="dxa" w:w="60"/>
@@ -3613,10 +3621,10 @@
           <w:tcPr>
             <w:tcW w:type="dxa" w:w="1600"/>
             <w:tcBorders>
-              <w:top w:val="single" w:color="B6DFE8" w:sz="4"/>
-              <w:left w:val="single" w:color="B6DFE8" w:sz="4"/>
-              <w:bottom w:val="single" w:color="B6DFE8" w:sz="4"/>
-              <w:right w:val="single" w:color="B6DFE8" w:sz="4"/>
+              <w:top w:val="single" w:color="A6A6A6" w:sz="4"/>
+              <w:left w:val="single" w:color="A6A6A6" w:sz="4"/>
+              <w:bottom w:val="single" w:color="A6A6A6" w:sz="4"/>
+              <w:right w:val="single" w:color="A6A6A6" w:sz="4"/>
             </w:tcBorders>
             <w:tcMar>
               <w:top w:type="dxa" w:w="60"/>
@@ -3641,10 +3649,10 @@
           <w:tcPr>
             <w:tcW w:type="dxa" w:w="2300"/>
             <w:tcBorders>
-              <w:top w:val="single" w:color="B6DFE8" w:sz="4"/>
-              <w:left w:val="single" w:color="B6DFE8" w:sz="4"/>
-              <w:bottom w:val="single" w:color="B6DFE8" w:sz="4"/>
-              <w:right w:val="single" w:color="B6DFE8" w:sz="4"/>
+              <w:top w:val="single" w:color="A6A6A6" w:sz="4"/>
+              <w:left w:val="single" w:color="A6A6A6" w:sz="4"/>
+              <w:bottom w:val="single" w:color="A6A6A6" w:sz="4"/>
+              <w:right w:val="single" w:color="A6A6A6" w:sz="4"/>
             </w:tcBorders>
             <w:tcMar>
               <w:top w:type="dxa" w:w="60"/>
@@ -3669,10 +3677,10 @@
           <w:tcPr>
             <w:tcW w:type="dxa" w:w="2400"/>
             <w:tcBorders>
-              <w:top w:val="single" w:color="B6DFE8" w:sz="4"/>
-              <w:left w:val="single" w:color="B6DFE8" w:sz="4"/>
-              <w:bottom w:val="single" w:color="B6DFE8" w:sz="4"/>
-              <w:right w:val="single" w:color="B6DFE8" w:sz="4"/>
+              <w:top w:val="single" w:color="A6A6A6" w:sz="4"/>
+              <w:left w:val="single" w:color="A6A6A6" w:sz="4"/>
+              <w:bottom w:val="single" w:color="A6A6A6" w:sz="4"/>
+              <w:right w:val="single" w:color="A6A6A6" w:sz="4"/>
             </w:tcBorders>
             <w:tcMar>
               <w:top w:type="dxa" w:w="60"/>
@@ -3697,10 +3705,10 @@
           <w:tcPr>
             <w:tcW w:type="dxa" w:w="3060"/>
             <w:tcBorders>
-              <w:top w:val="single" w:color="B6DFE8" w:sz="4"/>
-              <w:left w:val="single" w:color="B6DFE8" w:sz="4"/>
-              <w:bottom w:val="single" w:color="B6DFE8" w:sz="4"/>
-              <w:right w:val="single" w:color="B6DFE8" w:sz="4"/>
+              <w:top w:val="single" w:color="A6A6A6" w:sz="4"/>
+              <w:left w:val="single" w:color="A6A6A6" w:sz="4"/>
+              <w:bottom w:val="single" w:color="A6A6A6" w:sz="4"/>
+              <w:right w:val="single" w:color="A6A6A6" w:sz="4"/>
             </w:tcBorders>
             <w:tcMar>
               <w:top w:type="dxa" w:w="60"/>
@@ -3869,7 +3877,7 @@
         <w:rPr>
           <w:b/>
           <w:bCs/>
-          <w:color w:val="4B8A99"/>
+          <w:color w:val="000000"/>
           <w:sz w:val="18"/>
           <w:szCs w:val="18"/>
         </w:rPr>
@@ -3879,7 +3887,7 @@
         <w:rPr>
           <w:i/>
           <w:iCs/>
-          <w:color w:val="4B8A99"/>
+          <w:color w:val="000000"/>
           <w:sz w:val="18"/>
           <w:szCs w:val="18"/>
         </w:rPr>
@@ -3941,7 +3949,7 @@
         <w:rPr>
           <w:b/>
           <w:bCs/>
-          <w:color w:val="4B8A99"/>
+          <w:color w:val="000000"/>
           <w:sz w:val="18"/>
           <w:szCs w:val="18"/>
         </w:rPr>
@@ -3951,7 +3959,7 @@
         <w:rPr>
           <w:i/>
           <w:iCs/>
-          <w:color w:val="4B8A99"/>
+          <w:color w:val="000000"/>
           <w:sz w:val="18"/>
           <w:szCs w:val="18"/>
         </w:rPr>
@@ -4013,7 +4021,7 @@
         <w:rPr>
           <w:b/>
           <w:bCs/>
-          <w:color w:val="4B8A99"/>
+          <w:color w:val="000000"/>
           <w:sz w:val="18"/>
           <w:szCs w:val="18"/>
         </w:rPr>
@@ -4023,7 +4031,7 @@
         <w:rPr>
           <w:i/>
           <w:iCs/>
-          <w:color w:val="4B8A99"/>
+          <w:color w:val="000000"/>
           <w:sz w:val="18"/>
           <w:szCs w:val="18"/>
         </w:rPr>
@@ -4071,12 +4079,12 @@
           <w:tcPr>
             <w:tcW w:type="dxa" w:w="2600"/>
             <w:tcBorders>
-              <w:top w:val="single" w:color="B6DFE8" w:sz="4"/>
-              <w:left w:val="single" w:color="B6DFE8" w:sz="4"/>
-              <w:bottom w:val="single" w:color="B6DFE8" w:sz="4"/>
-              <w:right w:val="single" w:color="B6DFE8" w:sz="4"/>
-            </w:tcBorders>
-            <w:shd w:fill="CFFAFE" w:val="clear"/>
+              <w:top w:val="single" w:color="A6A6A6" w:sz="4"/>
+              <w:left w:val="single" w:color="A6A6A6" w:sz="4"/>
+              <w:bottom w:val="single" w:color="A6A6A6" w:sz="4"/>
+              <w:right w:val="single" w:color="A6A6A6" w:sz="4"/>
+            </w:tcBorders>
+            <w:shd w:fill="E7E6E6" w:val="clear"/>
             <w:tcMar>
               <w:top w:type="dxa" w:w="60"/>
               <w:left w:type="dxa" w:w="100"/>
@@ -4089,7 +4097,7 @@
               <w:rPr>
                 <w:b/>
                 <w:bCs/>
-                <w:color w:val="0E7490"/>
+                <w:color w:val="000000"/>
                 <w:sz w:val="19"/>
                 <w:szCs w:val="19"/>
               </w:rPr>
@@ -4101,12 +4109,12 @@
           <w:tcPr>
             <w:tcW w:type="dxa" w:w="4560"/>
             <w:tcBorders>
-              <w:top w:val="single" w:color="B6DFE8" w:sz="4"/>
-              <w:left w:val="single" w:color="B6DFE8" w:sz="4"/>
-              <w:bottom w:val="single" w:color="B6DFE8" w:sz="4"/>
-              <w:right w:val="single" w:color="B6DFE8" w:sz="4"/>
-            </w:tcBorders>
-            <w:shd w:fill="CFFAFE" w:val="clear"/>
+              <w:top w:val="single" w:color="A6A6A6" w:sz="4"/>
+              <w:left w:val="single" w:color="A6A6A6" w:sz="4"/>
+              <w:bottom w:val="single" w:color="A6A6A6" w:sz="4"/>
+              <w:right w:val="single" w:color="A6A6A6" w:sz="4"/>
+            </w:tcBorders>
+            <w:shd w:fill="E7E6E6" w:val="clear"/>
             <w:tcMar>
               <w:top w:type="dxa" w:w="60"/>
               <w:left w:type="dxa" w:w="100"/>
@@ -4119,7 +4127,7 @@
               <w:rPr>
                 <w:b/>
                 <w:bCs/>
-                <w:color w:val="0E7490"/>
+                <w:color w:val="000000"/>
                 <w:sz w:val="19"/>
                 <w:szCs w:val="19"/>
               </w:rPr>
@@ -4131,12 +4139,12 @@
           <w:tcPr>
             <w:tcW w:type="dxa" w:w="2200"/>
             <w:tcBorders>
-              <w:top w:val="single" w:color="B6DFE8" w:sz="4"/>
-              <w:left w:val="single" w:color="B6DFE8" w:sz="4"/>
-              <w:bottom w:val="single" w:color="B6DFE8" w:sz="4"/>
-              <w:right w:val="single" w:color="B6DFE8" w:sz="4"/>
-            </w:tcBorders>
-            <w:shd w:fill="CFFAFE" w:val="clear"/>
+              <w:top w:val="single" w:color="A6A6A6" w:sz="4"/>
+              <w:left w:val="single" w:color="A6A6A6" w:sz="4"/>
+              <w:bottom w:val="single" w:color="A6A6A6" w:sz="4"/>
+              <w:right w:val="single" w:color="A6A6A6" w:sz="4"/>
+            </w:tcBorders>
+            <w:shd w:fill="E7E6E6" w:val="clear"/>
             <w:tcMar>
               <w:top w:type="dxa" w:w="60"/>
               <w:left w:type="dxa" w:w="100"/>
@@ -4149,7 +4157,7 @@
               <w:rPr>
                 <w:b/>
                 <w:bCs/>
-                <w:color w:val="0E7490"/>
+                <w:color w:val="000000"/>
                 <w:sz w:val="19"/>
                 <w:szCs w:val="19"/>
               </w:rPr>
@@ -4163,10 +4171,10 @@
           <w:tcPr>
             <w:tcW w:type="dxa" w:w="2600"/>
             <w:tcBorders>
-              <w:top w:val="single" w:color="B6DFE8" w:sz="4"/>
-              <w:left w:val="single" w:color="B6DFE8" w:sz="4"/>
-              <w:bottom w:val="single" w:color="B6DFE8" w:sz="4"/>
-              <w:right w:val="single" w:color="B6DFE8" w:sz="4"/>
+              <w:top w:val="single" w:color="A6A6A6" w:sz="4"/>
+              <w:left w:val="single" w:color="A6A6A6" w:sz="4"/>
+              <w:bottom w:val="single" w:color="A6A6A6" w:sz="4"/>
+              <w:right w:val="single" w:color="A6A6A6" w:sz="4"/>
             </w:tcBorders>
             <w:tcMar>
               <w:top w:type="dxa" w:w="60"/>
@@ -4191,10 +4199,10 @@
           <w:tcPr>
             <w:tcW w:type="dxa" w:w="4560"/>
             <w:tcBorders>
-              <w:top w:val="single" w:color="B6DFE8" w:sz="4"/>
-              <w:left w:val="single" w:color="B6DFE8" w:sz="4"/>
-              <w:bottom w:val="single" w:color="B6DFE8" w:sz="4"/>
-              <w:right w:val="single" w:color="B6DFE8" w:sz="4"/>
+              <w:top w:val="single" w:color="A6A6A6" w:sz="4"/>
+              <w:left w:val="single" w:color="A6A6A6" w:sz="4"/>
+              <w:bottom w:val="single" w:color="A6A6A6" w:sz="4"/>
+              <w:right w:val="single" w:color="A6A6A6" w:sz="4"/>
             </w:tcBorders>
             <w:tcMar>
               <w:top w:type="dxa" w:w="60"/>
@@ -4219,10 +4227,10 @@
           <w:tcPr>
             <w:tcW w:type="dxa" w:w="2200"/>
             <w:tcBorders>
-              <w:top w:val="single" w:color="B6DFE8" w:sz="4"/>
-              <w:left w:val="single" w:color="B6DFE8" w:sz="4"/>
-              <w:bottom w:val="single" w:color="B6DFE8" w:sz="4"/>
-              <w:right w:val="single" w:color="B6DFE8" w:sz="4"/>
+              <w:top w:val="single" w:color="A6A6A6" w:sz="4"/>
+              <w:left w:val="single" w:color="A6A6A6" w:sz="4"/>
+              <w:bottom w:val="single" w:color="A6A6A6" w:sz="4"/>
+              <w:right w:val="single" w:color="A6A6A6" w:sz="4"/>
             </w:tcBorders>
             <w:tcMar>
               <w:top w:type="dxa" w:w="60"/>
@@ -4249,10 +4257,10 @@
           <w:tcPr>
             <w:tcW w:type="dxa" w:w="2600"/>
             <w:tcBorders>
-              <w:top w:val="single" w:color="B6DFE8" w:sz="4"/>
-              <w:left w:val="single" w:color="B6DFE8" w:sz="4"/>
-              <w:bottom w:val="single" w:color="B6DFE8" w:sz="4"/>
-              <w:right w:val="single" w:color="B6DFE8" w:sz="4"/>
+              <w:top w:val="single" w:color="A6A6A6" w:sz="4"/>
+              <w:left w:val="single" w:color="A6A6A6" w:sz="4"/>
+              <w:bottom w:val="single" w:color="A6A6A6" w:sz="4"/>
+              <w:right w:val="single" w:color="A6A6A6" w:sz="4"/>
             </w:tcBorders>
             <w:tcMar>
               <w:top w:type="dxa" w:w="60"/>
@@ -4277,10 +4285,10 @@
           <w:tcPr>
             <w:tcW w:type="dxa" w:w="4560"/>
             <w:tcBorders>
-              <w:top w:val="single" w:color="B6DFE8" w:sz="4"/>
-              <w:left w:val="single" w:color="B6DFE8" w:sz="4"/>
-              <w:bottom w:val="single" w:color="B6DFE8" w:sz="4"/>
-              <w:right w:val="single" w:color="B6DFE8" w:sz="4"/>
+              <w:top w:val="single" w:color="A6A6A6" w:sz="4"/>
+              <w:left w:val="single" w:color="A6A6A6" w:sz="4"/>
+              <w:bottom w:val="single" w:color="A6A6A6" w:sz="4"/>
+              <w:right w:val="single" w:color="A6A6A6" w:sz="4"/>
             </w:tcBorders>
             <w:tcMar>
               <w:top w:type="dxa" w:w="60"/>
@@ -4305,10 +4313,10 @@
           <w:tcPr>
             <w:tcW w:type="dxa" w:w="2200"/>
             <w:tcBorders>
-              <w:top w:val="single" w:color="B6DFE8" w:sz="4"/>
-              <w:left w:val="single" w:color="B6DFE8" w:sz="4"/>
-              <w:bottom w:val="single" w:color="B6DFE8" w:sz="4"/>
-              <w:right w:val="single" w:color="B6DFE8" w:sz="4"/>
+              <w:top w:val="single" w:color="A6A6A6" w:sz="4"/>
+              <w:left w:val="single" w:color="A6A6A6" w:sz="4"/>
+              <w:bottom w:val="single" w:color="A6A6A6" w:sz="4"/>
+              <w:right w:val="single" w:color="A6A6A6" w:sz="4"/>
             </w:tcBorders>
             <w:tcMar>
               <w:top w:type="dxa" w:w="60"/>
@@ -4335,10 +4343,10 @@
           <w:tcPr>
             <w:tcW w:type="dxa" w:w="2600"/>
             <w:tcBorders>
-              <w:top w:val="single" w:color="B6DFE8" w:sz="4"/>
-              <w:left w:val="single" w:color="B6DFE8" w:sz="4"/>
-              <w:bottom w:val="single" w:color="B6DFE8" w:sz="4"/>
-              <w:right w:val="single" w:color="B6DFE8" w:sz="4"/>
+              <w:top w:val="single" w:color="A6A6A6" w:sz="4"/>
+              <w:left w:val="single" w:color="A6A6A6" w:sz="4"/>
+              <w:bottom w:val="single" w:color="A6A6A6" w:sz="4"/>
+              <w:right w:val="single" w:color="A6A6A6" w:sz="4"/>
             </w:tcBorders>
             <w:tcMar>
               <w:top w:type="dxa" w:w="60"/>
@@ -4363,10 +4371,10 @@
           <w:tcPr>
             <w:tcW w:type="dxa" w:w="4560"/>
             <w:tcBorders>
-              <w:top w:val="single" w:color="B6DFE8" w:sz="4"/>
-              <w:left w:val="single" w:color="B6DFE8" w:sz="4"/>
-              <w:bottom w:val="single" w:color="B6DFE8" w:sz="4"/>
-              <w:right w:val="single" w:color="B6DFE8" w:sz="4"/>
+              <w:top w:val="single" w:color="A6A6A6" w:sz="4"/>
+              <w:left w:val="single" w:color="A6A6A6" w:sz="4"/>
+              <w:bottom w:val="single" w:color="A6A6A6" w:sz="4"/>
+              <w:right w:val="single" w:color="A6A6A6" w:sz="4"/>
             </w:tcBorders>
             <w:tcMar>
               <w:top w:type="dxa" w:w="60"/>
@@ -4391,10 +4399,10 @@
           <w:tcPr>
             <w:tcW w:type="dxa" w:w="2200"/>
             <w:tcBorders>
-              <w:top w:val="single" w:color="B6DFE8" w:sz="4"/>
-              <w:left w:val="single" w:color="B6DFE8" w:sz="4"/>
-              <w:bottom w:val="single" w:color="B6DFE8" w:sz="4"/>
-              <w:right w:val="single" w:color="B6DFE8" w:sz="4"/>
+              <w:top w:val="single" w:color="A6A6A6" w:sz="4"/>
+              <w:left w:val="single" w:color="A6A6A6" w:sz="4"/>
+              <w:bottom w:val="single" w:color="A6A6A6" w:sz="4"/>
+              <w:right w:val="single" w:color="A6A6A6" w:sz="4"/>
             </w:tcBorders>
             <w:tcMar>
               <w:top w:type="dxa" w:w="60"/>
@@ -4421,10 +4429,10 @@
           <w:tcPr>
             <w:tcW w:type="dxa" w:w="2600"/>
             <w:tcBorders>
-              <w:top w:val="single" w:color="B6DFE8" w:sz="4"/>
-              <w:left w:val="single" w:color="B6DFE8" w:sz="4"/>
-              <w:bottom w:val="single" w:color="B6DFE8" w:sz="4"/>
-              <w:right w:val="single" w:color="B6DFE8" w:sz="4"/>
+              <w:top w:val="single" w:color="A6A6A6" w:sz="4"/>
+              <w:left w:val="single" w:color="A6A6A6" w:sz="4"/>
+              <w:bottom w:val="single" w:color="A6A6A6" w:sz="4"/>
+              <w:right w:val="single" w:color="A6A6A6" w:sz="4"/>
             </w:tcBorders>
             <w:tcMar>
               <w:top w:type="dxa" w:w="60"/>
@@ -4449,10 +4457,10 @@
           <w:tcPr>
             <w:tcW w:type="dxa" w:w="4560"/>
             <w:tcBorders>
-              <w:top w:val="single" w:color="B6DFE8" w:sz="4"/>
-              <w:left w:val="single" w:color="B6DFE8" w:sz="4"/>
-              <w:bottom w:val="single" w:color="B6DFE8" w:sz="4"/>
-              <w:right w:val="single" w:color="B6DFE8" w:sz="4"/>
+              <w:top w:val="single" w:color="A6A6A6" w:sz="4"/>
+              <w:left w:val="single" w:color="A6A6A6" w:sz="4"/>
+              <w:bottom w:val="single" w:color="A6A6A6" w:sz="4"/>
+              <w:right w:val="single" w:color="A6A6A6" w:sz="4"/>
             </w:tcBorders>
             <w:tcMar>
               <w:top w:type="dxa" w:w="60"/>
@@ -4477,10 +4485,10 @@
           <w:tcPr>
             <w:tcW w:type="dxa" w:w="2200"/>
             <w:tcBorders>
-              <w:top w:val="single" w:color="B6DFE8" w:sz="4"/>
-              <w:left w:val="single" w:color="B6DFE8" w:sz="4"/>
-              <w:bottom w:val="single" w:color="B6DFE8" w:sz="4"/>
-              <w:right w:val="single" w:color="B6DFE8" w:sz="4"/>
+              <w:top w:val="single" w:color="A6A6A6" w:sz="4"/>
+              <w:left w:val="single" w:color="A6A6A6" w:sz="4"/>
+              <w:bottom w:val="single" w:color="A6A6A6" w:sz="4"/>
+              <w:right w:val="single" w:color="A6A6A6" w:sz="4"/>
             </w:tcBorders>
             <w:tcMar>
               <w:top w:type="dxa" w:w="60"/>
@@ -4507,10 +4515,10 @@
           <w:tcPr>
             <w:tcW w:type="dxa" w:w="2600"/>
             <w:tcBorders>
-              <w:top w:val="single" w:color="B6DFE8" w:sz="4"/>
-              <w:left w:val="single" w:color="B6DFE8" w:sz="4"/>
-              <w:bottom w:val="single" w:color="B6DFE8" w:sz="4"/>
-              <w:right w:val="single" w:color="B6DFE8" w:sz="4"/>
+              <w:top w:val="single" w:color="A6A6A6" w:sz="4"/>
+              <w:left w:val="single" w:color="A6A6A6" w:sz="4"/>
+              <w:bottom w:val="single" w:color="A6A6A6" w:sz="4"/>
+              <w:right w:val="single" w:color="A6A6A6" w:sz="4"/>
             </w:tcBorders>
             <w:tcMar>
               <w:top w:type="dxa" w:w="60"/>
@@ -4535,10 +4543,10 @@
           <w:tcPr>
             <w:tcW w:type="dxa" w:w="4560"/>
             <w:tcBorders>
-              <w:top w:val="single" w:color="B6DFE8" w:sz="4"/>
-              <w:left w:val="single" w:color="B6DFE8" w:sz="4"/>
-              <w:bottom w:val="single" w:color="B6DFE8" w:sz="4"/>
-              <w:right w:val="single" w:color="B6DFE8" w:sz="4"/>
+              <w:top w:val="single" w:color="A6A6A6" w:sz="4"/>
+              <w:left w:val="single" w:color="A6A6A6" w:sz="4"/>
+              <w:bottom w:val="single" w:color="A6A6A6" w:sz="4"/>
+              <w:right w:val="single" w:color="A6A6A6" w:sz="4"/>
             </w:tcBorders>
             <w:tcMar>
               <w:top w:type="dxa" w:w="60"/>
@@ -4563,10 +4571,10 @@
           <w:tcPr>
             <w:tcW w:type="dxa" w:w="2200"/>
             <w:tcBorders>
-              <w:top w:val="single" w:color="B6DFE8" w:sz="4"/>
-              <w:left w:val="single" w:color="B6DFE8" w:sz="4"/>
-              <w:bottom w:val="single" w:color="B6DFE8" w:sz="4"/>
-              <w:right w:val="single" w:color="B6DFE8" w:sz="4"/>
+              <w:top w:val="single" w:color="A6A6A6" w:sz="4"/>
+              <w:left w:val="single" w:color="A6A6A6" w:sz="4"/>
+              <w:bottom w:val="single" w:color="A6A6A6" w:sz="4"/>
+              <w:right w:val="single" w:color="A6A6A6" w:sz="4"/>
             </w:tcBorders>
             <w:tcMar>
               <w:top w:type="dxa" w:w="60"/>
@@ -4741,7 +4749,7 @@
         <w:rPr>
           <w:b/>
           <w:bCs/>
-          <w:color w:val="4B8A99"/>
+          <w:color w:val="000000"/>
           <w:sz w:val="18"/>
           <w:szCs w:val="18"/>
         </w:rPr>
@@ -4751,7 +4759,7 @@
         <w:rPr>
           <w:i/>
           <w:iCs/>
-          <w:color w:val="4B8A99"/>
+          <w:color w:val="000000"/>
           <w:sz w:val="18"/>
           <w:szCs w:val="18"/>
         </w:rPr>
@@ -4813,7 +4821,7 @@
         <w:rPr>
           <w:b/>
           <w:bCs/>
-          <w:color w:val="4B8A99"/>
+          <w:color w:val="000000"/>
           <w:sz w:val="18"/>
           <w:szCs w:val="18"/>
         </w:rPr>
@@ -4823,7 +4831,7 @@
         <w:rPr>
           <w:i/>
           <w:iCs/>
-          <w:color w:val="4B8A99"/>
+          <w:color w:val="000000"/>
           <w:sz w:val="18"/>
           <w:szCs w:val="18"/>
         </w:rPr>
@@ -4901,7 +4909,7 @@
         <w:rPr>
           <w:b/>
           <w:bCs/>
-          <w:color w:val="4B8A99"/>
+          <w:color w:val="000000"/>
           <w:sz w:val="18"/>
           <w:szCs w:val="18"/>
         </w:rPr>
@@ -4911,7 +4919,7 @@
         <w:rPr>
           <w:i/>
           <w:iCs/>
-          <w:color w:val="4B8A99"/>
+          <w:color w:val="000000"/>
           <w:sz w:val="18"/>
           <w:szCs w:val="18"/>
         </w:rPr>
@@ -5029,7 +5037,7 @@
         <w:rPr>
           <w:b/>
           <w:bCs/>
-          <w:color w:val="4B8A99"/>
+          <w:color w:val="000000"/>
           <w:sz w:val="18"/>
           <w:szCs w:val="18"/>
         </w:rPr>
@@ -5039,7 +5047,7 @@
         <w:rPr>
           <w:i/>
           <w:iCs/>
-          <w:color w:val="4B8A99"/>
+          <w:color w:val="000000"/>
           <w:sz w:val="18"/>
           <w:szCs w:val="18"/>
         </w:rPr>
@@ -5051,7 +5059,732 @@
         <w:pStyle w:val="Heading1"/>
       </w:pPr>
       <w:r>
-        <w:t xml:space="preserve">10. Archivos pesados (400–600 MB)</w:t>
+        <w:t xml:space="preserve">10. Prioridades</w:t>
+      </w:r>
+    </w:p>
+    <w:p>
+      <w:pPr>
+        <w:spacing w:after="120" w:line="300"/>
+      </w:pPr>
+      <w:r>
+        <w:t xml:space="preserve">Cada caso tiene una prioridad de 1 (baja) a 10 (alta). Las colas de RabbitMQ entregan primero las sub-tareas de mayor prioridad, por lo que un caso urgente se adelanta a las sub-tareas que ya estaban esperando. La prioridad no interrumpe las sub-tareas que ya están en ejecución, y se aplica dentro de cada cola.</w:t>
+      </w:r>
+    </w:p>
+    <w:p>
+      <w:pPr>
+        <w:pStyle w:val="Heading2"/>
+      </w:pPr>
+      <w:r>
+        <w:t xml:space="preserve">Prueba controlada</w:t>
+      </w:r>
+    </w:p>
+    <w:p>
+      <w:pPr>
+        <w:spacing w:after="120" w:line="300"/>
+      </w:pPr>
+      <w:r>
+        <w:t xml:space="preserve">Se usó el script scripts/prueba_prioridad.py, que envía casos de video (todas sus sub-tareas compiten en la misma cola) en este orden:</w:t>
+      </w:r>
+    </w:p>
+    <w:p>
+      <w:pPr>
+        <w:pStyle w:val="ListParagraph"/>
+        <w:numPr>
+          <w:ilvl w:val="0"/>
+          <w:numId w:val="2"/>
+        </w:numPr>
+        <w:spacing w:after="80" w:line="290"/>
+      </w:pPr>
+      <w:r>
+        <w:rPr>
+          <w:b/>
+          <w:bCs/>
+        </w:rPr>
+        <w:t xml:space="preserve">Prioridad 1: </w:t>
+      </w:r>
+      <w:r>
+        <w:t xml:space="preserve">caso_012_video (6 videos, 128 MB) y caso_013_video (6 videos, 264 MB), 36 sub-tareas en total.</w:t>
+      </w:r>
+    </w:p>
+    <w:p>
+      <w:pPr>
+        <w:pStyle w:val="ListParagraph"/>
+        <w:numPr>
+          <w:ilvl w:val="0"/>
+          <w:numId w:val="2"/>
+        </w:numPr>
+        <w:spacing w:after="80" w:line="290"/>
+      </w:pPr>
+      <w:r>
+        <w:rPr>
+          <w:b/>
+          <w:bCs/>
+        </w:rPr>
+        <w:t xml:space="preserve">Prioridad 10: </w:t>
+      </w:r>
+      <w:r>
+        <w:t xml:space="preserve">caso_014_video (6 videos, 243 MB, 18 sub-tareas), enviado a las 19:06:03, cuando ya había 30 sub-tareas esperando en la cola de video.</w:t>
+      </w:r>
+    </w:p>
+    <w:p>
+      <w:pPr>
+        <w:spacing w:after="120" w:line="300"/>
+      </w:pPr>
+      <w:r>
+        <w:t xml:space="preserve">El script registra en qué orden los workers tomaron cada sub-tarea:</w:t>
+      </w:r>
+    </w:p>
+    <w:tbl>
+      <w:tblPr>
+        <w:tblW w:type="dxa" w:w="9360"/>
+        <w:tblBorders>
+          <w:top w:val="single" w:color="auto" w:sz="4"/>
+          <w:left w:val="single" w:color="auto" w:sz="4"/>
+          <w:bottom w:val="single" w:color="auto" w:sz="4"/>
+          <w:right w:val="single" w:color="auto" w:sz="4"/>
+          <w:insideH w:val="single" w:color="auto" w:sz="4"/>
+          <w:insideV w:val="single" w:color="auto" w:sz="4"/>
+        </w:tblBorders>
+      </w:tblPr>
+      <w:tblGrid>
+        <w:gridCol w:w="5460"/>
+        <w:gridCol w:w="3900"/>
+      </w:tblGrid>
+      <w:tr>
+        <w:trPr>
+          <w:tblHeader/>
+        </w:trPr>
+        <w:tc>
+          <w:tcPr>
+            <w:tcW w:type="dxa" w:w="5460"/>
+            <w:tcBorders>
+              <w:top w:val="single" w:color="A6A6A6" w:sz="4"/>
+              <w:left w:val="single" w:color="A6A6A6" w:sz="4"/>
+              <w:bottom w:val="single" w:color="A6A6A6" w:sz="4"/>
+              <w:right w:val="single" w:color="A6A6A6" w:sz="4"/>
+            </w:tcBorders>
+            <w:shd w:fill="E7E6E6" w:val="clear"/>
+            <w:tcMar>
+              <w:top w:type="dxa" w:w="60"/>
+              <w:left w:type="dxa" w:w="100"/>
+              <w:bottom w:type="dxa" w:w="60"/>
+              <w:right w:type="dxa" w:w="100"/>
+            </w:tcMar>
+          </w:tcPr>
+          <w:p>
+            <w:r>
+              <w:rPr>
+                <w:b/>
+                <w:bCs/>
+                <w:color w:val="000000"/>
+                <w:sz w:val="19"/>
+                <w:szCs w:val="19"/>
+              </w:rPr>
+              <w:t xml:space="preserve">Indicador</w:t>
+            </w:r>
+          </w:p>
+        </w:tc>
+        <w:tc>
+          <w:tcPr>
+            <w:tcW w:type="dxa" w:w="3900"/>
+            <w:tcBorders>
+              <w:top w:val="single" w:color="A6A6A6" w:sz="4"/>
+              <w:left w:val="single" w:color="A6A6A6" w:sz="4"/>
+              <w:bottom w:val="single" w:color="A6A6A6" w:sz="4"/>
+              <w:right w:val="single" w:color="A6A6A6" w:sz="4"/>
+            </w:tcBorders>
+            <w:shd w:fill="E7E6E6" w:val="clear"/>
+            <w:tcMar>
+              <w:top w:type="dxa" w:w="60"/>
+              <w:left w:type="dxa" w:w="100"/>
+              <w:bottom w:type="dxa" w:w="60"/>
+              <w:right w:type="dxa" w:w="100"/>
+            </w:tcMar>
+          </w:tcPr>
+          <w:p>
+            <w:r>
+              <w:rPr>
+                <w:b/>
+                <w:bCs/>
+                <w:color w:val="000000"/>
+                <w:sz w:val="19"/>
+                <w:szCs w:val="19"/>
+              </w:rPr>
+              <w:t xml:space="preserve">Resultado</w:t>
+            </w:r>
+          </w:p>
+        </w:tc>
+      </w:tr>
+      <w:tr>
+        <w:tc>
+          <w:tcPr>
+            <w:tcW w:type="dxa" w:w="5460"/>
+            <w:tcBorders>
+              <w:top w:val="single" w:color="A6A6A6" w:sz="4"/>
+              <w:left w:val="single" w:color="A6A6A6" w:sz="4"/>
+              <w:bottom w:val="single" w:color="A6A6A6" w:sz="4"/>
+              <w:right w:val="single" w:color="A6A6A6" w:sz="4"/>
+            </w:tcBorders>
+            <w:tcMar>
+              <w:top w:type="dxa" w:w="60"/>
+              <w:left w:type="dxa" w:w="100"/>
+              <w:bottom w:type="dxa" w:w="60"/>
+              <w:right w:type="dxa" w:w="100"/>
+            </w:tcMar>
+          </w:tcPr>
+          <w:p>
+            <w:r>
+              <w:rPr>
+                <w:b w:val="false"/>
+                <w:bCs w:val="false"/>
+                <w:sz w:val="19"/>
+                <w:szCs w:val="19"/>
+              </w:rPr>
+              <w:t xml:space="preserve">Sub-tareas de prioridad 1 esperando cuando llegó el urgente</w:t>
+            </w:r>
+          </w:p>
+        </w:tc>
+        <w:tc>
+          <w:tcPr>
+            <w:tcW w:type="dxa" w:w="3900"/>
+            <w:tcBorders>
+              <w:top w:val="single" w:color="A6A6A6" w:sz="4"/>
+              <w:left w:val="single" w:color="A6A6A6" w:sz="4"/>
+              <w:bottom w:val="single" w:color="A6A6A6" w:sz="4"/>
+              <w:right w:val="single" w:color="A6A6A6" w:sz="4"/>
+            </w:tcBorders>
+            <w:tcMar>
+              <w:top w:type="dxa" w:w="60"/>
+              <w:left w:type="dxa" w:w="100"/>
+              <w:bottom w:type="dxa" w:w="60"/>
+              <w:right w:type="dxa" w:w="100"/>
+            </w:tcMar>
+          </w:tcPr>
+          <w:p>
+            <w:r>
+              <w:rPr>
+                <w:b w:val="false"/>
+                <w:bCs w:val="false"/>
+                <w:sz w:val="19"/>
+                <w:szCs w:val="19"/>
+              </w:rPr>
+              <w:t xml:space="preserve">29</w:t>
+            </w:r>
+          </w:p>
+        </w:tc>
+      </w:tr>
+      <w:tr>
+        <w:tc>
+          <w:tcPr>
+            <w:tcW w:type="dxa" w:w="5460"/>
+            <w:tcBorders>
+              <w:top w:val="single" w:color="A6A6A6" w:sz="4"/>
+              <w:left w:val="single" w:color="A6A6A6" w:sz="4"/>
+              <w:bottom w:val="single" w:color="A6A6A6" w:sz="4"/>
+              <w:right w:val="single" w:color="A6A6A6" w:sz="4"/>
+            </w:tcBorders>
+            <w:tcMar>
+              <w:top w:type="dxa" w:w="60"/>
+              <w:left w:type="dxa" w:w="100"/>
+              <w:bottom w:type="dxa" w:w="60"/>
+              <w:right w:type="dxa" w:w="100"/>
+            </w:tcMar>
+          </w:tcPr>
+          <w:p>
+            <w:r>
+              <w:rPr>
+                <w:b w:val="false"/>
+                <w:bCs w:val="false"/>
+                <w:sz w:val="19"/>
+                <w:szCs w:val="19"/>
+              </w:rPr>
+              <w:t xml:space="preserve">Sub-tareas del caso urgente (prioridad 10)</w:t>
+            </w:r>
+          </w:p>
+        </w:tc>
+        <w:tc>
+          <w:tcPr>
+            <w:tcW w:type="dxa" w:w="3900"/>
+            <w:tcBorders>
+              <w:top w:val="single" w:color="A6A6A6" w:sz="4"/>
+              <w:left w:val="single" w:color="A6A6A6" w:sz="4"/>
+              <w:bottom w:val="single" w:color="A6A6A6" w:sz="4"/>
+              <w:right w:val="single" w:color="A6A6A6" w:sz="4"/>
+            </w:tcBorders>
+            <w:tcMar>
+              <w:top w:type="dxa" w:w="60"/>
+              <w:left w:type="dxa" w:w="100"/>
+              <w:bottom w:type="dxa" w:w="60"/>
+              <w:right w:type="dxa" w:w="100"/>
+            </w:tcMar>
+          </w:tcPr>
+          <w:p>
+            <w:r>
+              <w:rPr>
+                <w:b w:val="false"/>
+                <w:bCs w:val="false"/>
+                <w:sz w:val="19"/>
+                <w:szCs w:val="19"/>
+              </w:rPr>
+              <w:t xml:space="preserve">18</w:t>
+            </w:r>
+          </w:p>
+        </w:tc>
+      </w:tr>
+      <w:tr>
+        <w:tc>
+          <w:tcPr>
+            <w:tcW w:type="dxa" w:w="5460"/>
+            <w:tcBorders>
+              <w:top w:val="single" w:color="A6A6A6" w:sz="4"/>
+              <w:left w:val="single" w:color="A6A6A6" w:sz="4"/>
+              <w:bottom w:val="single" w:color="A6A6A6" w:sz="4"/>
+              <w:right w:val="single" w:color="A6A6A6" w:sz="4"/>
+            </w:tcBorders>
+            <w:tcMar>
+              <w:top w:type="dxa" w:w="60"/>
+              <w:left w:type="dxa" w:w="100"/>
+              <w:bottom w:type="dxa" w:w="60"/>
+              <w:right w:type="dxa" w:w="100"/>
+            </w:tcMar>
+          </w:tcPr>
+          <w:p>
+            <w:r>
+              <w:rPr>
+                <w:b w:val="false"/>
+                <w:bCs w:val="false"/>
+                <w:sz w:val="19"/>
+                <w:szCs w:val="19"/>
+              </w:rPr>
+              <w:t xml:space="preserve">Sub-tareas de prioridad 1 tomadas antes de repartir todas las del urgente</w:t>
+            </w:r>
+          </w:p>
+        </w:tc>
+        <w:tc>
+          <w:tcPr>
+            <w:tcW w:type="dxa" w:w="3900"/>
+            <w:tcBorders>
+              <w:top w:val="single" w:color="A6A6A6" w:sz="4"/>
+              <w:left w:val="single" w:color="A6A6A6" w:sz="4"/>
+              <w:bottom w:val="single" w:color="A6A6A6" w:sz="4"/>
+              <w:right w:val="single" w:color="A6A6A6" w:sz="4"/>
+            </w:tcBorders>
+            <w:tcMar>
+              <w:top w:type="dxa" w:w="60"/>
+              <w:left w:type="dxa" w:w="100"/>
+              <w:bottom w:type="dxa" w:w="60"/>
+              <w:right w:type="dxa" w:w="100"/>
+            </w:tcMar>
+          </w:tcPr>
+          <w:p>
+            <w:r>
+              <w:rPr>
+                <w:b w:val="false"/>
+                <w:bCs w:val="false"/>
+                <w:sz w:val="19"/>
+                <w:szCs w:val="19"/>
+              </w:rPr>
+              <w:t xml:space="preserve">0</w:t>
+            </w:r>
+          </w:p>
+        </w:tc>
+      </w:tr>
+      <w:tr>
+        <w:tc>
+          <w:tcPr>
+            <w:tcW w:type="dxa" w:w="5460"/>
+            <w:tcBorders>
+              <w:top w:val="single" w:color="A6A6A6" w:sz="4"/>
+              <w:left w:val="single" w:color="A6A6A6" w:sz="4"/>
+              <w:bottom w:val="single" w:color="A6A6A6" w:sz="4"/>
+              <w:right w:val="single" w:color="A6A6A6" w:sz="4"/>
+            </w:tcBorders>
+            <w:tcMar>
+              <w:top w:type="dxa" w:w="60"/>
+              <w:left w:type="dxa" w:w="100"/>
+              <w:bottom w:type="dxa" w:w="60"/>
+              <w:right w:type="dxa" w:w="100"/>
+            </w:tcMar>
+          </w:tcPr>
+          <w:p>
+            <w:r>
+              <w:rPr>
+                <w:b w:val="false"/>
+                <w:bCs w:val="false"/>
+                <w:sz w:val="19"/>
+                <w:szCs w:val="19"/>
+              </w:rPr>
+              <w:t xml:space="preserve">Fin del caso urgente / fin de los casos de prioridad 1</w:t>
+            </w:r>
+          </w:p>
+        </w:tc>
+        <w:tc>
+          <w:tcPr>
+            <w:tcW w:type="dxa" w:w="3900"/>
+            <w:tcBorders>
+              <w:top w:val="single" w:color="A6A6A6" w:sz="4"/>
+              <w:left w:val="single" w:color="A6A6A6" w:sz="4"/>
+              <w:bottom w:val="single" w:color="A6A6A6" w:sz="4"/>
+              <w:right w:val="single" w:color="A6A6A6" w:sz="4"/>
+            </w:tcBorders>
+            <w:tcMar>
+              <w:top w:type="dxa" w:w="60"/>
+              <w:left w:type="dxa" w:w="100"/>
+              <w:bottom w:type="dxa" w:w="60"/>
+              <w:right w:type="dxa" w:w="100"/>
+            </w:tcMar>
+          </w:tcPr>
+          <w:p>
+            <w:r>
+              <w:rPr>
+                <w:b w:val="false"/>
+                <w:bCs w:val="false"/>
+                <w:sz w:val="19"/>
+                <w:szCs w:val="19"/>
+              </w:rPr>
+              <w:t xml:space="preserve">19:07:46 / 19:08:44</w:t>
+            </w:r>
+          </w:p>
+        </w:tc>
+      </w:tr>
+      <w:tr>
+        <w:tc>
+          <w:tcPr>
+            <w:tcW w:type="dxa" w:w="5460"/>
+            <w:tcBorders>
+              <w:top w:val="single" w:color="A6A6A6" w:sz="4"/>
+              <w:left w:val="single" w:color="A6A6A6" w:sz="4"/>
+              <w:bottom w:val="single" w:color="A6A6A6" w:sz="4"/>
+              <w:right w:val="single" w:color="A6A6A6" w:sz="4"/>
+            </w:tcBorders>
+            <w:tcMar>
+              <w:top w:type="dxa" w:w="60"/>
+              <w:left w:type="dxa" w:w="100"/>
+              <w:bottom w:type="dxa" w:w="60"/>
+              <w:right w:type="dxa" w:w="100"/>
+            </w:tcMar>
+          </w:tcPr>
+          <w:p>
+            <w:r>
+              <w:rPr>
+                <w:b w:val="false"/>
+                <w:bCs w:val="false"/>
+                <w:sz w:val="19"/>
+                <w:szCs w:val="19"/>
+              </w:rPr>
+              <w:t xml:space="preserve">Tiempo total de la prueba (54 sub-tareas, 3 workers)</w:t>
+            </w:r>
+          </w:p>
+        </w:tc>
+        <w:tc>
+          <w:tcPr>
+            <w:tcW w:type="dxa" w:w="3900"/>
+            <w:tcBorders>
+              <w:top w:val="single" w:color="A6A6A6" w:sz="4"/>
+              <w:left w:val="single" w:color="A6A6A6" w:sz="4"/>
+              <w:bottom w:val="single" w:color="A6A6A6" w:sz="4"/>
+              <w:right w:val="single" w:color="A6A6A6" w:sz="4"/>
+            </w:tcBorders>
+            <w:tcMar>
+              <w:top w:type="dxa" w:w="60"/>
+              <w:left w:type="dxa" w:w="100"/>
+              <w:bottom w:type="dxa" w:w="60"/>
+              <w:right w:type="dxa" w:w="100"/>
+            </w:tcMar>
+          </w:tcPr>
+          <w:p>
+            <w:r>
+              <w:rPr>
+                <w:b w:val="false"/>
+                <w:bCs w:val="false"/>
+                <w:sz w:val="19"/>
+                <w:szCs w:val="19"/>
+              </w:rPr>
+              <w:t xml:space="preserve">162 s</w:t>
+            </w:r>
+          </w:p>
+        </w:tc>
+      </w:tr>
+    </w:tbl>
+    <w:p>
+      <w:pPr>
+        <w:spacing w:after="120"/>
+      </w:pPr>
+    </w:p>
+    <w:p>
+      <w:pPr>
+        <w:spacing w:after="120" w:line="300"/>
+      </w:pPr>
+      <w:r>
+        <w:t xml:space="preserve">Desde que llegó el caso urgente (19:06:03), los tres workers tomaron </w:t>
+      </w:r>
+      <w:r>
+        <w:rPr>
+          <w:b/>
+          <w:bCs/>
+        </w:rPr>
+        <w:t xml:space="preserve">únicamente sub-tareas de prioridad 10</w:t>
+      </w:r>
+      <w:r>
+        <w:t xml:space="preserve"> hasta repartirlas todas (19:07:06). Recién después retomaron las de prioridad 1, que llevaban más tiempo esperando. </w:t>
+      </w:r>
+      <w:r>
+        <w:rPr>
+          <w:b/>
+          <w:bCs/>
+        </w:rPr>
+        <w:t xml:space="preserve">La prioridad se respetó</w:t>
+      </w:r>
+      <w:r>
+        <w:t xml:space="preserve">.</w:t>
+      </w:r>
+    </w:p>
+    <w:p>
+      <w:pPr>
+        <w:spacing w:before="120"/>
+        <w:jc w:val="center"/>
+      </w:pPr>
+      <w:r>
+        <w:drawing>
+          <wp:inline distT="0" distB="0" distL="0" distR="0">
+            <wp:extent cx="5715000" cy="4095750"/>
+            <wp:effectExtent t="0" r="0" b="0" l="0"/>
+            <wp:docPr id="10" name="figura10" descr="Inicio de la prueba: después de la marca «llega el caso urgente», todas las sub-tareas tomadas son de prioridad 10." title="Figura 10"/>
+            <wp:cNvGraphicFramePr>
+              <a:graphicFrameLocks xmlns:a="http://schemas.openxmlformats.org/drawingml/2006/main" noChangeAspect="1"/>
+            </wp:cNvGraphicFramePr>
+            <a:graphic xmlns:a="http://schemas.openxmlformats.org/drawingml/2006/main">
+              <a:graphicData uri="http://schemas.openxmlformats.org/drawingml/2006/picture">
+                <pic:pic xmlns:pic="http://schemas.openxmlformats.org/drawingml/2006/picture">
+                  <pic:nvPicPr>
+                    <pic:cNvPr id="0" name="" descr=""/>
+                    <pic:cNvPicPr>
+                      <a:picLocks noChangeAspect="1" noChangeArrowheads="1"/>
+                    </pic:cNvPicPr>
+                  </pic:nvPicPr>
+                  <pic:blipFill>
+                    <a:blip r:embed="rId17" cstate="none"/>
+                    <a:srcRect/>
+                    <a:stretch>
+                      <a:fillRect/>
+                    </a:stretch>
+                  </pic:blipFill>
+                  <pic:spPr bwMode="auto">
+                    <a:xfrm>
+                      <a:off x="0" y="0"/>
+                      <a:ext cx="5715000" cy="4095750"/>
+                    </a:xfrm>
+                    <a:prstGeom prst="rect">
+                      <a:avLst/>
+                    </a:prstGeom>
+                  </pic:spPr>
+                </pic:pic>
+              </a:graphicData>
+            </a:graphic>
+          </wp:inline>
+        </w:drawing>
+      </w:r>
+    </w:p>
+    <w:p>
+      <w:pPr>
+        <w:spacing w:after="240"/>
+        <w:jc w:val="center"/>
+      </w:pPr>
+      <w:r>
+        <w:rPr>
+          <w:b/>
+          <w:bCs/>
+          <w:color w:val="000000"/>
+          <w:sz w:val="18"/>
+          <w:szCs w:val="18"/>
+        </w:rPr>
+        <w:t xml:space="preserve">Figura 10. </w:t>
+      </w:r>
+      <w:r>
+        <w:rPr>
+          <w:i/>
+          <w:iCs/>
+          <w:color w:val="000000"/>
+          <w:sz w:val="18"/>
+          <w:szCs w:val="18"/>
+        </w:rPr>
+        <w:t xml:space="preserve">Inicio de la prueba: después de la marca «llega el caso urgente», todas las sub-tareas tomadas son de prioridad 10.</w:t>
+      </w:r>
+    </w:p>
+    <w:p>
+      <w:pPr>
+        <w:spacing w:before="120"/>
+        <w:jc w:val="center"/>
+      </w:pPr>
+      <w:r>
+        <w:drawing>
+          <wp:inline distT="0" distB="0" distL="0" distR="0">
+            <wp:extent cx="5715000" cy="4095750"/>
+            <wp:effectExtent t="0" r="0" b="0" l="0"/>
+            <wp:docPr id="11" name="figura11" descr="Final de la prueba: las sub-tareas de prioridad 1 se retoman recién a las 19:07:07; el resultado indica 0 sub-tareas de prioridad baja adelantadas." title="Figura 11"/>
+            <wp:cNvGraphicFramePr>
+              <a:graphicFrameLocks xmlns:a="http://schemas.openxmlformats.org/drawingml/2006/main" noChangeAspect="1"/>
+            </wp:cNvGraphicFramePr>
+            <a:graphic xmlns:a="http://schemas.openxmlformats.org/drawingml/2006/main">
+              <a:graphicData uri="http://schemas.openxmlformats.org/drawingml/2006/picture">
+                <pic:pic xmlns:pic="http://schemas.openxmlformats.org/drawingml/2006/picture">
+                  <pic:nvPicPr>
+                    <pic:cNvPr id="0" name="" descr=""/>
+                    <pic:cNvPicPr>
+                      <a:picLocks noChangeAspect="1" noChangeArrowheads="1"/>
+                    </pic:cNvPicPr>
+                  </pic:nvPicPr>
+                  <pic:blipFill>
+                    <a:blip r:embed="rId18" cstate="none"/>
+                    <a:srcRect/>
+                    <a:stretch>
+                      <a:fillRect/>
+                    </a:stretch>
+                  </pic:blipFill>
+                  <pic:spPr bwMode="auto">
+                    <a:xfrm>
+                      <a:off x="0" y="0"/>
+                      <a:ext cx="5715000" cy="4095750"/>
+                    </a:xfrm>
+                    <a:prstGeom prst="rect">
+                      <a:avLst/>
+                    </a:prstGeom>
+                  </pic:spPr>
+                </pic:pic>
+              </a:graphicData>
+            </a:graphic>
+          </wp:inline>
+        </w:drawing>
+      </w:r>
+    </w:p>
+    <w:p>
+      <w:pPr>
+        <w:spacing w:after="240"/>
+        <w:jc w:val="center"/>
+      </w:pPr>
+      <w:r>
+        <w:rPr>
+          <w:b/>
+          <w:bCs/>
+          <w:color w:val="000000"/>
+          <w:sz w:val="18"/>
+          <w:szCs w:val="18"/>
+        </w:rPr>
+        <w:t xml:space="preserve">Figura 11. </w:t>
+      </w:r>
+      <w:r>
+        <w:rPr>
+          <w:i/>
+          <w:iCs/>
+          <w:color w:val="000000"/>
+          <w:sz w:val="18"/>
+          <w:szCs w:val="18"/>
+        </w:rPr>
+        <w:t xml:space="preserve">Final de la prueba: las sub-tareas de prioridad 1 se retoman recién a las 19:07:07; el resultado indica 0 sub-tareas de prioridad baja adelantadas.</w:t>
+      </w:r>
+    </w:p>
+    <w:p>
+      <w:pPr>
+        <w:pStyle w:val="Heading2"/>
+      </w:pPr>
+      <w:r>
+        <w:t xml:space="preserve">Observación en el dashboard</w:t>
+      </w:r>
+    </w:p>
+    <w:p>
+      <w:pPr>
+        <w:spacing w:after="120" w:line="300"/>
+      </w:pPr>
+      <w:r>
+        <w:t xml:space="preserve">En otra prueba se enviaron dos casos de 3 videos cada uno: caso_menos_prioritario (prioridad 2) a las 18:30:22 y caso_más prioritario (prioridad 10) a las 18:31:57. Aunque llegó un minuto y medio después, el caso de prioridad 10 avanzó más rápido (89 % frente a 67 % en la Figura 12).</w:t>
+      </w:r>
+    </w:p>
+    <w:p>
+      <w:pPr>
+        <w:spacing w:after="120" w:line="300"/>
+      </w:pPr>
+      <w:r>
+        <w:t xml:space="preserve">Sin embargo, el caso de prioridad 2 terminó primero (18:41:17 frente a 18:47:46): sus sub-tareas ya estaban en ejecución cuando llegó el urgente, y la prioridad no interrumpe lo que ya se está procesando. Esto confirma que la prioridad decide qué sub-tarea empieza primero, no cuál caso termina primero. Por la misma razón, un caso liviano de baja prioridad (por ejemplo, solo imágenes, en la cola ligera) puede terminar antes que uno pesado de alta prioridad.</w:t>
+      </w:r>
+    </w:p>
+    <w:p>
+      <w:pPr>
+        <w:spacing w:before="120"/>
+        <w:jc w:val="center"/>
+      </w:pPr>
+      <w:r>
+        <w:drawing>
+          <wp:inline distT="0" distB="0" distL="0" distR="0">
+            <wp:extent cx="5715000" cy="1466850"/>
+            <wp:effectExtent t="0" r="0" b="0" l="0"/>
+            <wp:docPr id="12" name="figura12" descr="Dashboard: el caso de prioridad 10, enviado después, avanza por delante del caso de prioridad 2." title="Figura 12"/>
+            <wp:cNvGraphicFramePr>
+              <a:graphicFrameLocks xmlns:a="http://schemas.openxmlformats.org/drawingml/2006/main" noChangeAspect="1"/>
+            </wp:cNvGraphicFramePr>
+            <a:graphic xmlns:a="http://schemas.openxmlformats.org/drawingml/2006/main">
+              <a:graphicData uri="http://schemas.openxmlformats.org/drawingml/2006/picture">
+                <pic:pic xmlns:pic="http://schemas.openxmlformats.org/drawingml/2006/picture">
+                  <pic:nvPicPr>
+                    <pic:cNvPr id="0" name="" descr=""/>
+                    <pic:cNvPicPr>
+                      <a:picLocks noChangeAspect="1" noChangeArrowheads="1"/>
+                    </pic:cNvPicPr>
+                  </pic:nvPicPr>
+                  <pic:blipFill>
+                    <a:blip r:embed="rId19" cstate="none"/>
+                    <a:srcRect/>
+                    <a:stretch>
+                      <a:fillRect/>
+                    </a:stretch>
+                  </pic:blipFill>
+                  <pic:spPr bwMode="auto">
+                    <a:xfrm>
+                      <a:off x="0" y="0"/>
+                      <a:ext cx="5715000" cy="1466850"/>
+                    </a:xfrm>
+                    <a:prstGeom prst="rect">
+                      <a:avLst/>
+                    </a:prstGeom>
+                  </pic:spPr>
+                </pic:pic>
+              </a:graphicData>
+            </a:graphic>
+          </wp:inline>
+        </w:drawing>
+      </w:r>
+    </w:p>
+    <w:p>
+      <w:pPr>
+        <w:spacing w:after="240"/>
+        <w:jc w:val="center"/>
+      </w:pPr>
+      <w:r>
+        <w:rPr>
+          <w:b/>
+          <w:bCs/>
+          <w:color w:val="000000"/>
+          <w:sz w:val="18"/>
+          <w:szCs w:val="18"/>
+        </w:rPr>
+        <w:t xml:space="preserve">Figura 12. </w:t>
+      </w:r>
+      <w:r>
+        <w:rPr>
+          <w:i/>
+          <w:iCs/>
+          <w:color w:val="000000"/>
+          <w:sz w:val="18"/>
+          <w:szCs w:val="18"/>
+        </w:rPr>
+        <w:t xml:space="preserve">Dashboard: el caso de prioridad 10, enviado después, avanza por delante del caso de prioridad 2.</w:t>
+      </w:r>
+    </w:p>
+    <w:p>
+      <w:pPr>
+        <w:pStyle w:val="Heading1"/>
+      </w:pPr>
+      <w:r>
+        <w:t xml:space="preserve">11. Archivos pesados (400–600 MB)</w:t>
       </w:r>
     </w:p>
     <w:p>
@@ -5089,12 +5822,12 @@
           <w:tcPr>
             <w:tcW w:type="dxa" w:w="3500"/>
             <w:tcBorders>
-              <w:top w:val="single" w:color="B6DFE8" w:sz="4"/>
-              <w:left w:val="single" w:color="B6DFE8" w:sz="4"/>
-              <w:bottom w:val="single" w:color="B6DFE8" w:sz="4"/>
-              <w:right w:val="single" w:color="B6DFE8" w:sz="4"/>
-            </w:tcBorders>
-            <w:shd w:fill="CFFAFE" w:val="clear"/>
+              <w:top w:val="single" w:color="A6A6A6" w:sz="4"/>
+              <w:left w:val="single" w:color="A6A6A6" w:sz="4"/>
+              <w:bottom w:val="single" w:color="A6A6A6" w:sz="4"/>
+              <w:right w:val="single" w:color="A6A6A6" w:sz="4"/>
+            </w:tcBorders>
+            <w:shd w:fill="E7E6E6" w:val="clear"/>
             <w:tcMar>
               <w:top w:type="dxa" w:w="60"/>
               <w:left w:type="dxa" w:w="100"/>
@@ -5107,7 +5840,7 @@
               <w:rPr>
                 <w:b/>
                 <w:bCs/>
-                <w:color w:val="0E7490"/>
+                <w:color w:val="000000"/>
                 <w:sz w:val="19"/>
                 <w:szCs w:val="19"/>
               </w:rPr>
@@ -5119,12 +5852,12 @@
           <w:tcPr>
             <w:tcW w:type="dxa" w:w="1300"/>
             <w:tcBorders>
-              <w:top w:val="single" w:color="B6DFE8" w:sz="4"/>
-              <w:left w:val="single" w:color="B6DFE8" w:sz="4"/>
-              <w:bottom w:val="single" w:color="B6DFE8" w:sz="4"/>
-              <w:right w:val="single" w:color="B6DFE8" w:sz="4"/>
-            </w:tcBorders>
-            <w:shd w:fill="CFFAFE" w:val="clear"/>
+              <w:top w:val="single" w:color="A6A6A6" w:sz="4"/>
+              <w:left w:val="single" w:color="A6A6A6" w:sz="4"/>
+              <w:bottom w:val="single" w:color="A6A6A6" w:sz="4"/>
+              <w:right w:val="single" w:color="A6A6A6" w:sz="4"/>
+            </w:tcBorders>
+            <w:shd w:fill="E7E6E6" w:val="clear"/>
             <w:tcMar>
               <w:top w:type="dxa" w:w="60"/>
               <w:left w:type="dxa" w:w="100"/>
@@ -5137,7 +5870,7 @@
               <w:rPr>
                 <w:b/>
                 <w:bCs/>
-                <w:color w:val="0E7490"/>
+                <w:color w:val="000000"/>
                 <w:sz w:val="19"/>
                 <w:szCs w:val="19"/>
               </w:rPr>
@@ -5149,12 +5882,12 @@
           <w:tcPr>
             <w:tcW w:type="dxa" w:w="1460"/>
             <w:tcBorders>
-              <w:top w:val="single" w:color="B6DFE8" w:sz="4"/>
-              <w:left w:val="single" w:color="B6DFE8" w:sz="4"/>
-              <w:bottom w:val="single" w:color="B6DFE8" w:sz="4"/>
-              <w:right w:val="single" w:color="B6DFE8" w:sz="4"/>
-            </w:tcBorders>
-            <w:shd w:fill="CFFAFE" w:val="clear"/>
+              <w:top w:val="single" w:color="A6A6A6" w:sz="4"/>
+              <w:left w:val="single" w:color="A6A6A6" w:sz="4"/>
+              <w:bottom w:val="single" w:color="A6A6A6" w:sz="4"/>
+              <w:right w:val="single" w:color="A6A6A6" w:sz="4"/>
+            </w:tcBorders>
+            <w:shd w:fill="E7E6E6" w:val="clear"/>
             <w:tcMar>
               <w:top w:type="dxa" w:w="60"/>
               <w:left w:type="dxa" w:w="100"/>
@@ -5167,7 +5900,7 @@
               <w:rPr>
                 <w:b/>
                 <w:bCs/>
-                <w:color w:val="0E7490"/>
+                <w:color w:val="000000"/>
                 <w:sz w:val="19"/>
                 <w:szCs w:val="19"/>
               </w:rPr>
@@ -5179,12 +5912,12 @@
           <w:tcPr>
             <w:tcW w:type="dxa" w:w="1500"/>
             <w:tcBorders>
-              <w:top w:val="single" w:color="B6DFE8" w:sz="4"/>
-              <w:left w:val="single" w:color="B6DFE8" w:sz="4"/>
-              <w:bottom w:val="single" w:color="B6DFE8" w:sz="4"/>
-              <w:right w:val="single" w:color="B6DFE8" w:sz="4"/>
-            </w:tcBorders>
-            <w:shd w:fill="CFFAFE" w:val="clear"/>
+              <w:top w:val="single" w:color="A6A6A6" w:sz="4"/>
+              <w:left w:val="single" w:color="A6A6A6" w:sz="4"/>
+              <w:bottom w:val="single" w:color="A6A6A6" w:sz="4"/>
+              <w:right w:val="single" w:color="A6A6A6" w:sz="4"/>
+            </w:tcBorders>
+            <w:shd w:fill="E7E6E6" w:val="clear"/>
             <w:tcMar>
               <w:top w:type="dxa" w:w="60"/>
               <w:left w:type="dxa" w:w="100"/>
@@ -5197,7 +5930,7 @@
               <w:rPr>
                 <w:b/>
                 <w:bCs/>
-                <w:color w:val="0E7490"/>
+                <w:color w:val="000000"/>
                 <w:sz w:val="19"/>
                 <w:szCs w:val="19"/>
               </w:rPr>
@@ -5209,12 +5942,12 @@
           <w:tcPr>
             <w:tcW w:type="dxa" w:w="1600"/>
             <w:tcBorders>
-              <w:top w:val="single" w:color="B6DFE8" w:sz="4"/>
-              <w:left w:val="single" w:color="B6DFE8" w:sz="4"/>
-              <w:bottom w:val="single" w:color="B6DFE8" w:sz="4"/>
-              <w:right w:val="single" w:color="B6DFE8" w:sz="4"/>
-            </w:tcBorders>
-            <w:shd w:fill="CFFAFE" w:val="clear"/>
+              <w:top w:val="single" w:color="A6A6A6" w:sz="4"/>
+              <w:left w:val="single" w:color="A6A6A6" w:sz="4"/>
+              <w:bottom w:val="single" w:color="A6A6A6" w:sz="4"/>
+              <w:right w:val="single" w:color="A6A6A6" w:sz="4"/>
+            </w:tcBorders>
+            <w:shd w:fill="E7E6E6" w:val="clear"/>
             <w:tcMar>
               <w:top w:type="dxa" w:w="60"/>
               <w:left w:type="dxa" w:w="100"/>
@@ -5227,7 +5960,7 @@
               <w:rPr>
                 <w:b/>
                 <w:bCs/>
-                <w:color w:val="0E7490"/>
+                <w:color w:val="000000"/>
                 <w:sz w:val="19"/>
                 <w:szCs w:val="19"/>
               </w:rPr>
@@ -5241,10 +5974,10 @@
           <w:tcPr>
             <w:tcW w:type="dxa" w:w="3500"/>
             <w:tcBorders>
-              <w:top w:val="single" w:color="B6DFE8" w:sz="4"/>
-              <w:left w:val="single" w:color="B6DFE8" w:sz="4"/>
-              <w:bottom w:val="single" w:color="B6DFE8" w:sz="4"/>
-              <w:right w:val="single" w:color="B6DFE8" w:sz="4"/>
+              <w:top w:val="single" w:color="A6A6A6" w:sz="4"/>
+              <w:left w:val="single" w:color="A6A6A6" w:sz="4"/>
+              <w:bottom w:val="single" w:color="A6A6A6" w:sz="4"/>
+              <w:right w:val="single" w:color="A6A6A6" w:sz="4"/>
             </w:tcBorders>
             <w:tcMar>
               <w:top w:type="dxa" w:w="60"/>
@@ -5269,10 +6002,10 @@
           <w:tcPr>
             <w:tcW w:type="dxa" w:w="1300"/>
             <w:tcBorders>
-              <w:top w:val="single" w:color="B6DFE8" w:sz="4"/>
-              <w:left w:val="single" w:color="B6DFE8" w:sz="4"/>
-              <w:bottom w:val="single" w:color="B6DFE8" w:sz="4"/>
-              <w:right w:val="single" w:color="B6DFE8" w:sz="4"/>
+              <w:top w:val="single" w:color="A6A6A6" w:sz="4"/>
+              <w:left w:val="single" w:color="A6A6A6" w:sz="4"/>
+              <w:bottom w:val="single" w:color="A6A6A6" w:sz="4"/>
+              <w:right w:val="single" w:color="A6A6A6" w:sz="4"/>
             </w:tcBorders>
             <w:tcMar>
               <w:top w:type="dxa" w:w="60"/>
@@ -5297,10 +6030,10 @@
           <w:tcPr>
             <w:tcW w:type="dxa" w:w="1460"/>
             <w:tcBorders>
-              <w:top w:val="single" w:color="B6DFE8" w:sz="4"/>
-              <w:left w:val="single" w:color="B6DFE8" w:sz="4"/>
-              <w:bottom w:val="single" w:color="B6DFE8" w:sz="4"/>
-              <w:right w:val="single" w:color="B6DFE8" w:sz="4"/>
+              <w:top w:val="single" w:color="A6A6A6" w:sz="4"/>
+              <w:left w:val="single" w:color="A6A6A6" w:sz="4"/>
+              <w:bottom w:val="single" w:color="A6A6A6" w:sz="4"/>
+              <w:right w:val="single" w:color="A6A6A6" w:sz="4"/>
             </w:tcBorders>
             <w:tcMar>
               <w:top w:type="dxa" w:w="60"/>
@@ -5325,10 +6058,10 @@
           <w:tcPr>
             <w:tcW w:type="dxa" w:w="1500"/>
             <w:tcBorders>
-              <w:top w:val="single" w:color="B6DFE8" w:sz="4"/>
-              <w:left w:val="single" w:color="B6DFE8" w:sz="4"/>
-              <w:bottom w:val="single" w:color="B6DFE8" w:sz="4"/>
-              <w:right w:val="single" w:color="B6DFE8" w:sz="4"/>
+              <w:top w:val="single" w:color="A6A6A6" w:sz="4"/>
+              <w:left w:val="single" w:color="A6A6A6" w:sz="4"/>
+              <w:bottom w:val="single" w:color="A6A6A6" w:sz="4"/>
+              <w:right w:val="single" w:color="A6A6A6" w:sz="4"/>
             </w:tcBorders>
             <w:tcMar>
               <w:top w:type="dxa" w:w="60"/>
@@ -5353,10 +6086,10 @@
           <w:tcPr>
             <w:tcW w:type="dxa" w:w="1600"/>
             <w:tcBorders>
-              <w:top w:val="single" w:color="B6DFE8" w:sz="4"/>
-              <w:left w:val="single" w:color="B6DFE8" w:sz="4"/>
-              <w:bottom w:val="single" w:color="B6DFE8" w:sz="4"/>
-              <w:right w:val="single" w:color="B6DFE8" w:sz="4"/>
+              <w:top w:val="single" w:color="A6A6A6" w:sz="4"/>
+              <w:left w:val="single" w:color="A6A6A6" w:sz="4"/>
+              <w:bottom w:val="single" w:color="A6A6A6" w:sz="4"/>
+              <w:right w:val="single" w:color="A6A6A6" w:sz="4"/>
             </w:tcBorders>
             <w:tcMar>
               <w:top w:type="dxa" w:w="60"/>
@@ -5383,10 +6116,10 @@
           <w:tcPr>
             <w:tcW w:type="dxa" w:w="3500"/>
             <w:tcBorders>
-              <w:top w:val="single" w:color="B6DFE8" w:sz="4"/>
-              <w:left w:val="single" w:color="B6DFE8" w:sz="4"/>
-              <w:bottom w:val="single" w:color="B6DFE8" w:sz="4"/>
-              <w:right w:val="single" w:color="B6DFE8" w:sz="4"/>
+              <w:top w:val="single" w:color="A6A6A6" w:sz="4"/>
+              <w:left w:val="single" w:color="A6A6A6" w:sz="4"/>
+              <w:bottom w:val="single" w:color="A6A6A6" w:sz="4"/>
+              <w:right w:val="single" w:color="A6A6A6" w:sz="4"/>
             </w:tcBorders>
             <w:tcMar>
               <w:top w:type="dxa" w:w="60"/>
@@ -5411,10 +6144,10 @@
           <w:tcPr>
             <w:tcW w:type="dxa" w:w="1300"/>
             <w:tcBorders>
-              <w:top w:val="single" w:color="B6DFE8" w:sz="4"/>
-              <w:left w:val="single" w:color="B6DFE8" w:sz="4"/>
-              <w:bottom w:val="single" w:color="B6DFE8" w:sz="4"/>
-              <w:right w:val="single" w:color="B6DFE8" w:sz="4"/>
+              <w:top w:val="single" w:color="A6A6A6" w:sz="4"/>
+              <w:left w:val="single" w:color="A6A6A6" w:sz="4"/>
+              <w:bottom w:val="single" w:color="A6A6A6" w:sz="4"/>
+              <w:right w:val="single" w:color="A6A6A6" w:sz="4"/>
             </w:tcBorders>
             <w:tcMar>
               <w:top w:type="dxa" w:w="60"/>
@@ -5439,10 +6172,10 @@
           <w:tcPr>
             <w:tcW w:type="dxa" w:w="1460"/>
             <w:tcBorders>
-              <w:top w:val="single" w:color="B6DFE8" w:sz="4"/>
-              <w:left w:val="single" w:color="B6DFE8" w:sz="4"/>
-              <w:bottom w:val="single" w:color="B6DFE8" w:sz="4"/>
-              <w:right w:val="single" w:color="B6DFE8" w:sz="4"/>
+              <w:top w:val="single" w:color="A6A6A6" w:sz="4"/>
+              <w:left w:val="single" w:color="A6A6A6" w:sz="4"/>
+              <w:bottom w:val="single" w:color="A6A6A6" w:sz="4"/>
+              <w:right w:val="single" w:color="A6A6A6" w:sz="4"/>
             </w:tcBorders>
             <w:tcMar>
               <w:top w:type="dxa" w:w="60"/>
@@ -5467,10 +6200,10 @@
           <w:tcPr>
             <w:tcW w:type="dxa" w:w="1500"/>
             <w:tcBorders>
-              <w:top w:val="single" w:color="B6DFE8" w:sz="4"/>
-              <w:left w:val="single" w:color="B6DFE8" w:sz="4"/>
-              <w:bottom w:val="single" w:color="B6DFE8" w:sz="4"/>
-              <w:right w:val="single" w:color="B6DFE8" w:sz="4"/>
+              <w:top w:val="single" w:color="A6A6A6" w:sz="4"/>
+              <w:left w:val="single" w:color="A6A6A6" w:sz="4"/>
+              <w:bottom w:val="single" w:color="A6A6A6" w:sz="4"/>
+              <w:right w:val="single" w:color="A6A6A6" w:sz="4"/>
             </w:tcBorders>
             <w:tcMar>
               <w:top w:type="dxa" w:w="60"/>
@@ -5495,10 +6228,10 @@
           <w:tcPr>
             <w:tcW w:type="dxa" w:w="1600"/>
             <w:tcBorders>
-              <w:top w:val="single" w:color="B6DFE8" w:sz="4"/>
-              <w:left w:val="single" w:color="B6DFE8" w:sz="4"/>
-              <w:bottom w:val="single" w:color="B6DFE8" w:sz="4"/>
-              <w:right w:val="single" w:color="B6DFE8" w:sz="4"/>
+              <w:top w:val="single" w:color="A6A6A6" w:sz="4"/>
+              <w:left w:val="single" w:color="A6A6A6" w:sz="4"/>
+              <w:bottom w:val="single" w:color="A6A6A6" w:sz="4"/>
+              <w:right w:val="single" w:color="A6A6A6" w:sz="4"/>
             </w:tcBorders>
             <w:tcMar>
               <w:top w:type="dxa" w:w="60"/>
@@ -5525,10 +6258,10 @@
           <w:tcPr>
             <w:tcW w:type="dxa" w:w="3500"/>
             <w:tcBorders>
-              <w:top w:val="single" w:color="B6DFE8" w:sz="4"/>
-              <w:left w:val="single" w:color="B6DFE8" w:sz="4"/>
-              <w:bottom w:val="single" w:color="B6DFE8" w:sz="4"/>
-              <w:right w:val="single" w:color="B6DFE8" w:sz="4"/>
+              <w:top w:val="single" w:color="A6A6A6" w:sz="4"/>
+              <w:left w:val="single" w:color="A6A6A6" w:sz="4"/>
+              <w:bottom w:val="single" w:color="A6A6A6" w:sz="4"/>
+              <w:right w:val="single" w:color="A6A6A6" w:sz="4"/>
             </w:tcBorders>
             <w:tcMar>
               <w:top w:type="dxa" w:w="60"/>
@@ -5553,10 +6286,10 @@
           <w:tcPr>
             <w:tcW w:type="dxa" w:w="1300"/>
             <w:tcBorders>
-              <w:top w:val="single" w:color="B6DFE8" w:sz="4"/>
-              <w:left w:val="single" w:color="B6DFE8" w:sz="4"/>
-              <w:bottom w:val="single" w:color="B6DFE8" w:sz="4"/>
-              <w:right w:val="single" w:color="B6DFE8" w:sz="4"/>
+              <w:top w:val="single" w:color="A6A6A6" w:sz="4"/>
+              <w:left w:val="single" w:color="A6A6A6" w:sz="4"/>
+              <w:bottom w:val="single" w:color="A6A6A6" w:sz="4"/>
+              <w:right w:val="single" w:color="A6A6A6" w:sz="4"/>
             </w:tcBorders>
             <w:tcMar>
               <w:top w:type="dxa" w:w="60"/>
@@ -5581,10 +6314,10 @@
           <w:tcPr>
             <w:tcW w:type="dxa" w:w="1460"/>
             <w:tcBorders>
-              <w:top w:val="single" w:color="B6DFE8" w:sz="4"/>
-              <w:left w:val="single" w:color="B6DFE8" w:sz="4"/>
-              <w:bottom w:val="single" w:color="B6DFE8" w:sz="4"/>
-              <w:right w:val="single" w:color="B6DFE8" w:sz="4"/>
+              <w:top w:val="single" w:color="A6A6A6" w:sz="4"/>
+              <w:left w:val="single" w:color="A6A6A6" w:sz="4"/>
+              <w:bottom w:val="single" w:color="A6A6A6" w:sz="4"/>
+              <w:right w:val="single" w:color="A6A6A6" w:sz="4"/>
             </w:tcBorders>
             <w:tcMar>
               <w:top w:type="dxa" w:w="60"/>
@@ -5609,10 +6342,10 @@
           <w:tcPr>
             <w:tcW w:type="dxa" w:w="1500"/>
             <w:tcBorders>
-              <w:top w:val="single" w:color="B6DFE8" w:sz="4"/>
-              <w:left w:val="single" w:color="B6DFE8" w:sz="4"/>
-              <w:bottom w:val="single" w:color="B6DFE8" w:sz="4"/>
-              <w:right w:val="single" w:color="B6DFE8" w:sz="4"/>
+              <w:top w:val="single" w:color="A6A6A6" w:sz="4"/>
+              <w:left w:val="single" w:color="A6A6A6" w:sz="4"/>
+              <w:bottom w:val="single" w:color="A6A6A6" w:sz="4"/>
+              <w:right w:val="single" w:color="A6A6A6" w:sz="4"/>
             </w:tcBorders>
             <w:tcMar>
               <w:top w:type="dxa" w:w="60"/>
@@ -5637,10 +6370,10 @@
           <w:tcPr>
             <w:tcW w:type="dxa" w:w="1600"/>
             <w:tcBorders>
-              <w:top w:val="single" w:color="B6DFE8" w:sz="4"/>
-              <w:left w:val="single" w:color="B6DFE8" w:sz="4"/>
-              <w:bottom w:val="single" w:color="B6DFE8" w:sz="4"/>
-              <w:right w:val="single" w:color="B6DFE8" w:sz="4"/>
+              <w:top w:val="single" w:color="A6A6A6" w:sz="4"/>
+              <w:left w:val="single" w:color="A6A6A6" w:sz="4"/>
+              <w:bottom w:val="single" w:color="A6A6A6" w:sz="4"/>
+              <w:right w:val="single" w:color="A6A6A6" w:sz="4"/>
             </w:tcBorders>
             <w:tcMar>
               <w:top w:type="dxa" w:w="60"/>
@@ -5667,10 +6400,10 @@
           <w:tcPr>
             <w:tcW w:type="dxa" w:w="3500"/>
             <w:tcBorders>
-              <w:top w:val="single" w:color="B6DFE8" w:sz="4"/>
-              <w:left w:val="single" w:color="B6DFE8" w:sz="4"/>
-              <w:bottom w:val="single" w:color="B6DFE8" w:sz="4"/>
-              <w:right w:val="single" w:color="B6DFE8" w:sz="4"/>
+              <w:top w:val="single" w:color="A6A6A6" w:sz="4"/>
+              <w:left w:val="single" w:color="A6A6A6" w:sz="4"/>
+              <w:bottom w:val="single" w:color="A6A6A6" w:sz="4"/>
+              <w:right w:val="single" w:color="A6A6A6" w:sz="4"/>
             </w:tcBorders>
             <w:tcMar>
               <w:top w:type="dxa" w:w="60"/>
@@ -5695,10 +6428,10 @@
           <w:tcPr>
             <w:tcW w:type="dxa" w:w="1300"/>
             <w:tcBorders>
-              <w:top w:val="single" w:color="B6DFE8" w:sz="4"/>
-              <w:left w:val="single" w:color="B6DFE8" w:sz="4"/>
-              <w:bottom w:val="single" w:color="B6DFE8" w:sz="4"/>
-              <w:right w:val="single" w:color="B6DFE8" w:sz="4"/>
+              <w:top w:val="single" w:color="A6A6A6" w:sz="4"/>
+              <w:left w:val="single" w:color="A6A6A6" w:sz="4"/>
+              <w:bottom w:val="single" w:color="A6A6A6" w:sz="4"/>
+              <w:right w:val="single" w:color="A6A6A6" w:sz="4"/>
             </w:tcBorders>
             <w:tcMar>
               <w:top w:type="dxa" w:w="60"/>
@@ -5723,10 +6456,10 @@
           <w:tcPr>
             <w:tcW w:type="dxa" w:w="1460"/>
             <w:tcBorders>
-              <w:top w:val="single" w:color="B6DFE8" w:sz="4"/>
-              <w:left w:val="single" w:color="B6DFE8" w:sz="4"/>
-              <w:bottom w:val="single" w:color="B6DFE8" w:sz="4"/>
-              <w:right w:val="single" w:color="B6DFE8" w:sz="4"/>
+              <w:top w:val="single" w:color="A6A6A6" w:sz="4"/>
+              <w:left w:val="single" w:color="A6A6A6" w:sz="4"/>
+              <w:bottom w:val="single" w:color="A6A6A6" w:sz="4"/>
+              <w:right w:val="single" w:color="A6A6A6" w:sz="4"/>
             </w:tcBorders>
             <w:tcMar>
               <w:top w:type="dxa" w:w="60"/>
@@ -5751,10 +6484,10 @@
           <w:tcPr>
             <w:tcW w:type="dxa" w:w="1500"/>
             <w:tcBorders>
-              <w:top w:val="single" w:color="B6DFE8" w:sz="4"/>
-              <w:left w:val="single" w:color="B6DFE8" w:sz="4"/>
-              <w:bottom w:val="single" w:color="B6DFE8" w:sz="4"/>
-              <w:right w:val="single" w:color="B6DFE8" w:sz="4"/>
+              <w:top w:val="single" w:color="A6A6A6" w:sz="4"/>
+              <w:left w:val="single" w:color="A6A6A6" w:sz="4"/>
+              <w:bottom w:val="single" w:color="A6A6A6" w:sz="4"/>
+              <w:right w:val="single" w:color="A6A6A6" w:sz="4"/>
             </w:tcBorders>
             <w:tcMar>
               <w:top w:type="dxa" w:w="60"/>
@@ -5779,10 +6512,10 @@
           <w:tcPr>
             <w:tcW w:type="dxa" w:w="1600"/>
             <w:tcBorders>
-              <w:top w:val="single" w:color="B6DFE8" w:sz="4"/>
-              <w:left w:val="single" w:color="B6DFE8" w:sz="4"/>
-              <w:bottom w:val="single" w:color="B6DFE8" w:sz="4"/>
-              <w:right w:val="single" w:color="B6DFE8" w:sz="4"/>
+              <w:top w:val="single" w:color="A6A6A6" w:sz="4"/>
+              <w:left w:val="single" w:color="A6A6A6" w:sz="4"/>
+              <w:bottom w:val="single" w:color="A6A6A6" w:sz="4"/>
+              <w:right w:val="single" w:color="A6A6A6" w:sz="4"/>
             </w:tcBorders>
             <w:tcMar>
               <w:top w:type="dxa" w:w="60"/>
@@ -5809,10 +6542,10 @@
           <w:tcPr>
             <w:tcW w:type="dxa" w:w="3500"/>
             <w:tcBorders>
-              <w:top w:val="single" w:color="B6DFE8" w:sz="4"/>
-              <w:left w:val="single" w:color="B6DFE8" w:sz="4"/>
-              <w:bottom w:val="single" w:color="B6DFE8" w:sz="4"/>
-              <w:right w:val="single" w:color="B6DFE8" w:sz="4"/>
+              <w:top w:val="single" w:color="A6A6A6" w:sz="4"/>
+              <w:left w:val="single" w:color="A6A6A6" w:sz="4"/>
+              <w:bottom w:val="single" w:color="A6A6A6" w:sz="4"/>
+              <w:right w:val="single" w:color="A6A6A6" w:sz="4"/>
             </w:tcBorders>
             <w:tcMar>
               <w:top w:type="dxa" w:w="60"/>
@@ -5837,10 +6570,10 @@
           <w:tcPr>
             <w:tcW w:type="dxa" w:w="1300"/>
             <w:tcBorders>
-              <w:top w:val="single" w:color="B6DFE8" w:sz="4"/>
-              <w:left w:val="single" w:color="B6DFE8" w:sz="4"/>
-              <w:bottom w:val="single" w:color="B6DFE8" w:sz="4"/>
-              <w:right w:val="single" w:color="B6DFE8" w:sz="4"/>
+              <w:top w:val="single" w:color="A6A6A6" w:sz="4"/>
+              <w:left w:val="single" w:color="A6A6A6" w:sz="4"/>
+              <w:bottom w:val="single" w:color="A6A6A6" w:sz="4"/>
+              <w:right w:val="single" w:color="A6A6A6" w:sz="4"/>
             </w:tcBorders>
             <w:tcMar>
               <w:top w:type="dxa" w:w="60"/>
@@ -5865,10 +6598,10 @@
           <w:tcPr>
             <w:tcW w:type="dxa" w:w="1460"/>
             <w:tcBorders>
-              <w:top w:val="single" w:color="B6DFE8" w:sz="4"/>
-              <w:left w:val="single" w:color="B6DFE8" w:sz="4"/>
-              <w:bottom w:val="single" w:color="B6DFE8" w:sz="4"/>
-              <w:right w:val="single" w:color="B6DFE8" w:sz="4"/>
+              <w:top w:val="single" w:color="A6A6A6" w:sz="4"/>
+              <w:left w:val="single" w:color="A6A6A6" w:sz="4"/>
+              <w:bottom w:val="single" w:color="A6A6A6" w:sz="4"/>
+              <w:right w:val="single" w:color="A6A6A6" w:sz="4"/>
             </w:tcBorders>
             <w:tcMar>
               <w:top w:type="dxa" w:w="60"/>
@@ -5893,10 +6626,10 @@
           <w:tcPr>
             <w:tcW w:type="dxa" w:w="1500"/>
             <w:tcBorders>
-              <w:top w:val="single" w:color="B6DFE8" w:sz="4"/>
-              <w:left w:val="single" w:color="B6DFE8" w:sz="4"/>
-              <w:bottom w:val="single" w:color="B6DFE8" w:sz="4"/>
-              <w:right w:val="single" w:color="B6DFE8" w:sz="4"/>
+              <w:top w:val="single" w:color="A6A6A6" w:sz="4"/>
+              <w:left w:val="single" w:color="A6A6A6" w:sz="4"/>
+              <w:bottom w:val="single" w:color="A6A6A6" w:sz="4"/>
+              <w:right w:val="single" w:color="A6A6A6" w:sz="4"/>
             </w:tcBorders>
             <w:tcMar>
               <w:top w:type="dxa" w:w="60"/>
@@ -5921,10 +6654,10 @@
           <w:tcPr>
             <w:tcW w:type="dxa" w:w="1600"/>
             <w:tcBorders>
-              <w:top w:val="single" w:color="B6DFE8" w:sz="4"/>
-              <w:left w:val="single" w:color="B6DFE8" w:sz="4"/>
-              <w:bottom w:val="single" w:color="B6DFE8" w:sz="4"/>
-              <w:right w:val="single" w:color="B6DFE8" w:sz="4"/>
+              <w:top w:val="single" w:color="A6A6A6" w:sz="4"/>
+              <w:left w:val="single" w:color="A6A6A6" w:sz="4"/>
+              <w:bottom w:val="single" w:color="A6A6A6" w:sz="4"/>
+              <w:right w:val="single" w:color="A6A6A6" w:sz="4"/>
             </w:tcBorders>
             <w:tcMar>
               <w:top w:type="dxa" w:w="60"/>
@@ -5951,10 +6684,10 @@
           <w:tcPr>
             <w:tcW w:type="dxa" w:w="3500"/>
             <w:tcBorders>
-              <w:top w:val="single" w:color="B6DFE8" w:sz="4"/>
-              <w:left w:val="single" w:color="B6DFE8" w:sz="4"/>
-              <w:bottom w:val="single" w:color="B6DFE8" w:sz="4"/>
-              <w:right w:val="single" w:color="B6DFE8" w:sz="4"/>
+              <w:top w:val="single" w:color="A6A6A6" w:sz="4"/>
+              <w:left w:val="single" w:color="A6A6A6" w:sz="4"/>
+              <w:bottom w:val="single" w:color="A6A6A6" w:sz="4"/>
+              <w:right w:val="single" w:color="A6A6A6" w:sz="4"/>
             </w:tcBorders>
             <w:tcMar>
               <w:top w:type="dxa" w:w="60"/>
@@ -5979,10 +6712,10 @@
           <w:tcPr>
             <w:tcW w:type="dxa" w:w="1300"/>
             <w:tcBorders>
-              <w:top w:val="single" w:color="B6DFE8" w:sz="4"/>
-              <w:left w:val="single" w:color="B6DFE8" w:sz="4"/>
-              <w:bottom w:val="single" w:color="B6DFE8" w:sz="4"/>
-              <w:right w:val="single" w:color="B6DFE8" w:sz="4"/>
+              <w:top w:val="single" w:color="A6A6A6" w:sz="4"/>
+              <w:left w:val="single" w:color="A6A6A6" w:sz="4"/>
+              <w:bottom w:val="single" w:color="A6A6A6" w:sz="4"/>
+              <w:right w:val="single" w:color="A6A6A6" w:sz="4"/>
             </w:tcBorders>
             <w:tcMar>
               <w:top w:type="dxa" w:w="60"/>
@@ -6007,10 +6740,10 @@
           <w:tcPr>
             <w:tcW w:type="dxa" w:w="1460"/>
             <w:tcBorders>
-              <w:top w:val="single" w:color="B6DFE8" w:sz="4"/>
-              <w:left w:val="single" w:color="B6DFE8" w:sz="4"/>
-              <w:bottom w:val="single" w:color="B6DFE8" w:sz="4"/>
-              <w:right w:val="single" w:color="B6DFE8" w:sz="4"/>
+              <w:top w:val="single" w:color="A6A6A6" w:sz="4"/>
+              <w:left w:val="single" w:color="A6A6A6" w:sz="4"/>
+              <w:bottom w:val="single" w:color="A6A6A6" w:sz="4"/>
+              <w:right w:val="single" w:color="A6A6A6" w:sz="4"/>
             </w:tcBorders>
             <w:tcMar>
               <w:top w:type="dxa" w:w="60"/>
@@ -6035,10 +6768,10 @@
           <w:tcPr>
             <w:tcW w:type="dxa" w:w="1500"/>
             <w:tcBorders>
-              <w:top w:val="single" w:color="B6DFE8" w:sz="4"/>
-              <w:left w:val="single" w:color="B6DFE8" w:sz="4"/>
-              <w:bottom w:val="single" w:color="B6DFE8" w:sz="4"/>
-              <w:right w:val="single" w:color="B6DFE8" w:sz="4"/>
+              <w:top w:val="single" w:color="A6A6A6" w:sz="4"/>
+              <w:left w:val="single" w:color="A6A6A6" w:sz="4"/>
+              <w:bottom w:val="single" w:color="A6A6A6" w:sz="4"/>
+              <w:right w:val="single" w:color="A6A6A6" w:sz="4"/>
             </w:tcBorders>
             <w:tcMar>
               <w:top w:type="dxa" w:w="60"/>
@@ -6063,10 +6796,10 @@
           <w:tcPr>
             <w:tcW w:type="dxa" w:w="1600"/>
             <w:tcBorders>
-              <w:top w:val="single" w:color="B6DFE8" w:sz="4"/>
-              <w:left w:val="single" w:color="B6DFE8" w:sz="4"/>
-              <w:bottom w:val="single" w:color="B6DFE8" w:sz="4"/>
-              <w:right w:val="single" w:color="B6DFE8" w:sz="4"/>
+              <w:top w:val="single" w:color="A6A6A6" w:sz="4"/>
+              <w:left w:val="single" w:color="A6A6A6" w:sz="4"/>
+              <w:bottom w:val="single" w:color="A6A6A6" w:sz="4"/>
+              <w:right w:val="single" w:color="A6A6A6" w:sz="4"/>
             </w:tcBorders>
             <w:tcMar>
               <w:top w:type="dxa" w:w="60"/>
@@ -6093,10 +6826,10 @@
           <w:tcPr>
             <w:tcW w:type="dxa" w:w="3500"/>
             <w:tcBorders>
-              <w:top w:val="single" w:color="B6DFE8" w:sz="4"/>
-              <w:left w:val="single" w:color="B6DFE8" w:sz="4"/>
-              <w:bottom w:val="single" w:color="B6DFE8" w:sz="4"/>
-              <w:right w:val="single" w:color="B6DFE8" w:sz="4"/>
+              <w:top w:val="single" w:color="A6A6A6" w:sz="4"/>
+              <w:left w:val="single" w:color="A6A6A6" w:sz="4"/>
+              <w:bottom w:val="single" w:color="A6A6A6" w:sz="4"/>
+              <w:right w:val="single" w:color="A6A6A6" w:sz="4"/>
             </w:tcBorders>
             <w:tcMar>
               <w:top w:type="dxa" w:w="60"/>
@@ -6121,10 +6854,10 @@
           <w:tcPr>
             <w:tcW w:type="dxa" w:w="1300"/>
             <w:tcBorders>
-              <w:top w:val="single" w:color="B6DFE8" w:sz="4"/>
-              <w:left w:val="single" w:color="B6DFE8" w:sz="4"/>
-              <w:bottom w:val="single" w:color="B6DFE8" w:sz="4"/>
-              <w:right w:val="single" w:color="B6DFE8" w:sz="4"/>
+              <w:top w:val="single" w:color="A6A6A6" w:sz="4"/>
+              <w:left w:val="single" w:color="A6A6A6" w:sz="4"/>
+              <w:bottom w:val="single" w:color="A6A6A6" w:sz="4"/>
+              <w:right w:val="single" w:color="A6A6A6" w:sz="4"/>
             </w:tcBorders>
             <w:tcMar>
               <w:top w:type="dxa" w:w="60"/>
@@ -6149,10 +6882,10 @@
           <w:tcPr>
             <w:tcW w:type="dxa" w:w="1460"/>
             <w:tcBorders>
-              <w:top w:val="single" w:color="B6DFE8" w:sz="4"/>
-              <w:left w:val="single" w:color="B6DFE8" w:sz="4"/>
-              <w:bottom w:val="single" w:color="B6DFE8" w:sz="4"/>
-              <w:right w:val="single" w:color="B6DFE8" w:sz="4"/>
+              <w:top w:val="single" w:color="A6A6A6" w:sz="4"/>
+              <w:left w:val="single" w:color="A6A6A6" w:sz="4"/>
+              <w:bottom w:val="single" w:color="A6A6A6" w:sz="4"/>
+              <w:right w:val="single" w:color="A6A6A6" w:sz="4"/>
             </w:tcBorders>
             <w:tcMar>
               <w:top w:type="dxa" w:w="60"/>
@@ -6177,10 +6910,10 @@
           <w:tcPr>
             <w:tcW w:type="dxa" w:w="1500"/>
             <w:tcBorders>
-              <w:top w:val="single" w:color="B6DFE8" w:sz="4"/>
-              <w:left w:val="single" w:color="B6DFE8" w:sz="4"/>
-              <w:bottom w:val="single" w:color="B6DFE8" w:sz="4"/>
-              <w:right w:val="single" w:color="B6DFE8" w:sz="4"/>
+              <w:top w:val="single" w:color="A6A6A6" w:sz="4"/>
+              <w:left w:val="single" w:color="A6A6A6" w:sz="4"/>
+              <w:bottom w:val="single" w:color="A6A6A6" w:sz="4"/>
+              <w:right w:val="single" w:color="A6A6A6" w:sz="4"/>
             </w:tcBorders>
             <w:tcMar>
               <w:top w:type="dxa" w:w="60"/>
@@ -6205,10 +6938,10 @@
           <w:tcPr>
             <w:tcW w:type="dxa" w:w="1600"/>
             <w:tcBorders>
-              <w:top w:val="single" w:color="B6DFE8" w:sz="4"/>
-              <w:left w:val="single" w:color="B6DFE8" w:sz="4"/>
-              <w:bottom w:val="single" w:color="B6DFE8" w:sz="4"/>
-              <w:right w:val="single" w:color="B6DFE8" w:sz="4"/>
+              <w:top w:val="single" w:color="A6A6A6" w:sz="4"/>
+              <w:left w:val="single" w:color="A6A6A6" w:sz="4"/>
+              <w:bottom w:val="single" w:color="A6A6A6" w:sz="4"/>
+              <w:right w:val="single" w:color="A6A6A6" w:sz="4"/>
             </w:tcBorders>
             <w:tcMar>
               <w:top w:type="dxa" w:w="60"/>
@@ -6321,7 +7054,7 @@
         <w:pStyle w:val="Heading1"/>
       </w:pPr>
       <w:r>
-        <w:t xml:space="preserve">11. Observación sobre la aceleración por caso</w:t>
+        <w:t xml:space="preserve">12. Observación sobre la aceleración por caso</w:t>
       </w:r>
     </w:p>
     <w:p>
@@ -6345,7 +7078,7 @@
         <w:pStyle w:val="Heading1"/>
       </w:pPr>
       <w:r>
-        <w:t xml:space="preserve">12. Pruebas pendientes</w:t>
+        <w:t xml:space="preserve">13. Pruebas pendientes</w:t>
       </w:r>
     </w:p>
     <w:p>
@@ -6380,12 +7113,12 @@
           <w:tcPr>
             <w:tcW w:type="dxa" w:w="3200"/>
             <w:tcBorders>
-              <w:top w:val="single" w:color="B6DFE8" w:sz="4"/>
-              <w:left w:val="single" w:color="B6DFE8" w:sz="4"/>
-              <w:bottom w:val="single" w:color="B6DFE8" w:sz="4"/>
-              <w:right w:val="single" w:color="B6DFE8" w:sz="4"/>
-            </w:tcBorders>
-            <w:shd w:fill="CFFAFE" w:val="clear"/>
+              <w:top w:val="single" w:color="A6A6A6" w:sz="4"/>
+              <w:left w:val="single" w:color="A6A6A6" w:sz="4"/>
+              <w:bottom w:val="single" w:color="A6A6A6" w:sz="4"/>
+              <w:right w:val="single" w:color="A6A6A6" w:sz="4"/>
+            </w:tcBorders>
+            <w:shd w:fill="E7E6E6" w:val="clear"/>
             <w:tcMar>
               <w:top w:type="dxa" w:w="60"/>
               <w:left w:type="dxa" w:w="100"/>
@@ -6398,7 +7131,7 @@
               <w:rPr>
                 <w:b/>
                 <w:bCs/>
-                <w:color w:val="0E7490"/>
+                <w:color w:val="000000"/>
                 <w:sz w:val="19"/>
                 <w:szCs w:val="19"/>
               </w:rPr>
@@ -6410,12 +7143,12 @@
           <w:tcPr>
             <w:tcW w:type="dxa" w:w="6160"/>
             <w:tcBorders>
-              <w:top w:val="single" w:color="B6DFE8" w:sz="4"/>
-              <w:left w:val="single" w:color="B6DFE8" w:sz="4"/>
-              <w:bottom w:val="single" w:color="B6DFE8" w:sz="4"/>
-              <w:right w:val="single" w:color="B6DFE8" w:sz="4"/>
-            </w:tcBorders>
-            <w:shd w:fill="CFFAFE" w:val="clear"/>
+              <w:top w:val="single" w:color="A6A6A6" w:sz="4"/>
+              <w:left w:val="single" w:color="A6A6A6" w:sz="4"/>
+              <w:bottom w:val="single" w:color="A6A6A6" w:sz="4"/>
+              <w:right w:val="single" w:color="A6A6A6" w:sz="4"/>
+            </w:tcBorders>
+            <w:shd w:fill="E7E6E6" w:val="clear"/>
             <w:tcMar>
               <w:top w:type="dxa" w:w="60"/>
               <w:left w:type="dxa" w:w="100"/>
@@ -6428,7 +7161,7 @@
               <w:rPr>
                 <w:b/>
                 <w:bCs/>
-                <w:color w:val="0E7490"/>
+                <w:color w:val="000000"/>
                 <w:sz w:val="19"/>
                 <w:szCs w:val="19"/>
               </w:rPr>
@@ -6442,10 +7175,10 @@
           <w:tcPr>
             <w:tcW w:type="dxa" w:w="3200"/>
             <w:tcBorders>
-              <w:top w:val="single" w:color="B6DFE8" w:sz="4"/>
-              <w:left w:val="single" w:color="B6DFE8" w:sz="4"/>
-              <w:bottom w:val="single" w:color="B6DFE8" w:sz="4"/>
-              <w:right w:val="single" w:color="B6DFE8" w:sz="4"/>
+              <w:top w:val="single" w:color="A6A6A6" w:sz="4"/>
+              <w:left w:val="single" w:color="A6A6A6" w:sz="4"/>
+              <w:bottom w:val="single" w:color="A6A6A6" w:sz="4"/>
+              <w:right w:val="single" w:color="A6A6A6" w:sz="4"/>
             </w:tcBorders>
             <w:tcMar>
               <w:top w:type="dxa" w:w="60"/>
@@ -6470,10 +7203,10 @@
           <w:tcPr>
             <w:tcW w:type="dxa" w:w="6160"/>
             <w:tcBorders>
-              <w:top w:val="single" w:color="B6DFE8" w:sz="4"/>
-              <w:left w:val="single" w:color="B6DFE8" w:sz="4"/>
-              <w:bottom w:val="single" w:color="B6DFE8" w:sz="4"/>
-              <w:right w:val="single" w:color="B6DFE8" w:sz="4"/>
+              <w:top w:val="single" w:color="A6A6A6" w:sz="4"/>
+              <w:left w:val="single" w:color="A6A6A6" w:sz="4"/>
+              <w:bottom w:val="single" w:color="A6A6A6" w:sz="4"/>
+              <w:right w:val="single" w:color="A6A6A6" w:sz="4"/>
             </w:tcBorders>
             <w:tcMar>
               <w:top w:type="dxa" w:w="60"/>
@@ -6500,10 +7233,10 @@
           <w:tcPr>
             <w:tcW w:type="dxa" w:w="3200"/>
             <w:tcBorders>
-              <w:top w:val="single" w:color="B6DFE8" w:sz="4"/>
-              <w:left w:val="single" w:color="B6DFE8" w:sz="4"/>
-              <w:bottom w:val="single" w:color="B6DFE8" w:sz="4"/>
-              <w:right w:val="single" w:color="B6DFE8" w:sz="4"/>
+              <w:top w:val="single" w:color="A6A6A6" w:sz="4"/>
+              <w:left w:val="single" w:color="A6A6A6" w:sz="4"/>
+              <w:bottom w:val="single" w:color="A6A6A6" w:sz="4"/>
+              <w:right w:val="single" w:color="A6A6A6" w:sz="4"/>
             </w:tcBorders>
             <w:tcMar>
               <w:top w:type="dxa" w:w="60"/>
@@ -6528,10 +7261,10 @@
           <w:tcPr>
             <w:tcW w:type="dxa" w:w="6160"/>
             <w:tcBorders>
-              <w:top w:val="single" w:color="B6DFE8" w:sz="4"/>
-              <w:left w:val="single" w:color="B6DFE8" w:sz="4"/>
-              <w:bottom w:val="single" w:color="B6DFE8" w:sz="4"/>
-              <w:right w:val="single" w:color="B6DFE8" w:sz="4"/>
+              <w:top w:val="single" w:color="A6A6A6" w:sz="4"/>
+              <w:left w:val="single" w:color="A6A6A6" w:sz="4"/>
+              <w:bottom w:val="single" w:color="A6A6A6" w:sz="4"/>
+              <w:right w:val="single" w:color="A6A6A6" w:sz="4"/>
             </w:tcBorders>
             <w:tcMar>
               <w:top w:type="dxa" w:w="60"/>
@@ -6558,27 +7291,27 @@
           <w:tcPr>
             <w:tcW w:type="dxa" w:w="3200"/>
             <w:tcBorders>
-              <w:top w:val="single" w:color="B6DFE8" w:sz="4"/>
-              <w:left w:val="single" w:color="B6DFE8" w:sz="4"/>
-              <w:bottom w:val="single" w:color="B6DFE8" w:sz="4"/>
-              <w:right w:val="single" w:color="B6DFE8" w:sz="4"/>
-            </w:tcBorders>
-            <w:tcMar>
-              <w:top w:type="dxa" w:w="60"/>
-              <w:left w:type="dxa" w:w="100"/>
-              <w:bottom w:type="dxa" w:w="60"/>
-              <w:right w:type="dxa" w:w="100"/>
-            </w:tcMar>
-          </w:tcPr>
-          <w:p>
-            <w:r>
-              <w:rPr>
-                <w:b w:val="false"/>
-                <w:bCs w:val="false"/>
-                <w:sz w:val="19"/>
-                <w:szCs w:val="19"/>
-              </w:rPr>
-              <w:t xml:space="preserve">Prioridades</w:t>
+              <w:top w:val="single" w:color="A6A6A6" w:sz="4"/>
+              <w:left w:val="single" w:color="A6A6A6" w:sz="4"/>
+              <w:bottom w:val="single" w:color="A6A6A6" w:sz="4"/>
+              <w:right w:val="single" w:color="A6A6A6" w:sz="4"/>
+            </w:tcBorders>
+            <w:tcMar>
+              <w:top w:type="dxa" w:w="60"/>
+              <w:left w:type="dxa" w:w="100"/>
+              <w:bottom w:type="dxa" w:w="60"/>
+              <w:right w:type="dxa" w:w="100"/>
+            </w:tcMar>
+          </w:tcPr>
+          <w:p>
+            <w:r>
+              <w:rPr>
+                <w:b w:val="false"/>
+                <w:bCs w:val="false"/>
+                <w:sz w:val="19"/>
+                <w:szCs w:val="19"/>
+              </w:rPr>
+              <w:t xml:space="preserve">Saturación controlada</w:t>
             </w:r>
           </w:p>
         </w:tc>
@@ -6586,27 +7319,27 @@
           <w:tcPr>
             <w:tcW w:type="dxa" w:w="6160"/>
             <w:tcBorders>
-              <w:top w:val="single" w:color="B6DFE8" w:sz="4"/>
-              <w:left w:val="single" w:color="B6DFE8" w:sz="4"/>
-              <w:bottom w:val="single" w:color="B6DFE8" w:sz="4"/>
-              <w:right w:val="single" w:color="B6DFE8" w:sz="4"/>
-            </w:tcBorders>
-            <w:tcMar>
-              <w:top w:type="dxa" w:w="60"/>
-              <w:left w:type="dxa" w:w="100"/>
-              <w:bottom w:type="dxa" w:w="60"/>
-              <w:right w:type="dxa" w:w="100"/>
-            </w:tcMar>
-          </w:tcPr>
-          <w:p>
-            <w:r>
-              <w:rPr>
-                <w:b w:val="false"/>
-                <w:bCs w:val="false"/>
-                <w:sz w:val="19"/>
-                <w:szCs w:val="19"/>
-              </w:rPr>
-              <w:t xml:space="preserve">Verificada en desarrollo (un caso de prioridad 10 se adelantó a 9 sub-tareas de prioridad 1); pendiente en distribuido</w:t>
+              <w:top w:val="single" w:color="A6A6A6" w:sz="4"/>
+              <w:left w:val="single" w:color="A6A6A6" w:sz="4"/>
+              <w:bottom w:val="single" w:color="A6A6A6" w:sz="4"/>
+              <w:right w:val="single" w:color="A6A6A6" w:sz="4"/>
+            </w:tcBorders>
+            <w:tcMar>
+              <w:top w:type="dxa" w:w="60"/>
+              <w:left w:type="dxa" w:w="100"/>
+              <w:bottom w:type="dxa" w:w="60"/>
+              <w:right w:type="dxa" w:w="100"/>
+            </w:tcMar>
+          </w:tcPr>
+          <w:p>
+            <w:r>
+              <w:rPr>
+                <w:b w:val="false"/>
+                <w:bCs w:val="false"/>
+                <w:sz w:val="19"/>
+                <w:szCs w:val="19"/>
+              </w:rPr>
+              <w:t xml:space="preserve">Observada en worker-2 (picos de CPU); pendiente una medición controlada</w:t>
             </w:r>
           </w:p>
         </w:tc>
@@ -6616,27 +7349,27 @@
           <w:tcPr>
             <w:tcW w:type="dxa" w:w="3200"/>
             <w:tcBorders>
-              <w:top w:val="single" w:color="B6DFE8" w:sz="4"/>
-              <w:left w:val="single" w:color="B6DFE8" w:sz="4"/>
-              <w:bottom w:val="single" w:color="B6DFE8" w:sz="4"/>
-              <w:right w:val="single" w:color="B6DFE8" w:sz="4"/>
-            </w:tcBorders>
-            <w:tcMar>
-              <w:top w:type="dxa" w:w="60"/>
-              <w:left w:type="dxa" w:w="100"/>
-              <w:bottom w:type="dxa" w:w="60"/>
-              <w:right w:type="dxa" w:w="100"/>
-            </w:tcMar>
-          </w:tcPr>
-          <w:p>
-            <w:r>
-              <w:rPr>
-                <w:b w:val="false"/>
-                <w:bCs w:val="false"/>
-                <w:sz w:val="19"/>
-                <w:szCs w:val="19"/>
-              </w:rPr>
-              <w:t xml:space="preserve">Saturación controlada</w:t>
+              <w:top w:val="single" w:color="A6A6A6" w:sz="4"/>
+              <w:left w:val="single" w:color="A6A6A6" w:sz="4"/>
+              <w:bottom w:val="single" w:color="A6A6A6" w:sz="4"/>
+              <w:right w:val="single" w:color="A6A6A6" w:sz="4"/>
+            </w:tcBorders>
+            <w:tcMar>
+              <w:top w:type="dxa" w:w="60"/>
+              <w:left w:type="dxa" w:w="100"/>
+              <w:bottom w:type="dxa" w:w="60"/>
+              <w:right w:type="dxa" w:w="100"/>
+            </w:tcMar>
+          </w:tcPr>
+          <w:p>
+            <w:r>
+              <w:rPr>
+                <w:b w:val="false"/>
+                <w:bCs w:val="false"/>
+                <w:sz w:val="19"/>
+                <w:szCs w:val="19"/>
+              </w:rPr>
+              <w:t xml:space="preserve">Pausa y reanudación de casos</w:t>
             </w:r>
           </w:p>
         </w:tc>
@@ -6644,27 +7377,27 @@
           <w:tcPr>
             <w:tcW w:type="dxa" w:w="6160"/>
             <w:tcBorders>
-              <w:top w:val="single" w:color="B6DFE8" w:sz="4"/>
-              <w:left w:val="single" w:color="B6DFE8" w:sz="4"/>
-              <w:bottom w:val="single" w:color="B6DFE8" w:sz="4"/>
-              <w:right w:val="single" w:color="B6DFE8" w:sz="4"/>
-            </w:tcBorders>
-            <w:tcMar>
-              <w:top w:type="dxa" w:w="60"/>
-              <w:left w:type="dxa" w:w="100"/>
-              <w:bottom w:type="dxa" w:w="60"/>
-              <w:right w:type="dxa" w:w="100"/>
-            </w:tcMar>
-          </w:tcPr>
-          <w:p>
-            <w:r>
-              <w:rPr>
-                <w:b w:val="false"/>
-                <w:bCs w:val="false"/>
-                <w:sz w:val="19"/>
-                <w:szCs w:val="19"/>
-              </w:rPr>
-              <w:t xml:space="preserve">Observada en worker-2 (picos de CPU); pendiente una medición controlada</w:t>
+              <w:top w:val="single" w:color="A6A6A6" w:sz="4"/>
+              <w:left w:val="single" w:color="A6A6A6" w:sz="4"/>
+              <w:bottom w:val="single" w:color="A6A6A6" w:sz="4"/>
+              <w:right w:val="single" w:color="A6A6A6" w:sz="4"/>
+            </w:tcBorders>
+            <w:tcMar>
+              <w:top w:type="dxa" w:w="60"/>
+              <w:left w:type="dxa" w:w="100"/>
+              <w:bottom w:type="dxa" w:w="60"/>
+              <w:right w:type="dxa" w:w="100"/>
+            </w:tcMar>
+          </w:tcPr>
+          <w:p>
+            <w:r>
+              <w:rPr>
+                <w:b w:val="false"/>
+                <w:bCs w:val="false"/>
+                <w:sz w:val="19"/>
+                <w:szCs w:val="19"/>
+              </w:rPr>
+              <w:t xml:space="preserve">Verificada en desarrollo; pendiente en distribuido</w:t>
             </w:r>
           </w:p>
         </w:tc>
@@ -6674,27 +7407,27 @@
           <w:tcPr>
             <w:tcW w:type="dxa" w:w="3200"/>
             <w:tcBorders>
-              <w:top w:val="single" w:color="B6DFE8" w:sz="4"/>
-              <w:left w:val="single" w:color="B6DFE8" w:sz="4"/>
-              <w:bottom w:val="single" w:color="B6DFE8" w:sz="4"/>
-              <w:right w:val="single" w:color="B6DFE8" w:sz="4"/>
-            </w:tcBorders>
-            <w:tcMar>
-              <w:top w:type="dxa" w:w="60"/>
-              <w:left w:type="dxa" w:w="100"/>
-              <w:bottom w:type="dxa" w:w="60"/>
-              <w:right w:type="dxa" w:w="100"/>
-            </w:tcMar>
-          </w:tcPr>
-          <w:p>
-            <w:r>
-              <w:rPr>
-                <w:b w:val="false"/>
-                <w:bCs w:val="false"/>
-                <w:sz w:val="19"/>
-                <w:szCs w:val="19"/>
-              </w:rPr>
-              <w:t xml:space="preserve">Pausa y reanudación de casos</w:t>
+              <w:top w:val="single" w:color="A6A6A6" w:sz="4"/>
+              <w:left w:val="single" w:color="A6A6A6" w:sz="4"/>
+              <w:bottom w:val="single" w:color="A6A6A6" w:sz="4"/>
+              <w:right w:val="single" w:color="A6A6A6" w:sz="4"/>
+            </w:tcBorders>
+            <w:tcMar>
+              <w:top w:type="dxa" w:w="60"/>
+              <w:left w:type="dxa" w:w="100"/>
+              <w:bottom w:type="dxa" w:w="60"/>
+              <w:right w:type="dxa" w:w="100"/>
+            </w:tcMar>
+          </w:tcPr>
+          <w:p>
+            <w:r>
+              <w:rPr>
+                <w:b w:val="false"/>
+                <w:bCs w:val="false"/>
+                <w:sz w:val="19"/>
+                <w:szCs w:val="19"/>
+              </w:rPr>
+              <w:t xml:space="preserve">Generación automática de casos por metadatos</w:t>
             </w:r>
           </w:p>
         </w:tc>
@@ -6702,68 +7435,10 @@
           <w:tcPr>
             <w:tcW w:type="dxa" w:w="6160"/>
             <w:tcBorders>
-              <w:top w:val="single" w:color="B6DFE8" w:sz="4"/>
-              <w:left w:val="single" w:color="B6DFE8" w:sz="4"/>
-              <w:bottom w:val="single" w:color="B6DFE8" w:sz="4"/>
-              <w:right w:val="single" w:color="B6DFE8" w:sz="4"/>
-            </w:tcBorders>
-            <w:tcMar>
-              <w:top w:type="dxa" w:w="60"/>
-              <w:left w:type="dxa" w:w="100"/>
-              <w:bottom w:type="dxa" w:w="60"/>
-              <w:right w:type="dxa" w:w="100"/>
-            </w:tcMar>
-          </w:tcPr>
-          <w:p>
-            <w:r>
-              <w:rPr>
-                <w:b w:val="false"/>
-                <w:bCs w:val="false"/>
-                <w:sz w:val="19"/>
-                <w:szCs w:val="19"/>
-              </w:rPr>
-              <w:t xml:space="preserve">Verificada en desarrollo; pendiente en distribuido</w:t>
-            </w:r>
-          </w:p>
-        </w:tc>
-      </w:tr>
-      <w:tr>
-        <w:tc>
-          <w:tcPr>
-            <w:tcW w:type="dxa" w:w="3200"/>
-            <w:tcBorders>
-              <w:top w:val="single" w:color="B6DFE8" w:sz="4"/>
-              <w:left w:val="single" w:color="B6DFE8" w:sz="4"/>
-              <w:bottom w:val="single" w:color="B6DFE8" w:sz="4"/>
-              <w:right w:val="single" w:color="B6DFE8" w:sz="4"/>
-            </w:tcBorders>
-            <w:tcMar>
-              <w:top w:type="dxa" w:w="60"/>
-              <w:left w:type="dxa" w:w="100"/>
-              <w:bottom w:type="dxa" w:w="60"/>
-              <w:right w:type="dxa" w:w="100"/>
-            </w:tcMar>
-          </w:tcPr>
-          <w:p>
-            <w:r>
-              <w:rPr>
-                <w:b w:val="false"/>
-                <w:bCs w:val="false"/>
-                <w:sz w:val="19"/>
-                <w:szCs w:val="19"/>
-              </w:rPr>
-              <w:t xml:space="preserve">Generación automática de casos por metadatos</w:t>
-            </w:r>
-          </w:p>
-        </w:tc>
-        <w:tc>
-          <w:tcPr>
-            <w:tcW w:type="dxa" w:w="6160"/>
-            <w:tcBorders>
-              <w:top w:val="single" w:color="B6DFE8" w:sz="4"/>
-              <w:left w:val="single" w:color="B6DFE8" w:sz="4"/>
-              <w:bottom w:val="single" w:color="B6DFE8" w:sz="4"/>
-              <w:right w:val="single" w:color="B6DFE8" w:sz="4"/>
+              <w:top w:val="single" w:color="A6A6A6" w:sz="4"/>
+              <w:left w:val="single" w:color="A6A6A6" w:sz="4"/>
+              <w:bottom w:val="single" w:color="A6A6A6" w:sz="4"/>
+              <w:right w:val="single" w:color="A6A6A6" w:sz="4"/>
             </w:tcBorders>
             <w:tcMar>
               <w:top w:type="dxa" w:w="60"/>
@@ -6796,7 +7471,7 @@
         <w:pStyle w:val="Heading1"/>
       </w:pPr>
       <w:r>
-        <w:t xml:space="preserve">13. Conclusiones</w:t>
+        <w:t xml:space="preserve">14. Conclusiones</w:t>
       </w:r>
     </w:p>
     <w:p>
@@ -6873,10 +7548,10 @@
           <w:b/>
           <w:bCs/>
         </w:rPr>
-        <w:t xml:space="preserve">El sistema es tolerante a fallos: </w:t>
-      </w:r>
-      <w:r>
-        <w:t xml:space="preserve">las desconexiones de workers provocaron 3 redistribuciones, sin pérdida de sub-tareas, y los casos se cerraron correctamente gracias al barrier/join.</w:t>
+        <w:t xml:space="preserve">Las prioridades funcionan: </w:t>
+      </w:r>
+      <w:r>
+        <w:t xml:space="preserve">en la prueba controlada, ninguna sub-tarea de prioridad baja se adelantó al caso urgente, aunque había 29 esperando desde antes.</w:t>
       </w:r>
     </w:p>
     <w:p>
@@ -6893,10 +7568,10 @@
           <w:b/>
           <w:bCs/>
         </w:rPr>
-        <w:t xml:space="preserve">Con archivos de 400 a 700 MB, el cuello de botella es la red, </w:t>
-      </w:r>
-      <w:r>
-        <w:t xml:space="preserve">no la CPU: la transferencia de archivos domina el tiempo total, y un worker lejano (por VPN) o con procesador antiguo procesa menos.</w:t>
+        <w:t xml:space="preserve">El sistema es tolerante a fallos: </w:t>
+      </w:r>
+      <w:r>
+        <w:t xml:space="preserve">las desconexiones de workers provocaron 3 redistribuciones, sin pérdida de sub-tareas, y los casos se cerraron correctamente gracias al barrier/join.</w:t>
       </w:r>
     </w:p>
     <w:p>
@@ -6913,10 +7588,30 @@
           <w:b/>
           <w:bCs/>
         </w:rPr>
+        <w:t xml:space="preserve">Con archivos de 400 a 700 MB, el cuello de botella es la red, </w:t>
+      </w:r>
+      <w:r>
+        <w:t xml:space="preserve">no la CPU: la transferencia de archivos domina el tiempo total, y un worker lejano (por VPN) o con procesador antiguo procesa menos.</w:t>
+      </w:r>
+    </w:p>
+    <w:p>
+      <w:pPr>
+        <w:pStyle w:val="ListParagraph"/>
+        <w:numPr>
+          <w:ilvl w:val="0"/>
+          <w:numId w:val="2"/>
+        </w:numPr>
+        <w:spacing w:after="80" w:line="290"/>
+      </w:pPr>
+      <w:r>
+        <w:rPr>
+          <w:b/>
+          <w:bCs/>
+        </w:rPr>
         <w:t xml:space="preserve">Mejoras posibles: </w:t>
       </w:r>
       <w:r>
-        <w:t xml:space="preserve">medir la aceleración por caso solo sobre los intervalos activos, detectar sub-tareas que dejan de avanzar y reasignarlas antes del límite de 4 horas, y completar las pruebas pendientes de la sección 12.</w:t>
+        <w:t xml:space="preserve">medir la aceleración por caso solo sobre los intervalos activos, detectar sub-tareas que dejan de avanzar y reasignarlas antes del límite de 4 horas, y completar las pruebas pendientes de la sección 13.</w:t>
       </w:r>
     </w:p>
     <w:sectPr>
@@ -6975,7 +7670,7 @@
     </w:pPr>
     <w:r>
       <w:rPr>
-        <w:color w:val="4B8A99"/>
+        <w:color w:val="000000"/>
         <w:sz w:val="18"/>
         <w:szCs w:val="18"/>
       </w:rPr>
@@ -6983,7 +7678,7 @@
     </w:r>
     <w:r>
       <w:rPr>
-        <w:color w:val="4B8A99"/>
+        <w:color w:val="000000"/>
         <w:sz w:val="18"/>
         <w:szCs w:val="18"/>
       </w:rPr>
@@ -7324,7 +8019,7 @@
       <w:rFonts w:ascii="Arial" w:cs="Arial" w:eastAsia="Arial" w:hAnsi="Arial"/>
       <w:b/>
       <w:bCs/>
-      <w:color w:val="0E7490"/>
+      <w:color w:val="000000"/>
       <w:sz w:val="30"/>
       <w:szCs w:val="30"/>
     </w:rPr>
@@ -7342,7 +8037,7 @@
       <w:rFonts w:ascii="Arial" w:cs="Arial" w:eastAsia="Arial" w:hAnsi="Arial"/>
       <w:b/>
       <w:bCs/>
-      <w:color w:val="0E7490"/>
+      <w:color w:val="000000"/>
       <w:sz w:val="25"/>
       <w:szCs w:val="25"/>
     </w:rPr>

</xml_diff>